<commit_message>
feat: add contract appendix sample document to backend samples directory
</commit_message>
<xml_diff>
--- a/backend-app/samples/FILE MAU HOP DONG CÒN LẠI/4. BBNT VÀ QUYẾT TOÁN DỊCH VỤ - 0406 (DÙNG CHUNG CHO 2.1,2.2,3.1,3.2).docx
+++ b/backend-app/samples/FILE MAU HOP DONG CÒN LẠI/4. BBNT VÀ QUYẾT TOÁN DỊCH VỤ - 0406 (DÙNG CHUNG CHO 2.1,2.2,3.1,3.2).docx
@@ -1,6 +1,3019 @@
 
-<file path=word/document.xml><?xml version="1.0" encoding="UTF-8" standalone="yes"?>
-<w:document xmlns:wpc="http://schemas.microsoft.com/office/word/2010/wordprocessingCanvas" xmlns:mc="http://schemas.openxmlformats.org/markup-compatibility/2006" xmlns:o="urn:schemas-microsoft-com:office:office" xmlns:r="http://schemas.openxmlformats.org/officeDocument/2006/relationships" xmlns:m="http://schemas.openxmlformats.org/officeDocument/2006/math" xmlns:v="urn:schemas-microsoft-com:vml" xmlns:wp14="http://schemas.microsoft.com/office/word/2010/wordprocessingDrawing" xmlns:wp="http://schemas.openxmlformats.org/drawingml/2006/wordprocessingDrawing" xmlns:w="http://schemas.openxmlformats.org/wordprocessingml/2006/main" xmlns:w14="http://schemas.microsoft.com/office/word/2010/wordml" xmlns:w10="urn:schemas-microsoft-com:office:word" xmlns:w15="http://schemas.microsoft.com/office/word/2012/wordml" xmlns:wpg="http://schemas.microsoft.com/office/word/2010/wordprocessingGroup" xmlns:wpi="http://schemas.microsoft.com/office/word/2010/wordprocessingInk" xmlns:wne="http://schemas.microsoft.com/office/word/2006/wordml" xmlns:wps="http://schemas.microsoft.com/office/word/2010/wordprocessingShape" xmlns:wpsCustomData="http://www.wps.cn/officeDocument/2013/wpsCustomData" mc:Ignorable="w14 w15 wp14"><w:body><w:p><w:pPr><w:spacing w:before="120" w:after="120"/><w:jc w:val="center"/><w:rPr><w:b/></w:rPr></w:pPr><w:r><w:rPr><w:b/></w:rPr><w:t xml:space="preserve"> Cộng Hòa Xã Hội Chủ Nghĩa Việt Nam</w:t></w:r></w:p><w:p><w:pPr><w:spacing w:before="120" w:after="120"/><w:jc w:val="center"/><w:rPr><w:b/></w:rPr></w:pPr><w:r><w:rPr><w:b/></w:rPr><w:t>Độc Lập – Tự Do – Hạnh Phúc</w:t></w:r></w:p><w:p><w:pPr><w:spacing w:before="120" w:after="120"/><w:jc w:val="center"/><w:rPr><w:b/></w:rPr></w:pPr><w:r><w:rPr><w:b/></w:rPr><w:t>----------------</w:t></w:r></w:p><w:p><w:pPr><w:spacing w:before="120" w:after="120"/><w:jc w:val="center"/><w:rPr><w:b/><w:sz w:val="36"/><w:szCs w:val="36"/></w:rPr></w:pPr><w:r><w:rPr><w:b/><w:sz w:val="36"/><w:szCs w:val="36"/></w:rPr><w:t>BIÊN BẢN NGHIỆM THU VÀ QUYẾT TOÁN DỊCH VỤ</w:t></w:r></w:p><w:p><w:pPr><w:jc w:val="center"/></w:pPr><w:r><w:rPr><w:b/><w:bCs/><w:lang w:eastAsia="zh-CN"/></w:rPr><w:t>BBNT&amp;QTDV số: …</w:t></w:r><w:r><w:rPr><w:b/><w:bCs/></w:rPr><w:t>/CTY - HHKH/2026/NT-QT</w:t></w:r></w:p><w:p><w:pPr><w:spacing w:line="276" w:lineRule="auto"/><w:ind w:firstLine="10"/><w:jc w:val="center"/></w:pPr></w:p><w:p><w:pPr><w:spacing w:line="360" w:lineRule="auto"/><w:jc w:val="both"/><w:rPr><w:i/><w:iCs/><w:sz w:val="26"/><w:szCs w:val="26"/></w:rPr></w:pPr><w:r><w:rPr><w:i/><w:iCs/><w:sz w:val="26"/><w:szCs w:val="26"/></w:rPr><w:t>Căn cứ Hợp đồng số</w:t></w:r><w:r><w:rPr><w:b/><w:bCs/><w:i/><w:iCs/><w:sz w:val="26"/><w:szCs w:val="26"/></w:rPr><w:t xml:space="preserve"> ……</w:t></w:r><w:r><w:rPr><w:i/><w:iCs/><w:sz w:val="26"/><w:szCs w:val="26"/></w:rPr><w:t>, ký ngày …. giữa Bên A và Bên B về việc cung cấp địa điểm và các dịch vụ phục vụ chương trình….., được tổ chức vào ngày ….. ;</w:t></w:r></w:p><w:p><w:pPr><w:spacing w:line="360" w:lineRule="auto"/><w:rPr><w:i/><w:sz w:val="26"/><w:szCs w:val="26"/></w:rPr></w:pPr><w:r><w:rPr><w:i/><w:sz w:val="26"/><w:szCs w:val="26"/></w:rPr><w:t>Căn cứ kết quả thực tế việc cung cấp và sử dụng dịch vụ của các Bên.</w:t></w:r></w:p><w:p><w:pPr><w:autoSpaceDE w:val="0"/><w:autoSpaceDN w:val="0"/><w:adjustRightInd w:val="0"/><w:spacing w:line="360" w:lineRule="auto"/><w:jc w:val="both"/><w:rPr><w:bCs/><w:i/><w:iCs/><w:sz w:val="26"/><w:szCs w:val="26"/></w:rPr></w:pPr></w:p><w:p><w:pPr><w:autoSpaceDE w:val="0"/><w:autoSpaceDN w:val="0"/><w:adjustRightInd w:val="0"/><w:spacing w:line="360" w:lineRule="auto"/><w:jc w:val="both"/><w:rPr><w:i/><w:sz w:val="26"/><w:szCs w:val="26"/></w:rPr></w:pPr><w:r><w:rPr><w:bCs/><w:i/><w:iCs/><w:sz w:val="26"/><w:szCs w:val="26"/></w:rPr><w:t xml:space="preserve">Hôm nay, ngày </w:t></w:r><w:r><w:rPr><w:b/><w:i/><w:iCs/><w:sz w:val="26"/><w:szCs w:val="26"/></w:rPr><w:t>…</w:t></w:r><w:r><w:rPr><w:bCs/><w:i/><w:iCs/><w:sz w:val="26"/><w:szCs w:val="26"/></w:rPr><w:t xml:space="preserve"> Tháng </w:t></w:r><w:r><w:rPr><w:b/><w:i/><w:iCs/><w:sz w:val="26"/><w:szCs w:val="26"/></w:rPr><w:t>…</w:t></w:r><w:r><w:rPr><w:bCs/><w:i/><w:iCs/><w:sz w:val="26"/><w:szCs w:val="26"/></w:rPr><w:t xml:space="preserve"> năm </w:t></w:r><w:r><w:rPr><w:b/><w:i/><w:iCs/><w:sz w:val="26"/><w:szCs w:val="26"/></w:rPr><w:t>2026</w:t></w:r><w:r><w:rPr><w:bCs/><w:i/><w:iCs/><w:sz w:val="26"/><w:szCs w:val="26"/></w:rPr><w:t xml:space="preserve">, chúng tôi gồm: </w:t></w:r></w:p><w:p><w:pPr><w:shd w:val="clear" w:color="auto" w:fill="FFFFFF" w:themeFill="background1"/><w:spacing w:line="360" w:lineRule="auto"/><w:ind w:left="59" w:leftChars="0"/><w:rPr><w:rFonts w:hint="default" w:ascii="Times New Roman" w:hAnsi="Times New Roman"/><w:b/><w:sz w:val="26"/><w:szCs w:val="26"/><w:lang w:val="en-US"/></w:rPr></w:pPr><w:r><w:rPr><w:rFonts w:ascii="Times New Roman" w:hAnsi="Times New Roman"/><w:b/><w:sz w:val="26"/><w:szCs w:val="26"/></w:rPr><w:t xml:space="preserve">BÊN A: </w:t></w:r><w:r><w:rPr><w:rFonts w:ascii="Times New Roman" w:hAnsi="Times New Roman"/><w:b/><w:sz w:val="26"/><w:szCs w:val="26"/></w:rPr><w:tab/></w:r><w:r><w:rPr><w:rFonts w:ascii="Times New Roman" w:hAnsi="Times New Roman"/><w:b/><w:sz w:val="26"/><w:szCs w:val="26"/></w:rPr><w:tab/></w:r><w:r><w:rPr><w:rFonts w:hint="default" w:ascii="Times New Roman" w:hAnsi="Times New Roman"/><w:b/><w:sz w:val="26"/><w:szCs w:val="26"/><w:lang w:val="en-US"/></w:rPr><w:t>{BenATenCongTy}</w:t></w:r></w:p><w:p><w:pPr><w:shd w:val="clear" w:color="auto" w:fill="FFFFFF" w:themeFill="background1"/><w:spacing w:line="360" w:lineRule="auto"/><w:ind w:left="59" w:leftChars="0"/><w:rPr><w:rFonts w:hint="default" w:ascii="Times New Roman" w:hAnsi="Times New Roman"/><w:b/><w:sz w:val="26"/><w:szCs w:val="26"/><w:lang w:val="en-US"/></w:rPr></w:pPr><w:bookmarkStart w:id="0" w:name="_Hlk135660413"/><w:r><w:rPr><w:rFonts w:ascii="Times New Roman" w:hAnsi="Times New Roman"/><w:sz w:val="26"/><w:szCs w:val="26"/></w:rPr><w:t>Đại diện: <w:t>{BenADaiDien}</w:t></w:r></w:p><w:p><w:pPr><w:shd w:val="clear" w:color="auto" w:fill="FFFFFF" w:themeFill="background1"/><w:spacing w:line="360" w:lineRule="auto"/><w:ind w:left="59" w:leftChars="0"/><w:rPr><w:rFonts w:hint="default" w:ascii="Times New Roman" w:hAnsi="Times New Roman"/><w:sz w:val="26"/><w:szCs w:val="26"/><w:lang w:val="en-US"/></w:rPr></w:pPr><w:bookmarkStart w:id="1" w:name="_Hlk164419968"/><w:r><w:rPr><w:rFonts w:ascii="Times New Roman" w:hAnsi="Times New Roman"/><w:bCs/><w:sz w:val="26"/><w:szCs w:val="26"/></w:rPr><w:t>Chức vụ: <w:t>{BenAChucVuDaiDien}</w:t></w:r></w:p><w:bookmarkEnd w:id="0"/><w:bookmarkEnd w:id="1"/><w:p><w:pPr><w:shd w:val="clear" w:color="auto" w:fill="FFFFFF" w:themeFill="background1"/><w:spacing w:line="360" w:lineRule="auto"/><w:ind w:left="59" w:leftChars="0"/><w:rPr><w:rFonts w:hint="default" w:ascii="Times New Roman" w:hAnsi="Times New Roman"/><w:sz w:val="26"/><w:szCs w:val="26"/><w:lang w:val="en-US"/></w:rPr></w:pPr><w:r><w:rPr><w:rFonts w:ascii="Times New Roman" w:hAnsi="Times New Roman"/><w:sz w:val="26"/><w:szCs w:val="26"/></w:rPr><w:t>Địa chỉ: <w:t>{BenADiaChi}</w:t></w:r></w:p><w:p><w:pPr><w:shd w:val="clear" w:color="auto" w:fill="FFFFFF" w:themeFill="background1"/><w:spacing w:line="360" w:lineRule="auto"/><w:ind w:left="59" w:leftChars="0"/><w:rPr><w:rFonts w:hint="default" w:ascii="Times New Roman" w:hAnsi="Times New Roman"/><w:sz w:val="26"/><w:szCs w:val="26"/><w:lang w:val="en-US"/></w:rPr></w:pPr><w:r><w:rPr><w:rFonts w:ascii="Times New Roman" w:hAnsi="Times New Roman"/><w:sz w:val="26"/><w:szCs w:val="26"/></w:rPr><w:t>Điện thoại: <w:t>{BenASDT}</w:t></w:r></w:p><w:p><w:pPr><w:shd w:val="clear" w:color="auto" w:fill="FFFFFF" w:themeFill="background1"/><w:spacing w:line="360" w:lineRule="auto"/><w:ind w:left="59" w:leftChars="0"/><w:rPr><w:rFonts w:hint="default" w:ascii="Times New Roman" w:hAnsi="Times New Roman"/><w:sz w:val="26"/><w:szCs w:val="26"/><w:lang w:val="en-US"/></w:rPr></w:pPr><w:r><w:rPr><w:rFonts w:ascii="Times New Roman" w:hAnsi="Times New Roman"/><w:sz w:val="26"/><w:szCs w:val="26"/></w:rPr><w:t xml:space="preserve">MST </w:t></w:r><w:r><w:rPr><w:rFonts w:ascii="Times New Roman" w:hAnsi="Times New Roman"/><w:sz w:val="26"/><w:szCs w:val="26"/></w:rPr><w:tab/></w:r><w:r><w:rPr><w:rFonts w:ascii="Times New Roman" w:hAnsi="Times New Roman"/><w:sz w:val="26"/><w:szCs w:val="26"/></w:rPr><w:tab/></w:r><w:r><w:rPr><w:rFonts w:hint="default" w:ascii="Times New Roman" w:hAnsi="Times New Roman"/><w:sz w:val="26"/><w:szCs w:val="26"/><w:lang w:val="en-US"/></w:rPr><w:t>{BenAMST}</w:t></w:r></w:p><w:p><w:pPr><w:spacing w:before="120" w:after="120" w:line="360" w:lineRule="auto"/><w:jc w:val="both"/><w:rPr><w:bCs/><w:sz w:val="26"/><w:szCs w:val="26"/></w:rPr></w:pPr><w:r><w:rPr><w:sz w:val="26"/><w:szCs w:val="26"/></w:rPr><w:t>Số Tài Khoản</w:t></w:r><w:r><w:rPr><w:sz w:val="26"/><w:szCs w:val="26"/></w:rPr><w:tab/></w:r><w:bookmarkStart w:id="2" w:name="_Hlk205370871"/><w:r><w:rPr><w:sz w:val="26"/><w:szCs w:val="26"/><w:shd w:val="clear" w:color="auto" w:fill="FFFFFF"/></w:rPr><w:t xml:space="preserve">1114 0141 8888 </w:t></w:r><w:r><w:rPr><w:bCs/><w:sz w:val="26"/><w:szCs w:val="26"/><w:lang w:val="vi-VN"/></w:rPr><w:t>(VND)</w:t></w:r><w:bookmarkEnd w:id="2"/></w:p><w:p><w:pPr><w:pStyle w:val="21"/><w:spacing w:line="360" w:lineRule="auto"/><w:ind w:left="0"/><w:jc w:val="both"/><w:rPr><w:sz w:val="26"/><w:szCs w:val="26"/><w:shd w:val="clear" w:color="auto" w:fill="FFFFFF"/></w:rPr></w:pPr><w:r><w:rPr><w:bCs/><w:sz w:val="26"/><w:szCs w:val="26"/></w:rPr><w:t>Tại ngân Hàng</w:t></w:r><w:r><w:rPr><w:bCs/><w:sz w:val="26"/><w:szCs w:val="26"/></w:rPr><w:tab/></w:r><w:bookmarkStart w:id="3" w:name="_Hlk205370882"/><w:r><w:rPr><w:sz w:val="26"/><w:szCs w:val="26"/><w:shd w:val="clear" w:color="auto" w:fill="FFFFFF"/></w:rPr><w:t>Việt Nam Thịnh Vượng (VP Bank) – Chi nhánh Hồ Chí Minh</w:t></w:r><w:bookmarkEnd w:id="3"/></w:p><w:p><w:pPr><w:overflowPunct w:val="0"/><w:autoSpaceDE w:val="0"/><w:autoSpaceDN w:val="0"/><w:adjustRightInd w:val="0"/><w:spacing w:before="120" w:after="120" w:line="360" w:lineRule="auto"/><w:ind w:left="1530" w:hanging="1530"/><w:jc w:val="both"/><w:rPr><w:b/><w:caps/><w:sz w:val="26"/><w:szCs w:val="26"/></w:rPr></w:pPr><w:r><w:rPr><w:sz w:val="26"/><w:szCs w:val="26"/></w:rPr><w:t>Và</w:t></w:r></w:p><w:p><w:pPr><w:shd w:val="clear" w:color="auto" w:fill="FFFFFF" w:themeFill="background1"/><w:spacing w:line="360" w:lineRule="auto"/><w:ind w:left="59" w:leftChars="0"/><w:rPr><w:rFonts w:ascii="Times New Roman" w:hAnsi="Times New Roman"/><w:b/><w:sz w:val="26"/><w:szCs w:val="26"/></w:rPr></w:pPr><w:r><w:rPr><w:rFonts w:ascii="Times New Roman" w:hAnsi="Times New Roman"/><w:b/><w:sz w:val="26"/><w:szCs w:val="26"/></w:rPr><w:t xml:space="preserve">BÊN B: </w:t></w:r><w:r><w:rPr><w:rFonts w:ascii="Times New Roman" w:hAnsi="Times New Roman"/><w:b/><w:sz w:val="26"/><w:szCs w:val="26"/></w:rPr><w:tab/></w:r><w:r><w:rPr><w:rFonts w:hint="default" w:ascii="Times New Roman" w:hAnsi="Times New Roman"/><w:b/><w:sz w:val="26"/><w:szCs w:val="26"/><w:lang w:val="en-US"/></w:rPr><w:t xml:space="preserve"> </w:t></w:r><w:r><w:rPr><w:rFonts w:hint="default" w:ascii="Times New Roman" w:hAnsi="Times New Roman"/><w:b w:val="0"/><w:bCs/><w:sz w:val="26"/><w:szCs w:val="26"/></w:rPr><w:t>{BenBTenDaiDien}</w:t></w:r><w:r><w:rPr><w:rFonts w:ascii="Times New Roman" w:hAnsi="Times New Roman"/><w:b/><w:sz w:val="26"/><w:szCs w:val="26"/></w:rPr><w:tab/></w:r></w:p><w:p><w:pPr><w:shd w:val="clear" w:color="auto" w:fill="FFFFFF" w:themeFill="background1"/><w:spacing w:line="360" w:lineRule="auto"/><w:ind w:left="59" w:leftChars="0"/><w:rPr><w:rFonts w:hint="default" w:ascii="Times New Roman" w:hAnsi="Times New Roman"/><w:b/><w:sz w:val="26"/><w:szCs w:val="26"/><w:lang w:val="en-US"/></w:rPr></w:pPr><w:r><w:rPr><w:rFonts w:ascii="Times New Roman" w:hAnsi="Times New Roman"/><w:sz w:val="26"/><w:szCs w:val="26"/></w:rPr><w:t>Đại Diện</w:t></w:r><w:r><w:rPr><w:rFonts w:ascii="Times New Roman" w:hAnsi="Times New Roman"/><w:b/><w:sz w:val="26"/><w:szCs w:val="26"/></w:rPr><w:tab/></w:r><w:r><w:rPr><w:rFonts w:hint="default" w:ascii="Times New Roman" w:hAnsi="Times New Roman"/><w:b/><w:sz w:val="26"/><w:szCs w:val="26"/><w:lang w:val="en-US"/></w:rPr><w:t xml:space="preserve"> </w:t></w:r><w:r><w:rPr><w:rFonts w:ascii="Times New Roman" w:hAnsi="Times New Roman"/><w:b w:val="0"/><w:bCs/><w:sz w:val="26"/><w:szCs w:val="26"/></w:rPr><w:t>Ông</w:t></w:r><w:r><w:rPr><w:rFonts w:hint="default" w:ascii="Times New Roman" w:hAnsi="Times New Roman"/><w:b w:val="0"/><w:bCs/><w:sz w:val="26"/><w:szCs w:val="26"/><w:lang w:val="en-US"/></w:rPr><w:t>/Bà {BenBTenDaiDien}</w:t></w:r></w:p><w:p><w:pPr><w:shd w:val="clear" w:color="auto" w:fill="FFFFFF" w:themeFill="background1"/><w:spacing w:line="360" w:lineRule="auto"/><w:ind w:left="59" w:leftChars="0"/><w:rPr><w:rFonts w:ascii="Times New Roman" w:hAnsi="Times New Roman"/><w:sz w:val="26"/><w:szCs w:val="26"/></w:rPr></w:pPr><w:r><w:rPr><w:rFonts w:ascii="Times New Roman" w:hAnsi="Times New Roman"/><w:bCs/><w:sz w:val="26"/><w:szCs w:val="26"/></w:rPr><w:t>Chức Vụ</w:t></w:r><w:r><w:rPr><w:rFonts w:ascii="Times New Roman" w:hAnsi="Times New Roman"/><w:sz w:val="26"/><w:szCs w:val="26"/></w:rPr><w:tab/></w:r><w:r><w:rPr><w:rFonts w:hint="default" w:ascii="Times New Roman" w:hAnsi="Times New Roman"/><w:sz w:val="26"/><w:szCs w:val="26"/><w:lang w:val="en-US"/></w:rPr><w:t xml:space="preserve"> </w:t></w:r><w:r><w:rPr><w:rFonts w:hint="default" w:ascii="Times New Roman" w:hAnsi="Times New Roman"/><w:sz w:val="26"/><w:szCs w:val="26"/></w:rPr><w:t>{BenBChucVu}</w:t></w:r><w:r><w:rPr><w:rFonts w:ascii="Times New Roman" w:hAnsi="Times New Roman"/><w:sz w:val="26"/><w:szCs w:val="26"/></w:rPr><w:tab/></w:r></w:p><w:p><w:pPr><w:shd w:val="clear" w:color="auto" w:fill="FFFFFF" w:themeFill="background1"/><w:spacing w:line="360" w:lineRule="auto"/><w:ind w:left="59" w:leftChars="0"/><w:rPr><w:rFonts w:ascii="Times New Roman" w:hAnsi="Times New Roman"/><w:sz w:val="26"/><w:szCs w:val="26"/></w:rPr></w:pPr><w:r><w:rPr><w:rFonts w:ascii="Times New Roman" w:hAnsi="Times New Roman"/><w:sz w:val="26"/><w:szCs w:val="26"/></w:rPr><w:t>Địa Chỉ</w:t></w:r><w:r><w:rPr><w:rFonts w:ascii="Times New Roman" w:hAnsi="Times New Roman"/><w:sz w:val="26"/><w:szCs w:val="26"/></w:rPr><w:tab/></w:r><w:r><w:rPr><w:rFonts w:hint="default" w:ascii="Times New Roman" w:hAnsi="Times New Roman"/><w:sz w:val="26"/><w:szCs w:val="26"/><w:lang w:val="en-US"/></w:rPr><w:t xml:space="preserve"> </w:t></w:r><w:r><w:rPr><w:rFonts w:hint="default" w:ascii="Times New Roman" w:hAnsi="Times New Roman"/><w:sz w:val="26"/><w:szCs w:val="26"/></w:rPr><w:t>{BenBDiaChi}</w:t></w:r><w:r><w:rPr><w:rFonts w:ascii="Times New Roman" w:hAnsi="Times New Roman"/><w:sz w:val="26"/><w:szCs w:val="26"/></w:rPr><w:tab/></w:r></w:p><w:p><w:pPr><w:shd w:val="clear" w:color="auto" w:fill="FFFFFF" w:themeFill="background1"/><w:spacing w:line="360" w:lineRule="auto"/><w:ind w:left="59" w:leftChars="0"/><w:rPr><w:rFonts w:ascii="Times New Roman" w:hAnsi="Times New Roman"/><w:sz w:val="26"/><w:szCs w:val="26"/></w:rPr></w:pPr><w:r><w:rPr><w:rFonts w:ascii="Times New Roman" w:hAnsi="Times New Roman"/><w:sz w:val="26"/><w:szCs w:val="26"/></w:rPr><w:t>Điện thoại</w:t></w:r><w:r><w:rPr><w:rFonts w:ascii="Times New Roman" w:hAnsi="Times New Roman"/><w:sz w:val="26"/><w:szCs w:val="26"/></w:rPr><w:tab/></w:r><w:r><w:rPr><w:rFonts w:hint="default" w:ascii="Times New Roman" w:hAnsi="Times New Roman"/><w:sz w:val="26"/><w:szCs w:val="26"/><w:lang w:val="en-US"/></w:rPr><w:t xml:space="preserve"> {BenBDienThoai}</w:t></w:r><w:r><w:rPr><w:rFonts w:ascii="Times New Roman" w:hAnsi="Times New Roman"/><w:sz w:val="26"/><w:szCs w:val="26"/></w:rPr><w:tab/></w:r></w:p><w:p><w:pPr><w:shd w:val="clear" w:color="auto" w:fill="FFFFFF" w:themeFill="background1"/><w:spacing w:line="360" w:lineRule="auto"/><w:ind w:left="59" w:leftChars="0"/><w:rPr><w:rFonts w:hint="default" w:ascii="Times New Roman" w:hAnsi="Times New Roman"/><w:sz w:val="26"/><w:szCs w:val="26"/><w:lang w:val="en-US"/></w:rPr></w:pPr><w:r><w:rPr><w:rFonts w:ascii="Times New Roman" w:hAnsi="Times New Roman"/><w:sz w:val="26"/><w:szCs w:val="26"/></w:rPr><w:t xml:space="preserve">MST </w:t></w:r><w:r><w:rPr><w:rFonts w:hint="default" w:ascii="Times New Roman" w:hAnsi="Times New Roman"/><w:sz w:val="26"/><w:szCs w:val="26"/><w:lang w:val="en-US"/></w:rPr><w:t xml:space="preserve">         {BenBCCCD}</w:t></w:r></w:p><w:p><w:pPr><w:spacing w:line="360" w:lineRule="auto"/><w:ind w:firstLine="360"/><w:jc w:val="both"/><w:rPr><w:b/><w:sz w:val="26"/><w:szCs w:val="26"/></w:rPr></w:pPr><w:r><w:rPr><w:sz w:val="26"/><w:szCs w:val="26"/></w:rPr><w:t>Sau khi cùng kiểm tra, đối chiếu và đánh giá kết quả thực hiện dịch vụ theo Hợp đồng nêu trên, hai Bên thống nhất xác nhận việc nghiệm thu và quyết toán dịch vụ với các nội dung sau:</w:t></w:r></w:p><w:p><w:pPr><w:pStyle w:val="21"/><w:numPr><w:ilvl w:val="0"/><w:numId w:val="1"/></w:numPr><w:tabs><w:tab w:val="left" w:pos="180"/><w:tab w:val="left" w:pos="630"/></w:tabs><w:spacing w:before="120" w:after="120" w:line="360" w:lineRule="auto"/><w:jc w:val="both"/><w:rPr><w:b/><w:sz w:val="26"/><w:szCs w:val="26"/></w:rPr></w:pPr><w:r><w:rPr><w:b/><w:sz w:val="26"/><w:szCs w:val="26"/></w:rPr><w:t>NGHIỆM THU VÀ QUYẾT TOÁN DỊCH VỤ</w:t></w:r></w:p><w:p><w:pPr><w:tabs><w:tab w:val="left" w:pos="180"/><w:tab w:val="left" w:pos="630"/></w:tabs><w:spacing w:before="120" w:after="120" w:line="360" w:lineRule="auto"/><w:jc w:val="both"/><w:rPr><w:bCs/><w:sz w:val="26"/><w:szCs w:val="26"/></w:rPr></w:pPr><w:r><w:rPr><w:bCs/><w:sz w:val="26"/><w:szCs w:val="26"/></w:rPr><w:tab/></w:r><w:r><w:rPr><w:bCs/><w:sz w:val="26"/><w:szCs w:val="26"/></w:rPr><w:t>Hai Bên thống nhất xác nhận Bên A đã hoàn thành việc cung cấp dịch vụ theo Hợp đồng và các nội dung phát sinh được hai Bên xác nhận (nếu có).</w:t></w:r></w:p><w:p><w:pPr><w:tabs><w:tab w:val="left" w:pos="180"/><w:tab w:val="left" w:pos="630"/></w:tabs><w:spacing w:before="120" w:after="120" w:line="360" w:lineRule="auto"/><w:jc w:val="both"/><w:rPr><w:bCs/><w:sz w:val="26"/><w:szCs w:val="26"/></w:rPr></w:pPr><w:r><w:rPr><w:bCs/><w:sz w:val="26"/><w:szCs w:val="26"/></w:rPr><w:tab/></w:r><w:r><w:rPr><w:bCs/><w:sz w:val="26"/><w:szCs w:val="26"/></w:rPr><w:t>Chi tiết giá trị quyết toán như sau:</w:t></w:r></w:p><w:tbl><w:tblPr><w:tblStyle w:val="3"/><w:tblpPr w:leftFromText="180" w:rightFromText="180" w:vertAnchor="text" w:horzAnchor="page" w:tblpX="1093" w:tblpY="571"/><w:tblOverlap w:val="never"/><w:tblW w:w="10939" w:type="dxa"/><w:tblInd w:w="0" w:type="dxa"/><w:tblLayout w:type="fixed"/><w:tblCellMar><w:top w:w="0" w:type="dxa"/><w:left w:w="108" w:type="dxa"/><w:bottom w:w="0" w:type="dxa"/><w:right w:w="108" w:type="dxa"/></w:tblCellMar></w:tblPr><w:tblGrid><w:gridCol w:w="751"/><w:gridCol w:w="2343"/><w:gridCol w:w="1389"/><w:gridCol w:w="1392"/><w:gridCol w:w="1128"/><w:gridCol w:w="857"/><w:gridCol w:w="1495"/><w:gridCol w:w="1584"/></w:tblGrid><w:tr><w:tblPrEx><w:tblCellMar><w:top w:w="0" w:type="dxa"/><w:left w:w="108" w:type="dxa"/><w:bottom w:w="0" w:type="dxa"/><w:right w:w="108" w:type="dxa"/></w:tblCellMar></w:tblPrEx><w:trPr><w:trHeight w:val="1044" w:hRule="atLeast"/></w:trPr><w:tc><w:tcPr><w:tcW w:w="751" w:type="dxa"/><w:tcBorders><w:top w:val="single" w:color="000000" w:sz="4" w:space="0"/><w:left w:val="single" w:color="000000" w:sz="4" w:space="0"/><w:bottom w:val="single" w:color="000000" w:sz="4" w:space="0"/><w:right w:val="single" w:color="000000" w:sz="4" w:space="0"/></w:tcBorders><w:shd w:val="clear" w:color="auto" w:fill="FFFFFF" w:themeFill="background1"/><w:vAlign w:val="center"/></w:tcPr><w:p><w:pPr><w:jc w:val="center"/><w:textAlignment w:val="center"/><w:rPr><w:b/><w:bCs/><w:sz w:val="26"/><w:szCs w:val="26"/></w:rPr></w:pPr><w:r><w:rPr><w:rFonts w:eastAsia="SimSun"/><w:b/><w:bCs/><w:sz w:val="26"/><w:szCs w:val="26"/><w:lang w:eastAsia="zh-CN" w:bidi="ar"/></w:rPr><w:t>STT</w:t></w:r></w:p></w:tc><w:tc><w:tcPr><w:tcW w:w="2343" w:type="dxa"/><w:tcBorders><w:top w:val="single" w:color="000000" w:sz="4" w:space="0"/><w:left w:val="single" w:color="000000" w:sz="4" w:space="0"/><w:bottom w:val="single" w:color="000000" w:sz="4" w:space="0"/><w:right w:val="single" w:color="000000" w:sz="4" w:space="0"/></w:tcBorders><w:shd w:val="clear" w:color="auto" w:fill="FFFFFF" w:themeFill="background1"/><w:vAlign w:val="center"/></w:tcPr><w:p><w:pPr><w:jc w:val="center"/><w:textAlignment w:val="center"/><w:rPr><w:b/><w:bCs/><w:sz w:val="26"/><w:szCs w:val="26"/></w:rPr></w:pPr><w:r><w:rPr><w:rFonts w:eastAsia="SimSun"/><w:b/><w:bCs/><w:sz w:val="26"/><w:szCs w:val="26"/><w:lang w:eastAsia="zh-CN" w:bidi="ar"/></w:rPr><w:t>NỘI DUNG DỊCH VỤ</w:t></w:r></w:p></w:tc><w:tc><w:tcPr><w:tcW w:w="1389" w:type="dxa"/><w:tcBorders><w:top w:val="single" w:color="000000" w:sz="4" w:space="0"/><w:left w:val="single" w:color="000000" w:sz="4" w:space="0"/><w:bottom w:val="single" w:color="000000" w:sz="4" w:space="0"/><w:right w:val="single" w:color="000000" w:sz="4" w:space="0"/></w:tcBorders><w:shd w:val="clear" w:color="auto" w:fill="FFFFFF" w:themeFill="background1"/><w:vAlign w:val="center"/></w:tcPr><w:p><w:pPr><w:jc w:val="center"/><w:textAlignment w:val="center"/><w:rPr><w:b/><w:bCs/><w:sz w:val="26"/><w:szCs w:val="26"/></w:rPr></w:pPr><w:r><w:rPr><w:rFonts w:eastAsia="SimSun"/><w:b/><w:bCs/><w:sz w:val="26"/><w:szCs w:val="26"/><w:lang w:eastAsia="zh-CN" w:bidi="ar"/></w:rPr><w:t>THỜI GIAN</w:t></w:r></w:p></w:tc><w:tc><w:tcPr><w:tcW w:w="1392" w:type="dxa"/><w:tcBorders><w:top w:val="single" w:color="000000" w:sz="4" w:space="0"/><w:left w:val="single" w:color="000000" w:sz="4" w:space="0"/><w:bottom w:val="single" w:color="000000" w:sz="4" w:space="0"/><w:right w:val="single" w:color="000000" w:sz="4" w:space="0"/></w:tcBorders><w:shd w:val="clear" w:color="auto" w:fill="FFFFFF" w:themeFill="background1"/><w:vAlign w:val="center"/></w:tcPr><w:p><w:pPr><w:jc w:val="center"/><w:textAlignment w:val="center"/><w:rPr><w:b/><w:bCs/><w:sz w:val="26"/><w:szCs w:val="26"/></w:rPr></w:pPr><w:r><w:rPr><w:rFonts w:eastAsia="SimSun"/><w:b/><w:bCs/><w:sz w:val="26"/><w:szCs w:val="26"/><w:lang w:eastAsia="zh-CN" w:bidi="ar"/></w:rPr><w:t>SẢNH</w:t></w:r></w:p></w:tc><w:tc><w:tcPr><w:tcW w:w="1128" w:type="dxa"/><w:tcBorders><w:top w:val="single" w:color="000000" w:sz="4" w:space="0"/><w:left w:val="single" w:color="000000" w:sz="4" w:space="0"/><w:bottom w:val="single" w:color="000000" w:sz="4" w:space="0"/><w:right w:val="single" w:color="000000" w:sz="4" w:space="0"/></w:tcBorders><w:shd w:val="clear" w:color="auto" w:fill="FFFFFF" w:themeFill="background1"/><w:vAlign w:val="center"/></w:tcPr><w:p><w:pPr><w:jc w:val="center"/><w:textAlignment w:val="center"/><w:rPr><w:b/><w:bCs/><w:sz w:val="26"/><w:szCs w:val="26"/></w:rPr></w:pPr><w:r><w:rPr><w:rFonts w:eastAsia="SimSun"/><w:b/><w:bCs/><w:sz w:val="26"/><w:szCs w:val="26"/><w:lang w:eastAsia="zh-CN" w:bidi="ar"/></w:rPr><w:t>ĐVT</w:t></w:r></w:p></w:tc><w:tc><w:tcPr><w:tcW w:w="857" w:type="dxa"/><w:tcBorders><w:top w:val="single" w:color="000000" w:sz="4" w:space="0"/><w:left w:val="single" w:color="000000" w:sz="4" w:space="0"/><w:bottom w:val="single" w:color="000000" w:sz="4" w:space="0"/><w:right w:val="single" w:color="000000" w:sz="4" w:space="0"/></w:tcBorders><w:shd w:val="clear" w:color="auto" w:fill="FFFFFF" w:themeFill="background1"/><w:vAlign w:val="center"/></w:tcPr><w:p><w:pPr><w:jc w:val="center"/><w:textAlignment w:val="center"/><w:rPr><w:b/><w:bCs/><w:sz w:val="26"/><w:szCs w:val="26"/></w:rPr></w:pPr><w:r><w:rPr><w:rFonts w:eastAsia="SimSun"/><w:b/><w:bCs/><w:sz w:val="26"/><w:szCs w:val="26"/><w:lang w:eastAsia="zh-CN" w:bidi="ar"/></w:rPr><w:t>SL</w:t></w:r></w:p></w:tc><w:tc><w:tcPr><w:tcW w:w="1495" w:type="dxa"/><w:tcBorders><w:top w:val="single" w:color="000000" w:sz="4" w:space="0"/><w:left w:val="single" w:color="000000" w:sz="4" w:space="0"/><w:bottom w:val="single" w:color="000000" w:sz="4" w:space="0"/><w:right w:val="single" w:color="000000" w:sz="4" w:space="0"/></w:tcBorders><w:shd w:val="clear" w:color="auto" w:fill="FFFFFF" w:themeFill="background1"/><w:vAlign w:val="center"/></w:tcPr><w:p><w:pPr><w:jc w:val="center"/><w:textAlignment w:val="center"/><w:rPr><w:b/><w:bCs/><w:sz w:val="26"/><w:szCs w:val="26"/></w:rPr></w:pPr><w:r><w:rPr><w:rFonts w:eastAsia="SimSun"/><w:b/><w:bCs/><w:sz w:val="26"/><w:szCs w:val="26"/><w:lang w:eastAsia="zh-CN" w:bidi="ar"/></w:rPr><w:t xml:space="preserve">ĐƠN GIÁ </w:t></w:r><w:r><w:rPr><w:rFonts w:eastAsia="SimSun"/><w:b/><w:bCs/><w:sz w:val="26"/><w:szCs w:val="26"/><w:lang w:eastAsia="zh-CN" w:bidi="ar"/></w:rPr><w:br w:type="textWrapping"/></w:r><w:r><w:rPr><w:rFonts w:eastAsia="SimSun"/><w:b/><w:bCs/><w:sz w:val="26"/><w:szCs w:val="26"/><w:lang w:eastAsia="zh-CN" w:bidi="ar"/></w:rPr><w:t>VNĐ</w:t></w:r></w:p></w:tc><w:tc><w:tcPr><w:tcW w:w="1584" w:type="dxa"/><w:tcBorders><w:top w:val="single" w:color="000000" w:sz="4" w:space="0"/><w:left w:val="single" w:color="000000" w:sz="4" w:space="0"/><w:bottom w:val="single" w:color="000000" w:sz="4" w:space="0"/><w:right w:val="single" w:color="000000" w:sz="4" w:space="0"/></w:tcBorders><w:shd w:val="clear" w:color="auto" w:fill="FFFFFF" w:themeFill="background1"/><w:vAlign w:val="center"/></w:tcPr><w:p><w:pPr><w:jc w:val="center"/><w:textAlignment w:val="center"/><w:rPr><w:b/><w:bCs/><w:sz w:val="26"/><w:szCs w:val="26"/></w:rPr></w:pPr><w:r><w:rPr><w:rFonts w:eastAsia="SimSun"/><w:b/><w:bCs/><w:sz w:val="26"/><w:szCs w:val="26"/><w:lang w:eastAsia="zh-CN" w:bidi="ar"/></w:rPr><w:t>THÀNH TIỀN</w:t></w:r><w:r><w:rPr><w:rFonts w:eastAsia="SimSun"/><w:b/><w:bCs/><w:sz w:val="26"/><w:szCs w:val="26"/><w:lang w:eastAsia="zh-CN" w:bidi="ar"/></w:rPr><w:br w:type="textWrapping"/></w:r><w:r><w:rPr><w:rFonts w:eastAsia="SimSun"/><w:b/><w:bCs/><w:sz w:val="26"/><w:szCs w:val="26"/><w:lang w:eastAsia="zh-CN" w:bidi="ar"/></w:rPr><w:t>VNĐ</w:t></w:r></w:p></w:tc></w:tr><w:tr><w:tblPrEx><w:tblCellMar><w:top w:w="0" w:type="dxa"/><w:left w:w="108" w:type="dxa"/><w:bottom w:w="0" w:type="dxa"/><w:right w:w="108" w:type="dxa"/></w:tblCellMar></w:tblPrEx><w:trPr><w:trHeight w:val="546" w:hRule="atLeast"/></w:trPr><w:tc><w:tcPr><w:tcW w:w="10939" w:type="dxa"/><w:gridSpan w:val="8"/><w:tcBorders><w:top w:val="single" w:color="000000" w:sz="4" w:space="0"/><w:left w:val="single" w:color="000000" w:sz="4" w:space="0"/><w:bottom w:val="single" w:color="000000" w:sz="4" w:space="0"/><w:right w:val="single" w:color="000000" w:sz="4" w:space="0"/></w:tcBorders><w:vAlign w:val="center"/></w:tcPr><w:p><w:pPr><w:jc w:val="center"/><w:textAlignment w:val="center"/><w:rPr><w:b/><w:bCs/><w:sz w:val="26"/><w:szCs w:val="26"/></w:rPr></w:pPr><w:r><w:rPr><w:rFonts w:hint="default"/></w:rPr><w:t>{#DanhSachNgay} {TenNhomNgay}</w:t></w:r></w:p></w:tc></w:tr><w:tr><w:tblPrEx><w:tblCellMar><w:top w:w="0" w:type="dxa"/><w:left w:w="108" w:type="dxa"/><w:bottom w:w="0" w:type="dxa"/><w:right w:w="108" w:type="dxa"/></w:tblCellMar></w:tblPrEx><w:trPr><w:trHeight w:val="90" w:hRule="atLeast"/></w:trPr><w:tc><w:tcPr><w:tcW w:w="751" w:type="dxa"/><w:tcBorders><w:top w:val="single" w:color="000000" w:sz="4" w:space="0"/><w:left w:val="single" w:color="000000" w:sz="4" w:space="0"/><w:bottom w:val="single" w:color="000000" w:sz="4" w:space="0"/><w:right w:val="single" w:color="000000" w:sz="4" w:space="0"/></w:tcBorders><w:vAlign w:val="center"/></w:tcPr><w:p><w:pPr><w:jc w:val="center"/><w:textAlignment w:val="center"/><w:rPr><w:b/><w:bCs/><w:sz w:val="26"/><w:szCs w:val="26"/></w:rPr></w:pPr><w:r><w:rPr><w:rFonts w:hint="default" w:eastAsia="SimSun"/><w:b/><w:bCs/><w:sz w:val="26"/><w:szCs w:val="26"/><w:lang w:eastAsia="zh-CN" w:bidi="ar"/></w:rPr><w:t>{#DanhSachDV}{STT}</w:t></w:r></w:p></w:tc><w:tc><w:tcPr><w:tcW w:w="2343" w:type="dxa"/><w:tcBorders><w:top w:val="single" w:color="000000" w:sz="4" w:space="0"/><w:left w:val="single" w:color="000000" w:sz="4" w:space="0"/><w:bottom w:val="single" w:color="000000" w:sz="4" w:space="0"/><w:right w:val="single" w:color="000000" w:sz="4" w:space="0"/></w:tcBorders><w:vAlign w:val="center"/></w:tcPr><w:p><w:pPr><w:textAlignment w:val="center"/><w:rPr><w:sz w:val="26"/><w:szCs w:val="26"/></w:rPr></w:pPr><w:r><w:rPr><w:rFonts w:hint="default" w:eastAsia="SimSun"/><w:sz w:val="26"/><w:szCs w:val="26"/><w:lang w:eastAsia="zh-CN" w:bidi="ar"/></w:rPr><w:t>{TenDichVu}</w:t></w:r></w:p></w:tc><w:tc><w:tcPr><w:tcW w:w="1389" w:type="dxa"/><w:tcBorders><w:top w:val="single" w:color="000000" w:sz="4" w:space="0"/><w:left w:val="single" w:color="000000" w:sz="4" w:space="0"/><w:bottom w:val="single" w:color="000000" w:sz="4" w:space="0"/><w:right w:val="single" w:color="000000" w:sz="4" w:space="0"/></w:tcBorders><w:vAlign w:val="center"/></w:tcPr><w:p><w:pPr><w:jc w:val="center"/><w:textAlignment w:val="center"/><w:rPr><w:sz w:val="26"/><w:szCs w:val="26"/></w:rPr></w:pPr><w:r><w:rPr><w:rFonts w:hint="default" w:eastAsia="SimSun"/><w:sz w:val="26"/><w:szCs w:val="26"/><w:lang w:eastAsia="zh-CN" w:bidi="ar"/></w:rPr><w:t>{KhungGio}</w:t></w:r></w:p></w:tc><w:tc><w:tcPr><w:tcW w:w="1392" w:type="dxa"/><w:tcBorders><w:top w:val="single" w:color="000000" w:sz="4" w:space="0"/><w:left w:val="single" w:color="000000" w:sz="4" w:space="0"/><w:bottom w:val="nil"/><w:right w:val="single" w:color="000000" w:sz="4" w:space="0"/></w:tcBorders><w:vAlign w:val="center"/></w:tcPr><w:p><w:pPr><w:jc w:val="center"/><w:textAlignment w:val="center"/><w:rPr><w:b/><w:bCs/><w:sz w:val="26"/><w:szCs w:val="26"/></w:rPr></w:pPr><w:r><w:rPr><w:rFonts w:hint="default" w:eastAsia="SimSun"/><w:b/><w:bCs/><w:sz w:val="26"/><w:szCs w:val="26"/><w:lang w:eastAsia="zh-CN" w:bidi="ar"/></w:rPr><w:t>{Sanh}</w:t></w:r></w:p></w:tc><w:tc><w:tcPr><w:tcW w:w="1128" w:type="dxa"/><w:tcBorders><w:top w:val="single" w:color="000000" w:sz="4" w:space="0"/><w:left w:val="single" w:color="000000" w:sz="4" w:space="0"/><w:bottom w:val="single" w:color="000000" w:sz="4" w:space="0"/><w:right w:val="single" w:color="000000" w:sz="4" w:space="0"/></w:tcBorders><w:vAlign w:val="center"/></w:tcPr><w:p><w:pPr><w:jc w:val="center"/><w:textAlignment w:val="center"/><w:rPr><w:sz w:val="26"/><w:szCs w:val="26"/></w:rPr></w:pPr><w:r><w:rPr><w:rFonts w:hint="default" w:eastAsia="SimSun"/><w:sz w:val="26"/><w:szCs w:val="26"/><w:lang w:eastAsia="zh-CN" w:bidi="ar"/></w:rPr><w:t>{DVT}</w:t></w:r></w:p></w:tc><w:tc><w:tcPr><w:tcW w:w="857" w:type="dxa"/><w:tcBorders><w:top w:val="single" w:color="000000" w:sz="4" w:space="0"/><w:left w:val="single" w:color="000000" w:sz="4" w:space="0"/><w:bottom w:val="single" w:color="000000" w:sz="4" w:space="0"/><w:right w:val="single" w:color="000000" w:sz="4" w:space="0"/></w:tcBorders><w:vAlign w:val="center"/></w:tcPr><w:p><w:pPr><w:jc w:val="center"/><w:textAlignment w:val="center"/><w:rPr><w:sz w:val="26"/><w:szCs w:val="26"/></w:rPr></w:pPr><w:r><w:rPr><w:rFonts w:hint="default" w:eastAsia="SimSun"/><w:sz w:val="26"/><w:szCs w:val="26"/><w:lang w:eastAsia="zh-CN" w:bidi="ar"/></w:rPr><w:t>{SoLuong}</w:t></w:r></w:p></w:tc><w:tc><w:tcPr><w:tcW w:w="1495" w:type="dxa"/><w:tcBorders><w:top w:val="single" w:color="000000" w:sz="4" w:space="0"/><w:left w:val="single" w:color="000000" w:sz="4" w:space="0"/><w:bottom w:val="single" w:color="000000" w:sz="4" w:space="0"/><w:right w:val="single" w:color="000000" w:sz="4" w:space="0"/></w:tcBorders><w:vAlign w:val="center"/></w:tcPr><w:p><w:pPr><w:textAlignment w:val="center"/><w:rPr><w:sz w:val="26"/><w:szCs w:val="26"/></w:rPr></w:pPr><w:r><w:rPr><w:rFonts w:hint="default"/></w:rPr><w:t>{DonGia}</w:t></w:r></w:p></w:tc><w:tc><w:tcPr><w:tcW w:w="1584" w:type="dxa"/><w:tcBorders><w:top w:val="single" w:color="000000" w:sz="4" w:space="0"/><w:left w:val="single" w:color="000000" w:sz="4" w:space="0"/><w:bottom w:val="single" w:color="000000" w:sz="4" w:space="0"/><w:right w:val="single" w:color="000000" w:sz="4" w:space="0"/></w:tcBorders><w:noWrap/><w:vAlign w:val="center"/></w:tcPr><w:p><w:pPr><w:jc w:val="right"/><w:textAlignment w:val="center"/><w:rPr><w:sz w:val="26"/><w:szCs w:val="26"/></w:rPr></w:pPr><w:r><w:rPr><w:rFonts w:hint="default" w:eastAsia="SimSun"/><w:sz w:val="26"/><w:szCs w:val="26"/><w:lang w:eastAsia="zh-CN" w:bidi="ar"/></w:rPr><w:t>{ThanhTien}{/DanhSachDV}{/DanhSachNgay}</w:t></w:r></w:p></w:tc></w:tr><w:tr><w:tblPrEx><w:tblCellMar><w:top w:w="0" w:type="dxa"/><w:left w:w="108" w:type="dxa"/><w:bottom w:w="0" w:type="dxa"/><w:right w:w="108" w:type="dxa"/></w:tblCellMar></w:tblPrEx><w:trPr><w:trHeight w:val="530" w:hRule="atLeast"/></w:trPr><w:tc><w:tcPr><w:tcW w:w="9355" w:type="dxa"/><w:gridSpan w:val="7"/><w:tcBorders><w:top w:val="single" w:color="000000" w:sz="4" w:space="0"/><w:left w:val="single" w:color="000000" w:sz="4" w:space="0"/><w:bottom w:val="single" w:color="000000" w:sz="4" w:space="0"/><w:right w:val="single" w:color="000000" w:sz="4" w:space="0"/></w:tcBorders><w:shd w:val="clear" w:color="auto" w:fill="FFFFFF"/><w:vAlign w:val="center"/></w:tcPr><w:p><w:pPr><w:jc w:val="center"/><w:textAlignment w:val="center"/><w:rPr><w:b/><w:bCs/><w:sz w:val="26"/><w:szCs w:val="26"/></w:rPr></w:pPr><w:r><w:rPr><w:rFonts w:eastAsia="SimSun"/><w:b/><w:bCs/><w:sz w:val="26"/><w:szCs w:val="26"/><w:lang w:eastAsia="zh-CN" w:bidi="ar"/></w:rPr><w:t>THÀNH TIỀN</w:t></w:r></w:p></w:tc><w:tc><w:tcPr><w:tcW w:w="1584" w:type="dxa"/><w:tcBorders><w:top w:val="single" w:color="000000" w:sz="4" w:space="0"/><w:left w:val="single" w:color="000000" w:sz="4" w:space="0"/><w:bottom w:val="single" w:color="000000" w:sz="4" w:space="0"/><w:right w:val="single" w:color="000000" w:sz="4" w:space="0"/></w:tcBorders><w:shd w:val="clear" w:color="auto" w:fill="FFFFFF"/><w:noWrap/><w:vAlign w:val="center"/></w:tcPr><w:p><w:pPr><w:jc w:val="right"/><w:textAlignment w:val="center"/><w:rPr><w:b/><w:bCs/><w:sz w:val="26"/><w:szCs w:val="26"/></w:rPr></w:pPr><w:r><w:rPr><w:rFonts w:hint="default" w:ascii="Times New Roman" w:hAnsi="Times New Roman"/><w:sz w:val="24"/><w:szCs w:val="24"/></w:rPr><w:t>{TongTienDichVu}</w:t></w:r></w:p></w:tc></w:tr><w:tr><w:tblPrEx><w:tblCellMar><w:top w:w="0" w:type="dxa"/><w:left w:w="108" w:type="dxa"/><w:bottom w:w="0" w:type="dxa"/><w:right w:w="108" w:type="dxa"/></w:tblCellMar></w:tblPrEx><w:trPr><w:trHeight w:val="578" w:hRule="atLeast"/></w:trPr><w:tc><w:tcPr><w:tcW w:w="9355" w:type="dxa"/><w:gridSpan w:val="7"/><w:tcBorders><w:top w:val="single" w:color="000000" w:sz="4" w:space="0"/><w:left w:val="single" w:color="000000" w:sz="4" w:space="0"/><w:bottom w:val="single" w:color="000000" w:sz="4" w:space="0"/><w:right w:val="single" w:color="000000" w:sz="4" w:space="0"/></w:tcBorders><w:shd w:val="clear" w:color="auto" w:fill="FFFFFF"/><w:vAlign w:val="center"/></w:tcPr><w:p><w:pPr><w:jc w:val="center"/><w:textAlignment w:val="center"/><w:rPr><w:sz w:val="26"/><w:szCs w:val="26"/></w:rPr></w:pPr><w:r><w:rPr><w:rFonts w:eastAsia="SimSun"/><w:sz w:val="26"/><w:szCs w:val="26"/><w:lang w:eastAsia="zh-CN" w:bidi="ar"/></w:rPr><w:t xml:space="preserve">PHÍ PHỤC VỤ </w:t></w:r><w:r><w:rPr><w:rFonts w:hint="default" w:ascii="Times New Roman" w:hAnsi="Times New Roman"/><w:sz w:val="24"/><w:szCs w:val="24"/></w:rPr><w:t>{MucPhiPhucVu}</w:t></w:r><w:r><w:rPr><w:rFonts w:eastAsia="SimSun"/><w:sz w:val="26"/><w:szCs w:val="26"/><w:lang w:eastAsia="zh-CN" w:bidi="ar"/></w:rPr><w:t xml:space="preserve"> TỔNG HOÁ ĐƠN</w:t></w:r></w:p></w:tc><w:tc><w:tcPr><w:tcW w:w="1584" w:type="dxa"/><w:tcBorders><w:top w:val="single" w:color="000000" w:sz="4" w:space="0"/><w:left w:val="single" w:color="000000" w:sz="4" w:space="0"/><w:bottom w:val="single" w:color="000000" w:sz="4" w:space="0"/><w:right w:val="single" w:color="000000" w:sz="4" w:space="0"/></w:tcBorders><w:shd w:val="clear" w:color="auto" w:fill="FFFFFF"/><w:noWrap/><w:vAlign w:val="center"/></w:tcPr><w:p><w:pPr><w:shd w:val="clear" w:color="auto" w:fill="FFFFFF" w:themeFill="background1"/><w:spacing w:line="312" w:lineRule="auto"/><w:ind w:left="240" w:leftChars="100"/><w:jc w:val="right"/><w:rPr><w:b/><w:bCs/><w:sz w:val="26"/><w:szCs w:val="26"/></w:rPr></w:pPr><w:r><w:rPr><w:rFonts w:hint="default" w:ascii="Times New Roman" w:hAnsi="Times New Roman"/><w:sz w:val="24"/><w:szCs w:val="24"/></w:rPr><w:t>{PhiPhucVu}</w:t></w:r></w:p></w:tc></w:tr><w:tr><w:tblPrEx><w:tblCellMar><w:top w:w="0" w:type="dxa"/><w:left w:w="108" w:type="dxa"/><w:bottom w:w="0" w:type="dxa"/><w:right w:w="108" w:type="dxa"/></w:tblCellMar></w:tblPrEx><w:trPr><w:trHeight w:val="532" w:hRule="atLeast"/></w:trPr><w:tc><w:tcPr><w:tcW w:w="9355" w:type="dxa"/><w:gridSpan w:val="7"/><w:tcBorders><w:top w:val="single" w:color="000000" w:sz="4" w:space="0"/><w:left w:val="single" w:color="000000" w:sz="4" w:space="0"/><w:bottom w:val="single" w:color="000000" w:sz="4" w:space="0"/><w:right w:val="single" w:color="000000" w:sz="4" w:space="0"/></w:tcBorders><w:shd w:val="clear" w:color="auto" w:fill="FFFFFF"/><w:vAlign w:val="center"/></w:tcPr><w:p><w:pPr><w:jc w:val="center"/><w:textAlignment w:val="center"/><w:rPr><w:b/><w:bCs/><w:sz w:val="26"/><w:szCs w:val="26"/></w:rPr></w:pPr><w:r><w:rPr><w:rFonts w:eastAsia="SimSun"/><w:b/><w:bCs/><w:sz w:val="26"/><w:szCs w:val="26"/><w:lang w:eastAsia="zh-CN" w:bidi="ar"/></w:rPr><w:t>TỔNG CỘNG (CHƯA VAT)</w:t></w:r></w:p></w:tc><w:tc><w:tcPr><w:tcW w:w="1584" w:type="dxa"/><w:tcBorders><w:top w:val="single" w:color="000000" w:sz="4" w:space="0"/><w:left w:val="single" w:color="000000" w:sz="4" w:space="0"/><w:bottom w:val="single" w:color="000000" w:sz="4" w:space="0"/><w:right w:val="single" w:color="000000" w:sz="4" w:space="0"/></w:tcBorders><w:shd w:val="clear" w:color="auto" w:fill="FFFFFF"/><w:noWrap/><w:vAlign w:val="center"/></w:tcPr><w:p><w:pPr><w:jc w:val="right"/><w:textAlignment w:val="center"/><w:rPr><w:b/><w:bCs/><w:sz w:val="26"/><w:szCs w:val="26"/></w:rPr></w:pPr><w:r><w:rPr><w:rFonts w:hint="default" w:ascii="Times New Roman" w:hAnsi="Times New Roman"/><w:sz w:val="24"/><w:szCs w:val="24"/></w:rPr><w:t>{TongCongChuaVAT}</w:t></w:r></w:p></w:tc></w:tr><w:tr><w:tblPrEx><w:tblCellMar><w:top w:w="0" w:type="dxa"/><w:left w:w="108" w:type="dxa"/><w:bottom w:w="0" w:type="dxa"/><w:right w:w="108" w:type="dxa"/></w:tblCellMar></w:tblPrEx><w:trPr><w:trHeight w:val="566" w:hRule="atLeast"/></w:trPr><w:tc><w:tcPr><w:tcW w:w="9355" w:type="dxa"/><w:gridSpan w:val="7"/><w:tcBorders><w:top w:val="single" w:color="000000" w:sz="4" w:space="0"/><w:left w:val="single" w:color="000000" w:sz="4" w:space="0"/><w:bottom w:val="single" w:color="000000" w:sz="4" w:space="0"/><w:right w:val="single" w:color="000000" w:sz="4" w:space="0"/></w:tcBorders><w:shd w:val="clear" w:color="auto" w:fill="FFFFFF"/><w:vAlign w:val="center"/></w:tcPr><w:p><w:pPr><w:jc w:val="center"/><w:textAlignment w:val="center"/><w:rPr><w:rFonts w:eastAsia="SimSun"/><w:sz w:val="26"/><w:szCs w:val="26"/><w:lang w:eastAsia="zh-CN" w:bidi="ar"/></w:rPr></w:pPr><w:r><w:rPr><w:rFonts w:eastAsia="SimSun"/><w:sz w:val="26"/><w:szCs w:val="26"/><w:lang w:eastAsia="zh-CN" w:bidi="ar"/></w:rPr><w:t xml:space="preserve">8% VAT CHI PHÍ THỨC ĂN, NƯỚC NGỌT, NƯỚC SUỐI, PHÍ PHỤC VỤ </w:t></w:r></w:p><w:p><w:pPr><w:jc w:val="center"/><w:textAlignment w:val="center"/><w:rPr><w:sz w:val="26"/><w:szCs w:val="26"/></w:rPr></w:pPr><w:r><w:rPr><w:rFonts w:eastAsia="SimSun"/><w:sz w:val="26"/><w:szCs w:val="26"/><w:lang w:eastAsia="zh-CN" w:bidi="ar"/></w:rPr><w:t>&amp; DỊCH VỤ</w:t></w:r></w:p></w:tc><w:tc><w:tcPr><w:tcW w:w="1584" w:type="dxa"/><w:tcBorders><w:top w:val="single" w:color="000000" w:sz="4" w:space="0"/><w:left w:val="single" w:color="000000" w:sz="4" w:space="0"/><w:bottom w:val="single" w:color="000000" w:sz="4" w:space="0"/><w:right w:val="single" w:color="000000" w:sz="4" w:space="0"/></w:tcBorders><w:shd w:val="clear" w:color="auto" w:fill="FFFFFF"/><w:noWrap/><w:vAlign w:val="center"/></w:tcPr><w:p><w:pPr><w:jc w:val="right"/><w:textAlignment w:val="center"/><w:rPr><w:b/><w:bCs/><w:sz w:val="26"/><w:szCs w:val="26"/></w:rPr></w:pPr><w:r><w:rPr><w:rFonts w:hint="default" w:ascii="Times New Roman" w:hAnsi="Times New Roman"/><w:sz w:val="24"/><w:szCs w:val="24"/></w:rPr><w:t>{VAT8}</w:t></w:r></w:p></w:tc></w:tr><w:tr><w:tblPrEx><w:tblCellMar><w:top w:w="0" w:type="dxa"/><w:left w:w="108" w:type="dxa"/><w:bottom w:w="0" w:type="dxa"/><w:right w:w="108" w:type="dxa"/></w:tblCellMar></w:tblPrEx><w:trPr><w:trHeight w:val="508" w:hRule="atLeast"/></w:trPr><w:tc><w:tcPr><w:tcW w:w="9355" w:type="dxa"/><w:gridSpan w:val="7"/><w:tcBorders><w:top w:val="single" w:color="000000" w:sz="4" w:space="0"/><w:left w:val="single" w:color="000000" w:sz="4" w:space="0"/><w:bottom w:val="single" w:color="000000" w:sz="4" w:space="0"/><w:right w:val="single" w:color="000000" w:sz="4" w:space="0"/></w:tcBorders><w:shd w:val="clear" w:color="auto" w:fill="FFFFFF"/><w:vAlign w:val="center"/></w:tcPr><w:p><w:pPr><w:jc w:val="center"/><w:textAlignment w:val="center"/><w:rPr><w:sz w:val="26"/><w:szCs w:val="26"/></w:rPr></w:pPr><w:r><w:rPr><w:rFonts w:eastAsia="SimSun"/><w:sz w:val="26"/><w:szCs w:val="26"/><w:lang w:eastAsia="zh-CN" w:bidi="ar"/></w:rPr><w:t>10% VAT CÁC CHI PHÍ CÒN LẠI</w:t></w:r></w:p></w:tc><w:tc><w:tcPr><w:tcW w:w="1584" w:type="dxa"/><w:tcBorders><w:top w:val="single" w:color="000000" w:sz="4" w:space="0"/><w:left w:val="single" w:color="000000" w:sz="4" w:space="0"/><w:bottom w:val="single" w:color="000000" w:sz="4" w:space="0"/><w:right w:val="single" w:color="000000" w:sz="4" w:space="0"/></w:tcBorders><w:shd w:val="clear" w:color="auto" w:fill="FFFFFF"/><w:noWrap/><w:vAlign w:val="center"/></w:tcPr><w:p><w:pPr><w:jc w:val="right"/><w:textAlignment w:val="center"/><w:rPr><w:b/><w:bCs/><w:sz w:val="26"/><w:szCs w:val="26"/></w:rPr></w:pPr><w:r><w:rPr><w:rFonts w:hint="default" w:ascii="Times New Roman" w:hAnsi="Times New Roman"/><w:sz w:val="24"/><w:szCs w:val="24"/></w:rPr><w:t>{VAT10}</w:t></w:r></w:p></w:tc></w:tr><w:tr><w:tblPrEx><w:tblCellMar><w:top w:w="0" w:type="dxa"/><w:left w:w="108" w:type="dxa"/><w:bottom w:w="0" w:type="dxa"/><w:right w:w="108" w:type="dxa"/></w:tblCellMar></w:tblPrEx><w:trPr><w:trHeight w:val="638" w:hRule="atLeast"/></w:trPr><w:tc><w:tcPr><w:tcW w:w="9355" w:type="dxa"/><w:gridSpan w:val="7"/><w:tcBorders><w:top w:val="single" w:color="000000" w:sz="4" w:space="0"/><w:left w:val="single" w:color="000000" w:sz="4" w:space="0"/><w:bottom w:val="single" w:color="000000" w:sz="4" w:space="0"/><w:right w:val="single" w:color="000000" w:sz="4" w:space="0"/></w:tcBorders><w:shd w:val="clear" w:color="auto" w:fill="FFFFFF"/><w:vAlign w:val="center"/></w:tcPr><w:p><w:pPr><w:jc w:val="center"/><w:textAlignment w:val="center"/><w:rPr><w:b/><w:bCs/><w:sz w:val="26"/><w:szCs w:val="26"/></w:rPr></w:pPr><w:r><w:rPr><w:rFonts w:eastAsia="SimSun"/><w:b/><w:bCs/><w:sz w:val="26"/><w:szCs w:val="26"/><w:lang w:eastAsia="zh-CN" w:bidi="ar"/></w:rPr><w:t>TỔNG GIÁ TRỊ QUYẾT TOÁN</w:t></w:r></w:p></w:tc><w:tc><w:tcPr><w:tcW w:w="1584" w:type="dxa"/><w:tcBorders><w:top w:val="single" w:color="000000" w:sz="4" w:space="0"/><w:left w:val="single" w:color="000000" w:sz="4" w:space="0"/><w:bottom w:val="single" w:color="000000" w:sz="4" w:space="0"/><w:right w:val="single" w:color="000000" w:sz="4" w:space="0"/></w:tcBorders><w:shd w:val="clear" w:color="auto" w:fill="FFFFFF"/><w:noWrap/><w:vAlign w:val="center"/></w:tcPr><w:p><w:pPr><w:jc w:val="right"/><w:textAlignment w:val="center"/><w:rPr><w:b/><w:bCs/><w:sz w:val="26"/><w:szCs w:val="26"/></w:rPr></w:pPr><w:r><w:rPr><w:rFonts w:hint="default" w:ascii="Times New Roman" w:hAnsi="Times New Roman"/><w:sz w:val="24"/><w:szCs w:val="24"/></w:rPr><w:t>{TongGiaTriQuyetToan}</w:t></w:r></w:p></w:tc></w:tr></w:tbl><w:p><w:pPr><w:tabs><w:tab w:val="left" w:pos="180"/><w:tab w:val="left" w:pos="630"/></w:tabs><w:spacing w:before="120" w:after="120" w:line="360" w:lineRule="auto"/><w:jc w:val="both"/><w:rPr><w:bCs/><w:sz w:val="26"/><w:szCs w:val="26"/></w:rPr></w:pPr></w:p><w:p><w:pPr><w:pStyle w:val="21"/><w:numPr><w:ilvl w:val="0"/><w:numId w:val="2"/></w:numPr><w:shd w:val="clear" w:color="auto" w:fill="FFFFFF" w:themeFill="background1"/><w:spacing w:line="312" w:lineRule="auto"/><w:contextualSpacing/><w:jc w:val="left"/><w:rPr><w:rFonts w:ascii="Times New Roman" w:hAnsi="Times New Roman"/><w:i/><w:iCs/><w:sz w:val="26"/><w:szCs w:val="26"/></w:rPr></w:pPr><w:bookmarkStart w:id="4" w:name="_MON_1830157658"/><w:bookmarkEnd w:id="4"/><w:r><w:rPr><w:rFonts w:ascii="Times New Roman" w:hAnsi="Times New Roman"/><w:sz w:val="26"/><w:szCs w:val="26"/></w:rPr><w:t xml:space="preserve">Tổng giá trị </w:t></w:r><w:r><w:rPr><w:rFonts w:hint="default"/><w:sz w:val="26"/><w:szCs w:val="26"/><w:lang w:val="en-US"/></w:rPr><w:t>Quyết Toán</w:t></w:r><w:r><w:rPr><w:rFonts w:ascii="Times New Roman" w:hAnsi="Times New Roman"/><w:sz w:val="26"/><w:szCs w:val="26"/></w:rPr><w:t>:</w:t></w:r><w:r><w:rPr><w:rFonts w:hint="default" w:ascii="Times New Roman" w:hAnsi="Times New Roman"/><w:sz w:val="26"/><w:szCs w:val="26"/></w:rPr><w:t>{TongGiaTriQuyetToan}</w:t></w:r><w:r><w:rPr><w:rFonts w:ascii="Times New Roman" w:hAnsi="Times New Roman"/><w:b/><w:sz w:val="26"/><w:szCs w:val="26"/></w:rPr><w:t xml:space="preserve">VNĐ </w:t></w:r><w:r><w:rPr><w:rFonts w:ascii="Times New Roman" w:hAnsi="Times New Roman"/><w:i/><w:iCs/><w:sz w:val="26"/><w:szCs w:val="26"/></w:rPr><w:t>(Bằng</w:t></w:r><w:r><w:rPr><w:rFonts w:hint="default" w:ascii="Times New Roman" w:hAnsi="Times New Roman"/><w:i/><w:iCs/><w:sz w:val="26"/><w:szCs w:val="26"/><w:lang w:val="en-US"/></w:rPr><w:t xml:space="preserve"> </w:t></w:r><w:r><w:rPr><w:rFonts w:ascii="Times New Roman" w:hAnsi="Times New Roman"/><w:i/><w:iCs/><w:sz w:val="26"/><w:szCs w:val="26"/></w:rPr><w:t>chữ:</w:t></w:r><w:r><w:rPr><w:rFonts w:hint="default" w:ascii="Times New Roman" w:hAnsi="Times New Roman"/><w:i/><w:iCs/><w:sz w:val="26"/><w:szCs w:val="26"/><w:lang w:val="en-US"/></w:rPr><w:t xml:space="preserve"> </w:t></w:r><w:r><w:rPr><w:rFonts w:hint="default" w:ascii="Times New Roman" w:hAnsi="Times New Roman"/><w:i/><w:iCs/><w:sz w:val="26"/><w:szCs w:val="26"/></w:rPr><w:t>{TongGiaTriQuyetToanBangChu}</w:t></w:r><w:r><w:rPr><w:rFonts w:hint="default" w:ascii="Times New Roman" w:hAnsi="Times New Roman"/><w:i/><w:iCs/><w:sz w:val="26"/><w:szCs w:val="26"/><w:lang w:val="en-US"/></w:rPr><w:t xml:space="preserve"> </w:t></w:r><w:r><w:rPr><w:rFonts w:ascii="Times New Roman" w:hAnsi="Times New Roman"/><w:i/><w:iCs/><w:sz w:val="26"/><w:szCs w:val="26"/></w:rPr><w:t>đồng./.)</w:t></w:r></w:p><w:p><w:pPr><w:tabs><w:tab w:val="left" w:pos="630"/></w:tabs><w:spacing w:before="120" w:after="120" w:line="360" w:lineRule="auto"/><w:jc w:val="both"/><w:rPr><w:sz w:val="26"/><w:szCs w:val="26"/></w:rPr></w:pPr></w:p><w:p><w:pPr><w:tabs><w:tab w:val="left" w:pos="630"/></w:tabs><w:spacing w:before="120" w:after="120" w:line="360" w:lineRule="auto"/><w:jc w:val="both"/><w:rPr><w:sz w:val="26"/><w:szCs w:val="26"/></w:rPr></w:pPr><w:r><w:rPr><w:sz w:val="26"/><w:szCs w:val="26"/></w:rPr><w:t>Hai Bên thống nhất xác nhận:</w:t></w:r></w:p><w:p><w:pPr><w:pStyle w:val="21"/><w:numPr><w:ilvl w:val="0"/><w:numId w:val="3"/></w:numPr><w:tabs><w:tab w:val="left" w:pos="630"/></w:tabs><w:spacing w:before="120" w:after="120" w:line="360" w:lineRule="auto"/><w:jc w:val="both"/><w:rPr><w:sz w:val="26"/><w:szCs w:val="26"/></w:rPr></w:pPr><w:r><w:rPr><w:sz w:val="26"/><w:szCs w:val="26"/></w:rPr><w:t>Bên A đã hoàn thành việc cung cấp dịch vụ theo Hợp đồng và các nội dung phát sinh được hai Bên xác nhận (nếu có).</w:t></w:r></w:p><w:p><w:pPr><w:pStyle w:val="21"/><w:numPr><w:ilvl w:val="0"/><w:numId w:val="3"/></w:numPr><w:tabs><w:tab w:val="left" w:pos="630"/></w:tabs><w:spacing w:before="120" w:after="120" w:line="360" w:lineRule="auto"/><w:jc w:val="both"/><w:rPr><w:sz w:val="26"/><w:szCs w:val="26"/></w:rPr></w:pPr><w:r><w:rPr><w:sz w:val="26"/><w:szCs w:val="26"/></w:rPr><w:t>Các khoản phát sinh (nếu có) đã được hai Bên kiểm tra và thống nhất.</w:t></w:r></w:p><w:p><w:pPr><w:pStyle w:val="21"/><w:numPr><w:ilvl w:val="0"/><w:numId w:val="3"/></w:numPr><w:tabs><w:tab w:val="left" w:pos="630"/></w:tabs><w:spacing w:before="120" w:after="120" w:line="360" w:lineRule="auto"/><w:jc w:val="both"/><w:rPr><w:sz w:val="26"/><w:szCs w:val="26"/></w:rPr></w:pPr><w:r><w:rPr><w:sz w:val="26"/><w:szCs w:val="26"/></w:rPr><w:t>Tổng giá trị quyết toán là:</w:t></w:r><w:r><w:rPr><w:rFonts w:hint="default" w:ascii="Times New Roman" w:hAnsi="Times New Roman"/><w:sz w:val="26"/><w:szCs w:val="26"/></w:rPr><w:t>{TongGiaTriQuyetToan}</w:t></w:r><w:r><w:rPr><w:sz w:val="26"/><w:szCs w:val="26"/></w:rPr><w:t>VNĐ</w:t></w:r></w:p><w:p><w:pPr><w:pStyle w:val="21"/><w:numPr><w:ilvl w:val="0"/><w:numId w:val="3"/></w:numPr><w:tabs><w:tab w:val="left" w:pos="630"/></w:tabs><w:spacing w:before="120" w:after="120" w:line="360" w:lineRule="auto"/><w:jc w:val="both"/><w:rPr><w:sz w:val="26"/><w:szCs w:val="26"/></w:rPr></w:pPr><w:r><w:rPr><w:sz w:val="26"/><w:szCs w:val="26"/></w:rPr><w:t xml:space="preserve">Số tiền Bên B đã đặt cọc giữ chỗ và đảm bảo thực hiện hợp đồng là: </w:t></w:r><w:r><w:rPr><w:rFonts w:hint="default"/><w:sz w:val="26"/><w:szCs w:val="26"/><w:lang w:val="en-US"/></w:rPr><w:t>{SoTienDaDatCoc}</w:t></w:r><w:r><w:rPr><w:sz w:val="26"/><w:szCs w:val="26"/></w:rPr><w:t xml:space="preserve"> VNĐ (Ngày thanh toán: </w:t></w:r><w:r><w:rPr><w:rFonts w:hint="default"/><w:sz w:val="26"/><w:szCs w:val="26"/><w:lang w:val="en-US"/></w:rPr><w:t>{NgayThanhToanDatCoc}</w:t></w:r><w:r><w:rPr><w:sz w:val="26"/><w:szCs w:val="26"/></w:rPr><w:t>)</w:t></w:r></w:p><w:p><w:pPr><w:pStyle w:val="21"/><w:numPr><w:ilvl w:val="0"/><w:numId w:val="3"/></w:numPr><w:tabs><w:tab w:val="left" w:pos="630"/></w:tabs><w:spacing w:before="120" w:after="120" w:line="360" w:lineRule="auto"/><w:jc w:val="both"/><w:rPr><w:sz w:val="26"/><w:szCs w:val="26"/></w:rPr></w:pPr><w:r><w:rPr><w:sz w:val="26"/><w:szCs w:val="26"/></w:rPr><w:t xml:space="preserve">Số tiền Bên B còn phải thanh toán cho Bên A là: </w:t></w:r><w:r><w:rPr><w:rFonts w:hint="default"/><w:sz w:val="26"/><w:szCs w:val="26"/><w:lang w:val="en-US"/></w:rPr><w:t>{SoTienConLai}</w:t></w:r><w:r><w:rPr><w:sz w:val="26"/><w:szCs w:val="26"/></w:rPr><w:t xml:space="preserve"> (Bằng chữ:</w:t></w:r><w:r><w:rPr><w:rFonts w:hint="default"/><w:sz w:val="26"/><w:szCs w:val="26"/></w:rPr><w:t>{SoTienConLaiBangChu}</w:t></w:r><w:bookmarkStart w:id="5" w:name="_GoBack"/><w:bookmarkEnd w:id="5"/><w:r><w:rPr><w:sz w:val="26"/><w:szCs w:val="26"/></w:rPr><w:t>)</w:t></w:r></w:p><w:p><w:pPr><w:pStyle w:val="21"/><w:numPr><w:ilvl w:val="0"/><w:numId w:val="1"/></w:numPr><w:tabs><w:tab w:val="left" w:pos="630"/></w:tabs><w:spacing w:before="120" w:after="120" w:line="360" w:lineRule="auto"/><w:jc w:val="both"/><w:rPr><w:b/><w:sz w:val="26"/><w:szCs w:val="26"/></w:rPr></w:pPr><w:r><w:rPr><w:b/><w:sz w:val="26"/><w:szCs w:val="26"/></w:rPr><w:t>CAM KẾT THỰC HIỆN</w:t></w:r></w:p><w:p><w:pPr><w:pStyle w:val="21"/><w:numPr><w:ilvl w:val="0"/><w:numId w:val="4"/></w:numPr><w:tabs><w:tab w:val="left" w:pos="630"/></w:tabs><w:spacing w:before="120" w:after="120" w:line="360" w:lineRule="auto"/><w:jc w:val="both"/><w:rPr><w:b/><w:sz w:val="26"/><w:szCs w:val="26"/></w:rPr></w:pPr><w:r><w:rPr><w:bCs/><w:sz w:val="26"/><w:szCs w:val="26"/></w:rPr><w:t>Bên A thực hiện xuất Hóa đơn GTGT theo Tổng giá trị quyết toán được hai Bên xác nhận tại Biên bản này.</w:t></w:r></w:p><w:p><w:pPr><w:pStyle w:val="21"/><w:numPr><w:ilvl w:val="0"/><w:numId w:val="4"/></w:numPr><w:tabs><w:tab w:val="left" w:pos="630"/></w:tabs><w:spacing w:before="120" w:after="120" w:line="360" w:lineRule="auto"/><w:jc w:val="both"/><w:rPr><w:b/><w:sz w:val="26"/><w:szCs w:val="26"/></w:rPr></w:pPr><w:r><w:rPr><w:bCs/><w:sz w:val="26"/><w:szCs w:val="26"/></w:rPr><w:t>Bên B cam kết thanh toán số tiền còn phải thanh toán cho Bên A trong thời hạn quy định tại Hợp đồng.</w:t></w:r></w:p><w:p><w:pPr><w:pStyle w:val="21"/><w:numPr><w:ilvl w:val="0"/><w:numId w:val="4"/></w:numPr><w:tabs><w:tab w:val="left" w:pos="630"/></w:tabs><w:spacing w:before="120" w:after="120" w:line="360" w:lineRule="auto"/><w:jc w:val="both"/><w:rPr><w:b/><w:sz w:val="26"/><w:szCs w:val="26"/></w:rPr></w:pPr><w:r><w:rPr><w:bCs/><w:sz w:val="26"/><w:szCs w:val="26"/></w:rPr><w:t>Biên bản này là căn cứ để đối chiếu công nợ, xuất hóa đơn và thanh toán theo quy định của Hợp đồng.</w:t></w:r></w:p><w:p><w:pPr><w:tabs><w:tab w:val="left" w:pos="630"/></w:tabs><w:spacing w:before="120" w:after="120" w:line="360" w:lineRule="auto"/><w:ind w:left="360"/><w:jc w:val="both"/><w:rPr><w:bCs/><w:sz w:val="26"/><w:szCs w:val="26"/></w:rPr></w:pPr><w:r><w:rPr><w:bCs/><w:sz w:val="26"/><w:szCs w:val="26"/></w:rPr><w:t>Biên bản được lập thành 04 (bốn) bản có giá trị pháp lý như nhau, mỗi bên giữ 02 (hai) bản để thực hiện.</w:t></w:r></w:p><w:p><w:pPr><w:spacing w:before="120" w:after="120" w:line="360" w:lineRule="auto"/><w:ind w:left="630"/><w:jc w:val="both"/><w:rPr><w:sz w:val="26"/><w:szCs w:val="26"/></w:rPr></w:pPr></w:p><w:p><w:pPr><w:spacing w:before="120" w:after="120" w:line="360" w:lineRule="auto"/><w:rPr><w:b/><w:sz w:val="26"/><w:szCs w:val="26"/><w:lang w:val="fr-FR"/></w:rPr></w:pPr><w:r><w:rPr><w:b/><w:sz w:val="26"/><w:szCs w:val="26"/><w:lang w:val="fr-FR"/></w:rPr><w:t xml:space="preserve">          ĐẠI DIỆN BÊN A</w:t></w:r><w:r><w:rPr><w:b/><w:sz w:val="26"/><w:szCs w:val="26"/><w:lang w:val="fr-FR"/></w:rPr><w:tab/></w:r><w:r><w:rPr><w:b/><w:sz w:val="26"/><w:szCs w:val="26"/><w:lang w:val="fr-FR"/></w:rPr><w:tab/></w:r><w:r><w:rPr><w:b/><w:sz w:val="26"/><w:szCs w:val="26"/><w:lang w:val="fr-FR"/></w:rPr><w:tab/></w:r><w:r><w:rPr><w:b/><w:sz w:val="26"/><w:szCs w:val="26"/><w:lang w:val="fr-FR"/></w:rPr><w:tab/></w:r><w:r><w:rPr><w:b/><w:sz w:val="26"/><w:szCs w:val="26"/><w:lang w:val="fr-FR"/></w:rPr><w:t xml:space="preserve">             ĐẠI DIỆN BÊN B</w:t></w:r></w:p><w:p><w:pPr><w:tabs><w:tab w:val="left" w:pos="6015"/></w:tabs><w:spacing w:before="120" w:after="120" w:line="360" w:lineRule="auto"/><w:rPr><w:sz w:val="26"/><w:szCs w:val="26"/><w:lang w:val="fr-FR"/></w:rPr></w:pPr><w:r><w:rPr><w:sz w:val="26"/><w:szCs w:val="26"/><w:lang w:val="fr-FR"/></w:rPr><w:t xml:space="preserve">       </w:t></w:r></w:p><w:p><w:pPr><w:tabs><w:tab w:val="left" w:pos="6015"/></w:tabs><w:spacing w:before="120" w:after="120" w:line="360" w:lineRule="auto"/><w:rPr><w:sz w:val="26"/><w:szCs w:val="26"/><w:lang w:val="fr-FR"/></w:rPr></w:pPr></w:p><w:p><w:pPr><w:spacing w:before="120" w:after="120" w:line="360" w:lineRule="auto"/><w:rPr><w:b/><w:sz w:val="26"/><w:szCs w:val="26"/><w:lang w:val="fr-FR"/></w:rPr></w:pPr><w:r><w:rPr><w:b/><w:sz w:val="26"/><w:szCs w:val="26"/><w:lang w:val="fr-FR"/></w:rPr><w:t xml:space="preserve">                   </w:t></w:r></w:p><w:p><w:pPr><w:spacing w:before="120" w:after="120" w:line="360" w:lineRule="auto"/><w:rPr><w:b/><w:sz w:val="26"/><w:szCs w:val="26"/><w:u w:val="single"/><w:lang w:val="fr-FR"/></w:rPr></w:pPr><w:r><w:rPr><w:b/><w:sz w:val="26"/><w:szCs w:val="26"/><w:lang w:val="fr-FR"/></w:rPr><w:t xml:space="preserve">   Ký: </w:t></w:r><w:r><w:rPr><w:b/><w:sz w:val="26"/><w:szCs w:val="26"/><w:u w:val="single"/><w:lang w:val="fr-FR"/></w:rPr><w:tab/></w:r><w:r><w:rPr><w:b/><w:sz w:val="26"/><w:szCs w:val="26"/><w:u w:val="single"/><w:lang w:val="fr-FR"/></w:rPr><w:tab/></w:r><w:r><w:rPr><w:b/><w:sz w:val="26"/><w:szCs w:val="26"/><w:u w:val="single"/><w:lang w:val="fr-FR"/></w:rPr><w:tab/></w:r><w:r><w:rPr><w:b/><w:sz w:val="26"/><w:szCs w:val="26"/><w:u w:val="single"/><w:lang w:val="fr-FR"/></w:rPr><w:tab/></w:r><w:r><w:rPr><w:b/><w:sz w:val="26"/><w:szCs w:val="26"/><w:lang w:val="fr-FR"/></w:rPr><w:t xml:space="preserve">                                          Ký</w:t></w:r><w:r><w:rPr><w:b/><w:sz w:val="26"/><w:szCs w:val="26"/><w:u w:val="single"/><w:lang w:val="fr-FR"/></w:rPr><w:tab/></w:r><w:r><w:rPr><w:b/><w:sz w:val="26"/><w:szCs w:val="26"/><w:u w:val="single"/><w:lang w:val="fr-FR"/></w:rPr><w:tab/></w:r><w:r><w:rPr><w:b/><w:sz w:val="26"/><w:szCs w:val="26"/><w:u w:val="single"/><w:lang w:val="fr-FR"/></w:rPr><w:tab/></w:r><w:r><w:rPr><w:b/><w:sz w:val="26"/><w:szCs w:val="26"/><w:u w:val="single"/><w:lang w:val="fr-FR"/></w:rPr><w:tab/></w:r><w:r><w:rPr><w:b/><w:sz w:val="26"/><w:szCs w:val="26"/><w:u w:val="single"/><w:lang w:val="fr-FR"/></w:rPr><w:t xml:space="preserve">    </w:t></w:r></w:p><w:p><w:pPr><w:spacing w:before="120" w:after="120" w:line="360" w:lineRule="auto"/><w:rPr><w:b/><w:sz w:val="26"/><w:szCs w:val="26"/><w:lang w:val="fr-FR"/></w:rPr></w:pPr><w:r><w:rPr><w:b/><w:sz w:val="26"/><w:szCs w:val="26"/><w:lang w:val="fr-FR"/></w:rPr><w:t xml:space="preserve">   Ông : LÊ VĂN PHƯỚC</w:t></w:r><w:r><w:rPr><w:b/><w:sz w:val="26"/><w:szCs w:val="26"/><w:lang w:val="fr-FR"/></w:rPr><w:tab/></w:r><w:r><w:rPr><w:b/><w:sz w:val="26"/><w:szCs w:val="26"/><w:lang w:val="fr-FR"/></w:rPr><w:t xml:space="preserve">                                Ông : </w:t></w:r><w:r><w:rPr><w:b/><w:bCs/><w:sz w:val="26"/><w:szCs w:val="26"/></w:rPr><w:t xml:space="preserve"> </w:t></w:r><w:r><w:rPr><w:b/><w:bCs/><w:spacing w:val="3"/><w:sz w:val="26"/><w:szCs w:val="26"/><w:shd w:val="clear" w:color="auto" w:fill="FFFFFF"/></w:rPr><w:t>….</w:t></w:r></w:p><w:sectPr><w:headerReference r:id="rId3" w:type="default"/><w:footerReference r:id="rId4" w:type="default"/><w:pgSz w:w="12240" w:h="15840"/><w:pgMar w:top="750" w:right="960" w:bottom="1440" w:left="1440" w:header="720" w:footer="720" w:gutter="0"/><w:cols w:space="720" w:num="1"/><w:docGrid w:linePitch="360" w:charSpace="0"/></w:sectPr></w:body></w:document>
+<file path=word/document.xml><?xml version="1.0" encoding="utf-8"?>
+<w:document xmlns:wpc="http://schemas.microsoft.com/office/word/2010/wordprocessingCanvas" xmlns:mc="http://schemas.openxmlformats.org/markup-compatibility/2006" xmlns:o="urn:schemas-microsoft-com:office:office" xmlns:r="http://schemas.openxmlformats.org/officeDocument/2006/relationships" xmlns:m="http://schemas.openxmlformats.org/officeDocument/2006/math" xmlns:v="urn:schemas-microsoft-com:vml" xmlns:wp14="http://schemas.microsoft.com/office/word/2010/wordprocessingDrawing" xmlns:wp="http://schemas.openxmlformats.org/drawingml/2006/wordprocessingDrawing" xmlns:w="http://schemas.openxmlformats.org/wordprocessingml/2006/main" xmlns:w14="http://schemas.microsoft.com/office/word/2010/wordml" xmlns:w10="urn:schemas-microsoft-com:office:word" xmlns:w15="http://schemas.microsoft.com/office/word/2012/wordml" xmlns:wpg="http://schemas.microsoft.com/office/word/2010/wordprocessingGroup" xmlns:wpi="http://schemas.microsoft.com/office/word/2010/wordprocessingInk" xmlns:wne="http://schemas.microsoft.com/office/word/2006/wordml" xmlns:wps="http://schemas.microsoft.com/office/word/2010/wordprocessingShape" xmlns:wpsCustomData="http://www.wps.cn/officeDocument/2013/wpsCustomData" mc:Ignorable="w14 w15 wp14">
+  <w:body>
+    <w:p>
+      <w:pPr>
+        <w:spacing w:before="120" w:after="120"/>
+        <w:jc w:val="center"/>
+        <w:rPr>
+          <w:b/>
+        </w:rPr>
+      </w:pPr>
+      <w:r>
+        <w:rPr>
+          <w:b/>
+        </w:rPr>
+        <w:t xml:space="preserve"> Cộng Hòa Xã Hội Chủ Nghĩa Việt Nam</w:t>
+      </w:r>
+    </w:p>
+    <w:p>
+      <w:pPr>
+        <w:spacing w:before="120" w:after="120"/>
+        <w:jc w:val="center"/>
+        <w:rPr>
+          <w:b/>
+        </w:rPr>
+      </w:pPr>
+      <w:r>
+        <w:rPr>
+          <w:b/>
+        </w:rPr>
+        <w:t>Độc Lập – Tự Do – Hạnh Phúc</w:t>
+      </w:r>
+    </w:p>
+    <w:p>
+      <w:pPr>
+        <w:spacing w:before="120" w:after="120"/>
+        <w:jc w:val="center"/>
+        <w:rPr>
+          <w:b/>
+        </w:rPr>
+      </w:pPr>
+      <w:r>
+        <w:rPr>
+          <w:b/>
+        </w:rPr>
+        <w:t>----------------</w:t>
+      </w:r>
+    </w:p>
+    <w:p>
+      <w:pPr>
+        <w:spacing w:before="120" w:after="120"/>
+        <w:jc w:val="center"/>
+        <w:rPr>
+          <w:b/>
+          <w:sz w:val="36"/>
+          <w:szCs w:val="36"/>
+        </w:rPr>
+      </w:pPr>
+      <w:r>
+        <w:rPr>
+          <w:b/>
+          <w:sz w:val="36"/>
+          <w:szCs w:val="36"/>
+        </w:rPr>
+        <w:t>BIÊN BẢN NGHIỆM THU VÀ QUYẾT TOÁN DỊCH VỤ</w:t>
+      </w:r>
+    </w:p>
+    <w:p>
+      <w:pPr>
+        <w:jc w:val="center"/>
+      </w:pPr>
+      <w:r>
+        <w:rPr>
+          <w:b/>
+          <w:bCs/>
+          <w:lang w:eastAsia="zh-CN"/>
+        </w:rPr>
+        <w:t>BBNT&amp;QTDV số: …</w:t>
+      </w:r>
+      <w:r>
+        <w:rPr>
+          <w:b/>
+          <w:bCs/>
+        </w:rPr>
+        <w:t>/CTY - HHKH/2026/NT-QT</w:t>
+      </w:r>
+    </w:p>
+    <w:p>
+      <w:pPr>
+        <w:spacing w:line="276" w:lineRule="auto"/>
+        <w:ind w:firstLine="10"/>
+        <w:jc w:val="center"/>
+      </w:pPr>
+    </w:p>
+    <w:p>
+      <w:pPr>
+        <w:spacing w:line="360" w:lineRule="auto"/>
+        <w:jc w:val="both"/>
+        <w:rPr>
+          <w:i/>
+          <w:iCs/>
+          <w:sz w:val="26"/>
+          <w:szCs w:val="26"/>
+        </w:rPr>
+      </w:pPr>
+      <w:r>
+        <w:rPr>
+          <w:i/>
+          <w:iCs/>
+          <w:sz w:val="26"/>
+          <w:szCs w:val="26"/>
+        </w:rPr>
+        <w:t>Căn cứ Hợp đồng số</w:t>
+      </w:r>
+      <w:r>
+        <w:rPr>
+          <w:b/>
+          <w:bCs/>
+          <w:i/>
+          <w:iCs/>
+          <w:sz w:val="26"/>
+          <w:szCs w:val="26"/>
+        </w:rPr>
+        <w:t xml:space="preserve"> ……</w:t>
+      </w:r>
+      <w:r>
+        <w:rPr>
+          <w:i/>
+          <w:iCs/>
+          <w:sz w:val="26"/>
+          <w:szCs w:val="26"/>
+        </w:rPr>
+        <w:t>, ký ngày …. giữa Bên A và Bên B về việc cung cấp địa điểm và các dịch vụ phục vụ chương trình….., được tổ chức vào ngày ….. ;</w:t>
+      </w:r>
+    </w:p>
+    <w:p>
+      <w:pPr>
+        <w:spacing w:line="360" w:lineRule="auto"/>
+        <w:rPr>
+          <w:i/>
+          <w:sz w:val="26"/>
+          <w:szCs w:val="26"/>
+        </w:rPr>
+      </w:pPr>
+      <w:r>
+        <w:rPr>
+          <w:i/>
+          <w:sz w:val="26"/>
+          <w:szCs w:val="26"/>
+        </w:rPr>
+        <w:t>Căn cứ kết quả thực tế việc cung cấp và sử dụng dịch vụ của các Bên.</w:t>
+      </w:r>
+    </w:p>
+    <w:p>
+      <w:pPr>
+        <w:autoSpaceDE w:val="0"/>
+        <w:autoSpaceDN w:val="0"/>
+        <w:adjustRightInd w:val="0"/>
+        <w:spacing w:line="360" w:lineRule="auto"/>
+        <w:jc w:val="both"/>
+        <w:rPr>
+          <w:bCs/>
+          <w:i/>
+          <w:iCs/>
+          <w:sz w:val="26"/>
+          <w:szCs w:val="26"/>
+        </w:rPr>
+      </w:pPr>
+    </w:p>
+    <w:p>
+      <w:pPr>
+        <w:autoSpaceDE w:val="0"/>
+        <w:autoSpaceDN w:val="0"/>
+        <w:adjustRightInd w:val="0"/>
+        <w:spacing w:line="360" w:lineRule="auto"/>
+        <w:jc w:val="both"/>
+        <w:rPr>
+          <w:i/>
+          <w:sz w:val="26"/>
+          <w:szCs w:val="26"/>
+        </w:rPr>
+      </w:pPr>
+      <w:r>
+        <w:rPr>
+          <w:bCs/>
+          <w:i/>
+          <w:iCs/>
+          <w:sz w:val="26"/>
+          <w:szCs w:val="26"/>
+        </w:rPr>
+        <w:t xml:space="preserve">Hôm nay, ngày </w:t>
+      </w:r>
+      <w:r>
+        <w:rPr>
+          <w:b/>
+          <w:i/>
+          <w:iCs/>
+          <w:sz w:val="26"/>
+          <w:szCs w:val="26"/>
+        </w:rPr>
+        <w:t>…</w:t>
+      </w:r>
+      <w:r>
+        <w:rPr>
+          <w:bCs/>
+          <w:i/>
+          <w:iCs/>
+          <w:sz w:val="26"/>
+          <w:szCs w:val="26"/>
+        </w:rPr>
+        <w:t xml:space="preserve"> Tháng </w:t>
+      </w:r>
+      <w:r>
+        <w:rPr>
+          <w:b/>
+          <w:i/>
+          <w:iCs/>
+          <w:sz w:val="26"/>
+          <w:szCs w:val="26"/>
+        </w:rPr>
+        <w:t>…</w:t>
+      </w:r>
+      <w:r>
+        <w:rPr>
+          <w:bCs/>
+          <w:i/>
+          <w:iCs/>
+          <w:sz w:val="26"/>
+          <w:szCs w:val="26"/>
+        </w:rPr>
+        <w:t xml:space="preserve"> năm </w:t>
+      </w:r>
+      <w:r>
+        <w:rPr>
+          <w:b/>
+          <w:i/>
+          <w:iCs/>
+          <w:sz w:val="26"/>
+          <w:szCs w:val="26"/>
+        </w:rPr>
+        <w:t>2026</w:t>
+      </w:r>
+      <w:r>
+        <w:rPr>
+          <w:bCs/>
+          <w:i/>
+          <w:iCs/>
+          <w:sz w:val="26"/>
+          <w:szCs w:val="26"/>
+        </w:rPr>
+        <w:t xml:space="preserve">, chúng tôi gồm: </w:t>
+      </w:r>
+    </w:p>
+    <w:p>
+      <w:pPr>
+        <w:shd w:val="clear" w:color="auto" w:fill="FFFFFF" w:themeFill="background1"/>
+        <w:spacing w:line="360" w:lineRule="auto"/>
+        <w:ind w:left="59" w:leftChars="0"/>
+        <w:rPr>
+          <w:rFonts w:hint="default" w:ascii="Times New Roman" w:hAnsi="Times New Roman"/>
+          <w:b/>
+          <w:sz w:val="26"/>
+          <w:szCs w:val="26"/>
+          <w:lang w:val="en-US"/>
+        </w:rPr>
+      </w:pPr>
+      <w:r>
+        <w:rPr>
+          <w:rFonts w:ascii="Times New Roman" w:hAnsi="Times New Roman"/>
+          <w:b/>
+          <w:sz w:val="26"/>
+          <w:szCs w:val="26"/>
+        </w:rPr>
+        <w:t xml:space="preserve">BÊN A: </w:t>
+      </w:r>
+      <w:r>
+        <w:rPr>
+          <w:rFonts w:ascii="Times New Roman" w:hAnsi="Times New Roman"/>
+          <w:b/>
+          <w:sz w:val="26"/>
+          <w:szCs w:val="26"/>
+        </w:rPr>
+        <w:tab/>
+      </w:r>
+      <w:r>
+        <w:rPr>
+          <w:rFonts w:ascii="Times New Roman" w:hAnsi="Times New Roman"/>
+          <w:b/>
+          <w:sz w:val="26"/>
+          <w:szCs w:val="26"/>
+        </w:rPr>
+        <w:tab/>
+      </w:r>
+      <w:r>
+        <w:rPr>
+          <w:rFonts w:hint="default" w:ascii="Times New Roman" w:hAnsi="Times New Roman"/>
+          <w:b/>
+          <w:sz w:val="26"/>
+          <w:szCs w:val="26"/>
+          <w:lang w:val="en-US"/>
+        </w:rPr>
+        <w:t>{BenATenCongTy}</w:t>
+      </w:r>
+    </w:p>
+    <w:p>
+      <w:pPr>
+        <w:shd w:val="clear" w:color="auto" w:fill="FFFFFF" w:themeFill="background1"/>
+        <w:spacing w:line="360" w:lineRule="auto"/>
+        <w:ind w:left="59" w:leftChars="0"/>
+        <w:rPr>
+          <w:rFonts w:hint="default" w:ascii="Times New Roman" w:hAnsi="Times New Roman"/>
+          <w:b/>
+          <w:sz w:val="26"/>
+          <w:szCs w:val="26"/>
+          <w:lang w:val="en-US"/>
+        </w:rPr>
+      </w:pPr>
+      <w:bookmarkStart w:id="0" w:name="_Hlk135660413"/>
+      <w:r>
+        <w:rPr>
+          <w:rFonts w:ascii="Times New Roman" w:hAnsi="Times New Roman"/>
+          <w:sz w:val="26"/>
+          <w:szCs w:val="26"/>
+        </w:rPr>
+        <w:t>Đại diện: </w:t>
+        <w:t>{BenADaiDien}</w:t>
+      </w:r>
+    </w:p>
+    <w:p>
+      <w:pPr>
+        <w:shd w:val="clear" w:color="auto" w:fill="FFFFFF" w:themeFill="background1"/>
+        <w:spacing w:line="360" w:lineRule="auto"/>
+        <w:ind w:left="59" w:leftChars="0"/>
+        <w:rPr>
+          <w:rFonts w:hint="default" w:ascii="Times New Roman" w:hAnsi="Times New Roman"/>
+          <w:sz w:val="26"/>
+          <w:szCs w:val="26"/>
+          <w:lang w:val="en-US"/>
+        </w:rPr>
+      </w:pPr>
+      <w:bookmarkStart w:id="1" w:name="_Hlk164419968"/>
+      <w:r>
+        <w:rPr>
+          <w:rFonts w:ascii="Times New Roman" w:hAnsi="Times New Roman"/>
+          <w:bCs/>
+          <w:sz w:val="26"/>
+          <w:szCs w:val="26"/>
+        </w:rPr>
+        <w:t>Chức vụ: </w:t>
+        <w:t>{BenAChucVuDaiDien}</w:t>
+      </w:r>
+    </w:p>
+    <w:bookmarkEnd w:id="0"/>
+    <w:bookmarkEnd w:id="1"/>
+    <w:p>
+      <w:pPr>
+        <w:shd w:val="clear" w:color="auto" w:fill="FFFFFF" w:themeFill="background1"/>
+        <w:spacing w:line="360" w:lineRule="auto"/>
+        <w:ind w:left="59" w:leftChars="0"/>
+        <w:rPr>
+          <w:rFonts w:hint="default" w:ascii="Times New Roman" w:hAnsi="Times New Roman"/>
+          <w:sz w:val="26"/>
+          <w:szCs w:val="26"/>
+          <w:lang w:val="en-US"/>
+        </w:rPr>
+      </w:pPr>
+      <w:r>
+        <w:rPr>
+          <w:rFonts w:ascii="Times New Roman" w:hAnsi="Times New Roman"/>
+          <w:sz w:val="26"/>
+          <w:szCs w:val="26"/>
+        </w:rPr>
+        <w:t>Địa chỉ: </w:t>
+        <w:t>{BenADiaChi}</w:t>
+      </w:r>
+    </w:p>
+    <w:p>
+      <w:pPr>
+        <w:shd w:val="clear" w:color="auto" w:fill="FFFFFF" w:themeFill="background1"/>
+        <w:spacing w:line="360" w:lineRule="auto"/>
+        <w:ind w:left="59" w:leftChars="0"/>
+        <w:rPr>
+          <w:rFonts w:hint="default" w:ascii="Times New Roman" w:hAnsi="Times New Roman"/>
+          <w:sz w:val="26"/>
+          <w:szCs w:val="26"/>
+          <w:lang w:val="en-US"/>
+        </w:rPr>
+      </w:pPr>
+      <w:r>
+        <w:rPr>
+          <w:rFonts w:ascii="Times New Roman" w:hAnsi="Times New Roman"/>
+          <w:sz w:val="26"/>
+          <w:szCs w:val="26"/>
+        </w:rPr>
+        <w:t>Điện thoại: </w:t>
+        <w:t>{BenASDT}</w:t>
+      </w:r>
+    </w:p>
+    <w:p>
+      <w:pPr>
+        <w:shd w:val="clear" w:color="auto" w:fill="FFFFFF" w:themeFill="background1"/>
+        <w:spacing w:line="360" w:lineRule="auto"/>
+        <w:ind w:left="59" w:leftChars="0"/>
+        <w:rPr>
+          <w:rFonts w:hint="default" w:ascii="Times New Roman" w:hAnsi="Times New Roman"/>
+          <w:sz w:val="26"/>
+          <w:szCs w:val="26"/>
+          <w:lang w:val="en-US"/>
+        </w:rPr>
+      </w:pPr>
+      <w:r>
+        <w:rPr>
+          <w:rFonts w:ascii="Times New Roman" w:hAnsi="Times New Roman"/>
+          <w:sz w:val="26"/>
+          <w:szCs w:val="26"/>
+        </w:rPr>
+        <w:t xml:space="preserve">MST </w:t>
+      </w:r>
+      <w:r>
+        <w:rPr>
+          <w:rFonts w:ascii="Times New Roman" w:hAnsi="Times New Roman"/>
+          <w:sz w:val="26"/>
+          <w:szCs w:val="26"/>
+        </w:rPr>
+        <w:tab/>
+      </w:r>
+      <w:r>
+        <w:rPr>
+          <w:rFonts w:ascii="Times New Roman" w:hAnsi="Times New Roman"/>
+          <w:sz w:val="26"/>
+          <w:szCs w:val="26"/>
+        </w:rPr>
+        <w:tab/>
+      </w:r>
+      <w:r>
+        <w:rPr>
+          <w:rFonts w:hint="default" w:ascii="Times New Roman" w:hAnsi="Times New Roman"/>
+          <w:sz w:val="26"/>
+          <w:szCs w:val="26"/>
+          <w:lang w:val="en-US"/>
+        </w:rPr>
+        <w:t>{BenAMST}</w:t>
+      </w:r>
+    </w:p>
+    <w:p>
+      <w:pPr>
+        <w:spacing w:before="120" w:after="120" w:line="360" w:lineRule="auto"/>
+        <w:jc w:val="both"/>
+        <w:rPr>
+          <w:bCs/>
+          <w:sz w:val="26"/>
+          <w:szCs w:val="26"/>
+        </w:rPr>
+      </w:pPr>
+      <w:r>
+        <w:rPr>
+          <w:sz w:val="26"/>
+          <w:szCs w:val="26"/>
+        </w:rPr>
+        <w:t>Số Tài Khoản</w:t>
+      </w:r>
+      <w:r>
+        <w:rPr>
+          <w:sz w:val="26"/>
+          <w:szCs w:val="26"/>
+        </w:rPr>
+        <w:tab/>
+      </w:r>
+      <w:bookmarkStart w:id="2" w:name="_Hlk205370871"/>
+      <w:r>
+        <w:rPr>
+          <w:sz w:val="26"/>
+          <w:szCs w:val="26"/>
+          <w:shd w:val="clear" w:color="auto" w:fill="FFFFFF"/>
+        </w:rPr>
+        <w:t xml:space="preserve">1114 0141 8888 </w:t>
+      </w:r>
+      <w:r>
+        <w:rPr>
+          <w:bCs/>
+          <w:sz w:val="26"/>
+          <w:szCs w:val="26"/>
+          <w:lang w:val="vi-VN"/>
+        </w:rPr>
+        <w:t>(VND)</w:t>
+      </w:r>
+      <w:bookmarkEnd w:id="2"/>
+    </w:p>
+    <w:p>
+      <w:pPr>
+        <w:pStyle w:val="21"/>
+        <w:spacing w:line="360" w:lineRule="auto"/>
+        <w:ind w:left="0"/>
+        <w:jc w:val="both"/>
+        <w:rPr>
+          <w:sz w:val="26"/>
+          <w:szCs w:val="26"/>
+          <w:shd w:val="clear" w:color="auto" w:fill="FFFFFF"/>
+        </w:rPr>
+      </w:pPr>
+      <w:r>
+        <w:rPr>
+          <w:bCs/>
+          <w:sz w:val="26"/>
+          <w:szCs w:val="26"/>
+        </w:rPr>
+        <w:t>Tại ngân Hàng</w:t>
+      </w:r>
+      <w:r>
+        <w:rPr>
+          <w:bCs/>
+          <w:sz w:val="26"/>
+          <w:szCs w:val="26"/>
+        </w:rPr>
+        <w:tab/>
+      </w:r>
+      <w:bookmarkStart w:id="3" w:name="_Hlk205370882"/>
+      <w:r>
+        <w:rPr>
+          <w:sz w:val="26"/>
+          <w:szCs w:val="26"/>
+          <w:shd w:val="clear" w:color="auto" w:fill="FFFFFF"/>
+        </w:rPr>
+        <w:t>Việt Nam Thịnh Vượng (VP Bank) – Chi nhánh Hồ Chí Minh</w:t>
+      </w:r>
+      <w:bookmarkEnd w:id="3"/>
+    </w:p>
+    <w:p>
+      <w:pPr>
+        <w:overflowPunct w:val="0"/>
+        <w:autoSpaceDE w:val="0"/>
+        <w:autoSpaceDN w:val="0"/>
+        <w:adjustRightInd w:val="0"/>
+        <w:spacing w:before="120" w:after="120" w:line="360" w:lineRule="auto"/>
+        <w:ind w:left="1530" w:hanging="1530"/>
+        <w:jc w:val="both"/>
+        <w:rPr>
+          <w:b/>
+          <w:caps/>
+          <w:sz w:val="26"/>
+          <w:szCs w:val="26"/>
+        </w:rPr>
+      </w:pPr>
+      <w:r>
+        <w:rPr>
+          <w:sz w:val="26"/>
+          <w:szCs w:val="26"/>
+        </w:rPr>
+        <w:t>Và</w:t>
+      </w:r>
+    </w:p>
+    <w:p>
+      <w:pPr>
+        <w:shd w:val="clear" w:color="auto" w:fill="FFFFFF" w:themeFill="background1"/>
+        <w:spacing w:line="360" w:lineRule="auto"/>
+        <w:ind w:left="59" w:leftChars="0"/>
+        <w:rPr>
+          <w:rFonts w:ascii="Times New Roman" w:hAnsi="Times New Roman"/>
+          <w:b/>
+          <w:sz w:val="26"/>
+          <w:szCs w:val="26"/>
+        </w:rPr>
+      </w:pPr>
+      <w:r>
+        <w:rPr>
+          <w:rFonts w:ascii="Times New Roman" w:hAnsi="Times New Roman"/>
+          <w:b/>
+          <w:sz w:val="26"/>
+          <w:szCs w:val="26"/>
+        </w:rPr>
+        <w:t xml:space="preserve">BÊN B: </w:t>
+      </w:r>
+      <w:r>
+        <w:rPr>
+          <w:rFonts w:ascii="Times New Roman" w:hAnsi="Times New Roman"/>
+          <w:b/>
+          <w:sz w:val="26"/>
+          <w:szCs w:val="26"/>
+        </w:rPr>
+        <w:tab/>
+      </w:r>
+      <w:r>
+        <w:rPr>
+          <w:rFonts w:hint="default" w:ascii="Times New Roman" w:hAnsi="Times New Roman"/>
+          <w:b/>
+          <w:sz w:val="26"/>
+          <w:szCs w:val="26"/>
+          <w:lang w:val="en-US"/>
+        </w:rPr>
+        <w:t xml:space="preserve"> </w:t>
+      </w:r>
+      <w:r>
+        <w:rPr>
+          <w:rFonts w:hint="default" w:ascii="Times New Roman" w:hAnsi="Times New Roman"/>
+          <w:b w:val="0"/>
+          <w:bCs/>
+          <w:sz w:val="26"/>
+          <w:szCs w:val="26"/>
+        </w:rPr>
+        <w:t>{BenBTenDaiDien}</w:t>
+      </w:r>
+      <w:r>
+        <w:rPr>
+          <w:rFonts w:ascii="Times New Roman" w:hAnsi="Times New Roman"/>
+          <w:b/>
+          <w:sz w:val="26"/>
+          <w:szCs w:val="26"/>
+        </w:rPr>
+        <w:tab/>
+      </w:r>
+    </w:p>
+    <w:p>
+      <w:pPr>
+        <w:shd w:val="clear" w:color="auto" w:fill="FFFFFF" w:themeFill="background1"/>
+        <w:spacing w:line="360" w:lineRule="auto"/>
+        <w:ind w:left="59" w:leftChars="0"/>
+        <w:rPr>
+          <w:rFonts w:hint="default" w:ascii="Times New Roman" w:hAnsi="Times New Roman"/>
+          <w:b/>
+          <w:sz w:val="26"/>
+          <w:szCs w:val="26"/>
+          <w:lang w:val="en-US"/>
+        </w:rPr>
+      </w:pPr>
+      <w:r>
+        <w:rPr>
+          <w:rFonts w:ascii="Times New Roman" w:hAnsi="Times New Roman"/>
+          <w:sz w:val="26"/>
+          <w:szCs w:val="26"/>
+        </w:rPr>
+        <w:t>Đại Diện</w:t>
+      </w:r>
+      <w:r>
+        <w:rPr>
+          <w:rFonts w:ascii="Times New Roman" w:hAnsi="Times New Roman"/>
+          <w:b/>
+          <w:sz w:val="26"/>
+          <w:szCs w:val="26"/>
+        </w:rPr>
+        <w:tab/>
+      </w:r>
+      <w:r>
+        <w:rPr>
+          <w:rFonts w:hint="default" w:ascii="Times New Roman" w:hAnsi="Times New Roman"/>
+          <w:b/>
+          <w:sz w:val="26"/>
+          <w:szCs w:val="26"/>
+          <w:lang w:val="en-US"/>
+        </w:rPr>
+        <w:t xml:space="preserve"> </w:t>
+      </w:r>
+      <w:r>
+        <w:rPr>
+          <w:rFonts w:ascii="Times New Roman" w:hAnsi="Times New Roman"/>
+          <w:b w:val="0"/>
+          <w:bCs/>
+          <w:sz w:val="26"/>
+          <w:szCs w:val="26"/>
+        </w:rPr>
+        <w:t>Ông</w:t>
+      </w:r>
+      <w:r>
+        <w:rPr>
+          <w:rFonts w:hint="default" w:ascii="Times New Roman" w:hAnsi="Times New Roman"/>
+          <w:b w:val="0"/>
+          <w:bCs/>
+          <w:sz w:val="26"/>
+          <w:szCs w:val="26"/>
+          <w:lang w:val="en-US"/>
+        </w:rPr>
+        <w:t>/Bà {BenBTenDaiDien}</w:t>
+      </w:r>
+    </w:p>
+    <w:p>
+      <w:pPr>
+        <w:shd w:val="clear" w:color="auto" w:fill="FFFFFF" w:themeFill="background1"/>
+        <w:spacing w:line="360" w:lineRule="auto"/>
+        <w:ind w:left="59" w:leftChars="0"/>
+        <w:rPr>
+          <w:rFonts w:ascii="Times New Roman" w:hAnsi="Times New Roman"/>
+          <w:sz w:val="26"/>
+          <w:szCs w:val="26"/>
+        </w:rPr>
+      </w:pPr>
+      <w:r>
+        <w:rPr>
+          <w:rFonts w:ascii="Times New Roman" w:hAnsi="Times New Roman"/>
+          <w:bCs/>
+          <w:sz w:val="26"/>
+          <w:szCs w:val="26"/>
+        </w:rPr>
+        <w:t>Chức Vụ</w:t>
+      </w:r>
+      <w:r>
+        <w:rPr>
+          <w:rFonts w:ascii="Times New Roman" w:hAnsi="Times New Roman"/>
+          <w:sz w:val="26"/>
+          <w:szCs w:val="26"/>
+        </w:rPr>
+        <w:tab/>
+      </w:r>
+      <w:r>
+        <w:rPr>
+          <w:rFonts w:hint="default" w:ascii="Times New Roman" w:hAnsi="Times New Roman"/>
+          <w:sz w:val="26"/>
+          <w:szCs w:val="26"/>
+          <w:lang w:val="en-US"/>
+        </w:rPr>
+        <w:t xml:space="preserve"> </w:t>
+      </w:r>
+      <w:r>
+        <w:rPr>
+          <w:rFonts w:hint="default" w:ascii="Times New Roman" w:hAnsi="Times New Roman"/>
+          <w:sz w:val="26"/>
+          <w:szCs w:val="26"/>
+        </w:rPr>
+        <w:t>{BenBChucVu}</w:t>
+      </w:r>
+      <w:r>
+        <w:rPr>
+          <w:rFonts w:ascii="Times New Roman" w:hAnsi="Times New Roman"/>
+          <w:sz w:val="26"/>
+          <w:szCs w:val="26"/>
+        </w:rPr>
+        <w:tab/>
+      </w:r>
+    </w:p>
+    <w:p>
+      <w:pPr>
+        <w:shd w:val="clear" w:color="auto" w:fill="FFFFFF" w:themeFill="background1"/>
+        <w:spacing w:line="360" w:lineRule="auto"/>
+        <w:ind w:left="59" w:leftChars="0"/>
+        <w:rPr>
+          <w:rFonts w:ascii="Times New Roman" w:hAnsi="Times New Roman"/>
+          <w:sz w:val="26"/>
+          <w:szCs w:val="26"/>
+        </w:rPr>
+      </w:pPr>
+      <w:r>
+        <w:rPr>
+          <w:rFonts w:ascii="Times New Roman" w:hAnsi="Times New Roman"/>
+          <w:sz w:val="26"/>
+          <w:szCs w:val="26"/>
+        </w:rPr>
+        <w:t>Địa Chỉ</w:t>
+      </w:r>
+      <w:r>
+        <w:rPr>
+          <w:rFonts w:ascii="Times New Roman" w:hAnsi="Times New Roman"/>
+          <w:sz w:val="26"/>
+          <w:szCs w:val="26"/>
+        </w:rPr>
+        <w:tab/>
+      </w:r>
+      <w:r>
+        <w:rPr>
+          <w:rFonts w:hint="default" w:ascii="Times New Roman" w:hAnsi="Times New Roman"/>
+          <w:sz w:val="26"/>
+          <w:szCs w:val="26"/>
+          <w:lang w:val="en-US"/>
+        </w:rPr>
+        <w:t xml:space="preserve"> </w:t>
+      </w:r>
+      <w:r>
+        <w:rPr>
+          <w:rFonts w:hint="default" w:ascii="Times New Roman" w:hAnsi="Times New Roman"/>
+          <w:sz w:val="26"/>
+          <w:szCs w:val="26"/>
+        </w:rPr>
+        <w:t>{BenBDiaChi}</w:t>
+      </w:r>
+      <w:r>
+        <w:rPr>
+          <w:rFonts w:ascii="Times New Roman" w:hAnsi="Times New Roman"/>
+          <w:sz w:val="26"/>
+          <w:szCs w:val="26"/>
+        </w:rPr>
+        <w:tab/>
+      </w:r>
+    </w:p>
+    <w:p>
+      <w:pPr>
+        <w:shd w:val="clear" w:color="auto" w:fill="FFFFFF" w:themeFill="background1"/>
+        <w:spacing w:line="360" w:lineRule="auto"/>
+        <w:ind w:left="59" w:leftChars="0"/>
+        <w:rPr>
+          <w:rFonts w:ascii="Times New Roman" w:hAnsi="Times New Roman"/>
+          <w:sz w:val="26"/>
+          <w:szCs w:val="26"/>
+        </w:rPr>
+      </w:pPr>
+      <w:r>
+        <w:rPr>
+          <w:rFonts w:ascii="Times New Roman" w:hAnsi="Times New Roman"/>
+          <w:sz w:val="26"/>
+          <w:szCs w:val="26"/>
+        </w:rPr>
+        <w:t>Điện thoại</w:t>
+      </w:r>
+      <w:r>
+        <w:rPr>
+          <w:rFonts w:ascii="Times New Roman" w:hAnsi="Times New Roman"/>
+          <w:sz w:val="26"/>
+          <w:szCs w:val="26"/>
+        </w:rPr>
+        <w:tab/>
+      </w:r>
+      <w:r>
+        <w:rPr>
+          <w:rFonts w:hint="default" w:ascii="Times New Roman" w:hAnsi="Times New Roman"/>
+          <w:sz w:val="26"/>
+          <w:szCs w:val="26"/>
+          <w:lang w:val="en-US"/>
+        </w:rPr>
+        <w:t xml:space="preserve"> {BenBDienThoai}</w:t>
+      </w:r>
+      <w:r>
+        <w:rPr>
+          <w:rFonts w:ascii="Times New Roman" w:hAnsi="Times New Roman"/>
+          <w:sz w:val="26"/>
+          <w:szCs w:val="26"/>
+        </w:rPr>
+        <w:tab/>
+      </w:r>
+    </w:p>
+    <w:p>
+      <w:pPr>
+        <w:shd w:val="clear" w:color="auto" w:fill="FFFFFF" w:themeFill="background1"/>
+        <w:spacing w:line="360" w:lineRule="auto"/>
+        <w:ind w:left="59" w:leftChars="0"/>
+        <w:rPr>
+          <w:rFonts w:hint="default" w:ascii="Times New Roman" w:hAnsi="Times New Roman"/>
+          <w:sz w:val="26"/>
+          <w:szCs w:val="26"/>
+          <w:lang w:val="en-US"/>
+        </w:rPr>
+      </w:pPr>
+      <w:r>
+        <w:rPr>
+          <w:rFonts w:ascii="Times New Roman" w:hAnsi="Times New Roman"/>
+          <w:sz w:val="26"/>
+          <w:szCs w:val="26"/>
+        </w:rPr>
+        <w:t xml:space="preserve">MST </w:t>
+      </w:r>
+      <w:r>
+        <w:rPr>
+          <w:rFonts w:hint="default" w:ascii="Times New Roman" w:hAnsi="Times New Roman"/>
+          <w:sz w:val="26"/>
+          <w:szCs w:val="26"/>
+          <w:lang w:val="en-US"/>
+        </w:rPr>
+        <w:t xml:space="preserve">         {BenBCCCD}</w:t>
+      </w:r>
+    </w:p>
+    <w:p>
+      <w:pPr>
+        <w:spacing w:line="360" w:lineRule="auto"/>
+        <w:ind w:firstLine="360"/>
+        <w:jc w:val="both"/>
+        <w:rPr>
+          <w:b/>
+          <w:sz w:val="26"/>
+          <w:szCs w:val="26"/>
+        </w:rPr>
+      </w:pPr>
+      <w:r>
+        <w:rPr>
+          <w:sz w:val="26"/>
+          <w:szCs w:val="26"/>
+        </w:rPr>
+        <w:t>Sau khi cùng kiểm tra, đối chiếu và đánh giá kết quả thực hiện dịch vụ theo Hợp đồng nêu trên, hai Bên thống nhất xác nhận việc nghiệm thu và quyết toán dịch vụ với các nội dung sau:</w:t>
+      </w:r>
+    </w:p>
+    <w:p>
+      <w:pPr>
+        <w:pStyle w:val="21"/>
+        <w:numPr>
+          <w:ilvl w:val="0"/>
+          <w:numId w:val="1"/>
+        </w:numPr>
+        <w:tabs>
+          <w:tab w:val="left" w:pos="180"/>
+          <w:tab w:val="left" w:pos="630"/>
+        </w:tabs>
+        <w:spacing w:before="120" w:after="120" w:line="360" w:lineRule="auto"/>
+        <w:jc w:val="both"/>
+        <w:rPr>
+          <w:b/>
+          <w:sz w:val="26"/>
+          <w:szCs w:val="26"/>
+        </w:rPr>
+      </w:pPr>
+      <w:r>
+        <w:rPr>
+          <w:b/>
+          <w:sz w:val="26"/>
+          <w:szCs w:val="26"/>
+        </w:rPr>
+        <w:t>NGHIỆM THU VÀ QUYẾT TOÁN DỊCH VỤ</w:t>
+      </w:r>
+    </w:p>
+    <w:p>
+      <w:pPr>
+        <w:tabs>
+          <w:tab w:val="left" w:pos="180"/>
+          <w:tab w:val="left" w:pos="630"/>
+        </w:tabs>
+        <w:spacing w:before="120" w:after="120" w:line="360" w:lineRule="auto"/>
+        <w:jc w:val="both"/>
+        <w:rPr>
+          <w:bCs/>
+          <w:sz w:val="26"/>
+          <w:szCs w:val="26"/>
+        </w:rPr>
+      </w:pPr>
+      <w:r>
+        <w:rPr>
+          <w:bCs/>
+          <w:sz w:val="26"/>
+          <w:szCs w:val="26"/>
+        </w:rPr>
+        <w:tab/>
+      </w:r>
+      <w:r>
+        <w:rPr>
+          <w:bCs/>
+          <w:sz w:val="26"/>
+          <w:szCs w:val="26"/>
+        </w:rPr>
+        <w:t>Hai Bên thống nhất xác nhận Bên A đã hoàn thành việc cung cấp dịch vụ theo Hợp đồng và các nội dung phát sinh được hai Bên xác nhận (nếu có).</w:t>
+      </w:r>
+    </w:p>
+    <w:p>
+      <w:pPr>
+        <w:tabs>
+          <w:tab w:val="left" w:pos="180"/>
+          <w:tab w:val="left" w:pos="630"/>
+        </w:tabs>
+        <w:spacing w:before="120" w:after="120" w:line="360" w:lineRule="auto"/>
+        <w:jc w:val="both"/>
+        <w:rPr>
+          <w:bCs/>
+          <w:sz w:val="26"/>
+          <w:szCs w:val="26"/>
+        </w:rPr>
+      </w:pPr>
+      <w:r>
+        <w:rPr>
+          <w:bCs/>
+          <w:sz w:val="26"/>
+          <w:szCs w:val="26"/>
+        </w:rPr>
+        <w:tab/>
+      </w:r>
+      <w:r>
+        <w:rPr>
+          <w:bCs/>
+          <w:sz w:val="26"/>
+          <w:szCs w:val="26"/>
+        </w:rPr>
+        <w:t>Chi tiết giá trị quyết toán như sau:</w:t>
+      </w:r>
+    </w:p>
+    <w:tbl>
+      <w:tblPr>
+        <w:tblStyle w:val="3"/>
+        <w:tblpPr w:leftFromText="180" w:rightFromText="180" w:vertAnchor="text" w:horzAnchor="page" w:tblpX="1093" w:tblpY="571"/>
+        <w:tblOverlap w:val="never"/>
+        <w:tblW w:w="10939" w:type="dxa"/>
+        <w:tblInd w:w="0" w:type="dxa"/>
+        <w:tblLayout w:type="fixed"/>
+        <w:tblCellMar>
+          <w:top w:w="0" w:type="dxa"/>
+          <w:left w:w="108" w:type="dxa"/>
+          <w:bottom w:w="0" w:type="dxa"/>
+          <w:right w:w="108" w:type="dxa"/>
+        </w:tblCellMar>
+      </w:tblPr>
+      <w:tblGrid>
+        <w:gridCol w:w="751"/>
+        <w:gridCol w:w="2343"/>
+        <w:gridCol w:w="1389"/>
+        <w:gridCol w:w="1392"/>
+        <w:gridCol w:w="1128"/>
+        <w:gridCol w:w="857"/>
+        <w:gridCol w:w="1495"/>
+        <w:gridCol w:w="1584"/>
+      </w:tblGrid>
+      <w:tr>
+        <w:tblPrEx>
+          <w:tblCellMar>
+            <w:top w:w="0" w:type="dxa"/>
+            <w:left w:w="108" w:type="dxa"/>
+            <w:bottom w:w="0" w:type="dxa"/>
+            <w:right w:w="108" w:type="dxa"/>
+          </w:tblCellMar>
+        </w:tblPrEx>
+        <w:trPr>
+          <w:trHeight w:val="1044" w:hRule="atLeast"/>
+        </w:trPr>
+        <w:tc>
+          <w:tcPr>
+            <w:tcW w:w="751" w:type="dxa"/>
+            <w:tcBorders>
+              <w:top w:val="single" w:color="000000" w:sz="4" w:space="0"/>
+              <w:left w:val="single" w:color="000000" w:sz="4" w:space="0"/>
+              <w:bottom w:val="single" w:color="000000" w:sz="4" w:space="0"/>
+              <w:right w:val="single" w:color="000000" w:sz="4" w:space="0"/>
+            </w:tcBorders>
+            <w:shd w:val="clear" w:color="auto" w:fill="FFFFFF" w:themeFill="background1"/>
+            <w:vAlign w:val="center"/>
+          </w:tcPr>
+          <w:p>
+            <w:pPr>
+              <w:jc w:val="center"/>
+              <w:textAlignment w:val="center"/>
+              <w:rPr>
+                <w:b/>
+                <w:bCs/>
+                <w:sz w:val="26"/>
+                <w:szCs w:val="26"/>
+              </w:rPr>
+            </w:pPr>
+            <w:r>
+              <w:rPr>
+                <w:rFonts w:eastAsia="SimSun"/>
+                <w:b/>
+                <w:bCs/>
+                <w:sz w:val="26"/>
+                <w:szCs w:val="26"/>
+                <w:lang w:eastAsia="zh-CN" w:bidi="ar"/>
+              </w:rPr>
+              <w:t>STT</w:t>
+            </w:r>
+          </w:p>
+        </w:tc>
+        <w:tc>
+          <w:tcPr>
+            <w:tcW w:w="2343" w:type="dxa"/>
+            <w:tcBorders>
+              <w:top w:val="single" w:color="000000" w:sz="4" w:space="0"/>
+              <w:left w:val="single" w:color="000000" w:sz="4" w:space="0"/>
+              <w:bottom w:val="single" w:color="000000" w:sz="4" w:space="0"/>
+              <w:right w:val="single" w:color="000000" w:sz="4" w:space="0"/>
+            </w:tcBorders>
+            <w:shd w:val="clear" w:color="auto" w:fill="FFFFFF" w:themeFill="background1"/>
+            <w:vAlign w:val="center"/>
+          </w:tcPr>
+          <w:p>
+            <w:pPr>
+              <w:jc w:val="center"/>
+              <w:textAlignment w:val="center"/>
+              <w:rPr>
+                <w:b/>
+                <w:bCs/>
+                <w:sz w:val="26"/>
+                <w:szCs w:val="26"/>
+              </w:rPr>
+            </w:pPr>
+            <w:r>
+              <w:rPr>
+                <w:rFonts w:eastAsia="SimSun"/>
+                <w:b/>
+                <w:bCs/>
+                <w:sz w:val="26"/>
+                <w:szCs w:val="26"/>
+                <w:lang w:eastAsia="zh-CN" w:bidi="ar"/>
+              </w:rPr>
+              <w:t>NỘI DUNG DỊCH VỤ</w:t>
+            </w:r>
+          </w:p>
+        </w:tc>
+        <w:tc>
+          <w:tcPr>
+            <w:tcW w:w="1389" w:type="dxa"/>
+            <w:tcBorders>
+              <w:top w:val="single" w:color="000000" w:sz="4" w:space="0"/>
+              <w:left w:val="single" w:color="000000" w:sz="4" w:space="0"/>
+              <w:bottom w:val="single" w:color="000000" w:sz="4" w:space="0"/>
+              <w:right w:val="single" w:color="000000" w:sz="4" w:space="0"/>
+            </w:tcBorders>
+            <w:shd w:val="clear" w:color="auto" w:fill="FFFFFF" w:themeFill="background1"/>
+            <w:vAlign w:val="center"/>
+          </w:tcPr>
+          <w:p>
+            <w:pPr>
+              <w:jc w:val="center"/>
+              <w:textAlignment w:val="center"/>
+              <w:rPr>
+                <w:b/>
+                <w:bCs/>
+                <w:sz w:val="26"/>
+                <w:szCs w:val="26"/>
+              </w:rPr>
+            </w:pPr>
+            <w:r>
+              <w:rPr>
+                <w:rFonts w:eastAsia="SimSun"/>
+                <w:b/>
+                <w:bCs/>
+                <w:sz w:val="26"/>
+                <w:szCs w:val="26"/>
+                <w:lang w:eastAsia="zh-CN" w:bidi="ar"/>
+              </w:rPr>
+              <w:t>THỜI GIAN</w:t>
+            </w:r>
+          </w:p>
+        </w:tc>
+        <w:tc>
+          <w:tcPr>
+            <w:tcW w:w="1392" w:type="dxa"/>
+            <w:tcBorders>
+              <w:top w:val="single" w:color="000000" w:sz="4" w:space="0"/>
+              <w:left w:val="single" w:color="000000" w:sz="4" w:space="0"/>
+              <w:bottom w:val="single" w:color="000000" w:sz="4" w:space="0"/>
+              <w:right w:val="single" w:color="000000" w:sz="4" w:space="0"/>
+            </w:tcBorders>
+            <w:shd w:val="clear" w:color="auto" w:fill="FFFFFF" w:themeFill="background1"/>
+            <w:vAlign w:val="center"/>
+          </w:tcPr>
+          <w:p>
+            <w:pPr>
+              <w:jc w:val="center"/>
+              <w:textAlignment w:val="center"/>
+              <w:rPr>
+                <w:b/>
+                <w:bCs/>
+                <w:sz w:val="26"/>
+                <w:szCs w:val="26"/>
+              </w:rPr>
+            </w:pPr>
+            <w:r>
+              <w:rPr>
+                <w:rFonts w:eastAsia="SimSun"/>
+                <w:b/>
+                <w:bCs/>
+                <w:sz w:val="26"/>
+                <w:szCs w:val="26"/>
+                <w:lang w:eastAsia="zh-CN" w:bidi="ar"/>
+              </w:rPr>
+              <w:t>SẢNH</w:t>
+            </w:r>
+          </w:p>
+        </w:tc>
+        <w:tc>
+          <w:tcPr>
+            <w:tcW w:w="1128" w:type="dxa"/>
+            <w:tcBorders>
+              <w:top w:val="single" w:color="000000" w:sz="4" w:space="0"/>
+              <w:left w:val="single" w:color="000000" w:sz="4" w:space="0"/>
+              <w:bottom w:val="single" w:color="000000" w:sz="4" w:space="0"/>
+              <w:right w:val="single" w:color="000000" w:sz="4" w:space="0"/>
+            </w:tcBorders>
+            <w:shd w:val="clear" w:color="auto" w:fill="FFFFFF" w:themeFill="background1"/>
+            <w:vAlign w:val="center"/>
+          </w:tcPr>
+          <w:p>
+            <w:pPr>
+              <w:jc w:val="center"/>
+              <w:textAlignment w:val="center"/>
+              <w:rPr>
+                <w:b/>
+                <w:bCs/>
+                <w:sz w:val="26"/>
+                <w:szCs w:val="26"/>
+              </w:rPr>
+            </w:pPr>
+            <w:r>
+              <w:rPr>
+                <w:rFonts w:eastAsia="SimSun"/>
+                <w:b/>
+                <w:bCs/>
+                <w:sz w:val="26"/>
+                <w:szCs w:val="26"/>
+                <w:lang w:eastAsia="zh-CN" w:bidi="ar"/>
+              </w:rPr>
+              <w:t>ĐVT</w:t>
+            </w:r>
+          </w:p>
+        </w:tc>
+        <w:tc>
+          <w:tcPr>
+            <w:tcW w:w="857" w:type="dxa"/>
+            <w:tcBorders>
+              <w:top w:val="single" w:color="000000" w:sz="4" w:space="0"/>
+              <w:left w:val="single" w:color="000000" w:sz="4" w:space="0"/>
+              <w:bottom w:val="single" w:color="000000" w:sz="4" w:space="0"/>
+              <w:right w:val="single" w:color="000000" w:sz="4" w:space="0"/>
+            </w:tcBorders>
+            <w:shd w:val="clear" w:color="auto" w:fill="FFFFFF" w:themeFill="background1"/>
+            <w:vAlign w:val="center"/>
+          </w:tcPr>
+          <w:p>
+            <w:pPr>
+              <w:jc w:val="center"/>
+              <w:textAlignment w:val="center"/>
+              <w:rPr>
+                <w:b/>
+                <w:bCs/>
+                <w:sz w:val="26"/>
+                <w:szCs w:val="26"/>
+              </w:rPr>
+            </w:pPr>
+            <w:r>
+              <w:rPr>
+                <w:rFonts w:eastAsia="SimSun"/>
+                <w:b/>
+                <w:bCs/>
+                <w:sz w:val="26"/>
+                <w:szCs w:val="26"/>
+                <w:lang w:eastAsia="zh-CN" w:bidi="ar"/>
+              </w:rPr>
+              <w:t>SL</w:t>
+            </w:r>
+          </w:p>
+        </w:tc>
+        <w:tc>
+          <w:tcPr>
+            <w:tcW w:w="1495" w:type="dxa"/>
+            <w:tcBorders>
+              <w:top w:val="single" w:color="000000" w:sz="4" w:space="0"/>
+              <w:left w:val="single" w:color="000000" w:sz="4" w:space="0"/>
+              <w:bottom w:val="single" w:color="000000" w:sz="4" w:space="0"/>
+              <w:right w:val="single" w:color="000000" w:sz="4" w:space="0"/>
+            </w:tcBorders>
+            <w:shd w:val="clear" w:color="auto" w:fill="FFFFFF" w:themeFill="background1"/>
+            <w:vAlign w:val="center"/>
+          </w:tcPr>
+          <w:p>
+            <w:pPr>
+              <w:jc w:val="center"/>
+              <w:textAlignment w:val="center"/>
+              <w:rPr>
+                <w:b/>
+                <w:bCs/>
+                <w:sz w:val="26"/>
+                <w:szCs w:val="26"/>
+              </w:rPr>
+            </w:pPr>
+            <w:r>
+              <w:rPr>
+                <w:rFonts w:eastAsia="SimSun"/>
+                <w:b/>
+                <w:bCs/>
+                <w:sz w:val="26"/>
+                <w:szCs w:val="26"/>
+                <w:lang w:eastAsia="zh-CN" w:bidi="ar"/>
+              </w:rPr>
+              <w:t xml:space="preserve">ĐƠN GIÁ </w:t>
+            </w:r>
+            <w:r>
+              <w:rPr>
+                <w:rFonts w:eastAsia="SimSun"/>
+                <w:b/>
+                <w:bCs/>
+                <w:sz w:val="26"/>
+                <w:szCs w:val="26"/>
+                <w:lang w:eastAsia="zh-CN" w:bidi="ar"/>
+              </w:rPr>
+              <w:br w:type="textWrapping"/>
+            </w:r>
+            <w:r>
+              <w:rPr>
+                <w:rFonts w:eastAsia="SimSun"/>
+                <w:b/>
+                <w:bCs/>
+                <w:sz w:val="26"/>
+                <w:szCs w:val="26"/>
+                <w:lang w:eastAsia="zh-CN" w:bidi="ar"/>
+              </w:rPr>
+              <w:t>VNĐ</w:t>
+            </w:r>
+          </w:p>
+        </w:tc>
+        <w:tc>
+          <w:tcPr>
+            <w:tcW w:w="1584" w:type="dxa"/>
+            <w:tcBorders>
+              <w:top w:val="single" w:color="000000" w:sz="4" w:space="0"/>
+              <w:left w:val="single" w:color="000000" w:sz="4" w:space="0"/>
+              <w:bottom w:val="single" w:color="000000" w:sz="4" w:space="0"/>
+              <w:right w:val="single" w:color="000000" w:sz="4" w:space="0"/>
+            </w:tcBorders>
+            <w:shd w:val="clear" w:color="auto" w:fill="FFFFFF" w:themeFill="background1"/>
+            <w:vAlign w:val="center"/>
+          </w:tcPr>
+          <w:p>
+            <w:pPr>
+              <w:jc w:val="center"/>
+              <w:textAlignment w:val="center"/>
+              <w:rPr>
+                <w:b/>
+                <w:bCs/>
+                <w:sz w:val="26"/>
+                <w:szCs w:val="26"/>
+              </w:rPr>
+            </w:pPr>
+            <w:r>
+              <w:rPr>
+                <w:rFonts w:eastAsia="SimSun"/>
+                <w:b/>
+                <w:bCs/>
+                <w:sz w:val="26"/>
+                <w:szCs w:val="26"/>
+                <w:lang w:eastAsia="zh-CN" w:bidi="ar"/>
+              </w:rPr>
+              <w:t>THÀNH TIỀN</w:t>
+            </w:r>
+            <w:r>
+              <w:rPr>
+                <w:rFonts w:eastAsia="SimSun"/>
+                <w:b/>
+                <w:bCs/>
+                <w:sz w:val="26"/>
+                <w:szCs w:val="26"/>
+                <w:lang w:eastAsia="zh-CN" w:bidi="ar"/>
+              </w:rPr>
+              <w:br w:type="textWrapping"/>
+            </w:r>
+            <w:r>
+              <w:rPr>
+                <w:rFonts w:eastAsia="SimSun"/>
+                <w:b/>
+                <w:bCs/>
+                <w:sz w:val="26"/>
+                <w:szCs w:val="26"/>
+                <w:lang w:eastAsia="zh-CN" w:bidi="ar"/>
+              </w:rPr>
+              <w:t>VNĐ</w:t>
+            </w:r>
+          </w:p>
+        </w:tc>
+      </w:tr>
+      <w:tr>
+        <w:tblPrEx>
+          <w:tblCellMar>
+            <w:top w:w="0" w:type="dxa"/>
+            <w:left w:w="108" w:type="dxa"/>
+            <w:bottom w:w="0" w:type="dxa"/>
+            <w:right w:w="108" w:type="dxa"/>
+          </w:tblCellMar>
+        </w:tblPrEx>
+        <w:trPr>
+          <w:trHeight w:val="546" w:hRule="atLeast"/>
+        </w:trPr>
+        <w:tc>
+          <w:tcPr>
+            <w:tcW w:w="10939" w:type="dxa"/>
+            <w:gridSpan w:val="8"/>
+            <w:tcBorders>
+              <w:top w:val="single" w:color="000000" w:sz="4" w:space="0"/>
+              <w:left w:val="single" w:color="000000" w:sz="4" w:space="0"/>
+              <w:bottom w:val="single" w:color="000000" w:sz="4" w:space="0"/>
+              <w:right w:val="single" w:color="000000" w:sz="4" w:space="0"/>
+            </w:tcBorders>
+            <w:vAlign w:val="center"/>
+          </w:tcPr>
+          <w:p>
+            <w:pPr>
+              <w:jc w:val="center"/>
+              <w:textAlignment w:val="center"/>
+              <w:rPr>
+                <w:b/>
+                <w:bCs/>
+                <w:sz w:val="26"/>
+                <w:szCs w:val="26"/>
+              </w:rPr>
+            </w:pPr>
+            <w:r>
+              <w:rPr>
+                <w:rFonts w:hint="default"/>
+              </w:rPr>
+              <w:t>{#DanhSachNgay} {TenNhomNgay}</w:t>
+            </w:r>
+          </w:p>
+        </w:tc>
+      </w:tr>
+      <w:tr>
+        <w:tblPrEx>
+          <w:tblCellMar>
+            <w:top w:w="0" w:type="dxa"/>
+            <w:left w:w="108" w:type="dxa"/>
+            <w:bottom w:w="0" w:type="dxa"/>
+            <w:right w:w="108" w:type="dxa"/>
+          </w:tblCellMar>
+        </w:tblPrEx>
+        <w:trPr>
+          <w:trHeight w:val="90" w:hRule="atLeast"/>
+        </w:trPr>
+        <w:tc>
+          <w:tcPr>
+            <w:tcW w:w="751" w:type="dxa"/>
+            <w:tcBorders>
+              <w:top w:val="single" w:color="000000" w:sz="4" w:space="0"/>
+              <w:left w:val="single" w:color="000000" w:sz="4" w:space="0"/>
+              <w:bottom w:val="single" w:color="000000" w:sz="4" w:space="0"/>
+              <w:right w:val="single" w:color="000000" w:sz="4" w:space="0"/>
+            </w:tcBorders>
+            <w:vAlign w:val="center"/>
+          </w:tcPr>
+          <w:p>
+            <w:pPr>
+              <w:jc w:val="center"/>
+              <w:textAlignment w:val="center"/>
+              <w:rPr>
+                <w:b/>
+                <w:bCs/>
+                <w:sz w:val="26"/>
+                <w:szCs w:val="26"/>
+              </w:rPr>
+            </w:pPr>
+            <w:r>
+              <w:rPr>
+                <w:rFonts w:hint="default" w:eastAsia="SimSun"/>
+                <w:b/>
+                <w:bCs/>
+                <w:sz w:val="26"/>
+                <w:szCs w:val="26"/>
+                <w:lang w:eastAsia="zh-CN" w:bidi="ar"/>
+              </w:rPr>
+              <w:t>{#DanhSachDV}{STT}</w:t>
+            </w:r>
+          </w:p>
+        </w:tc>
+        <w:tc>
+          <w:tcPr>
+            <w:tcW w:w="2343" w:type="dxa"/>
+            <w:tcBorders>
+              <w:top w:val="single" w:color="000000" w:sz="4" w:space="0"/>
+              <w:left w:val="single" w:color="000000" w:sz="4" w:space="0"/>
+              <w:bottom w:val="single" w:color="000000" w:sz="4" w:space="0"/>
+              <w:right w:val="single" w:color="000000" w:sz="4" w:space="0"/>
+            </w:tcBorders>
+            <w:vAlign w:val="center"/>
+          </w:tcPr>
+          <w:p>
+            <w:pPr>
+              <w:textAlignment w:val="center"/>
+              <w:rPr>
+                <w:sz w:val="26"/>
+                <w:szCs w:val="26"/>
+              </w:rPr>
+            </w:pPr>
+            <w:r>
+              <w:rPr>
+                <w:rFonts w:hint="default" w:eastAsia="SimSun"/>
+                <w:sz w:val="26"/>
+                <w:szCs w:val="26"/>
+                <w:lang w:eastAsia="zh-CN" w:bidi="ar"/>
+              </w:rPr>
+              <w:t>{TenDichVu}</w:t>
+            </w:r>
+          </w:p>
+        </w:tc>
+        <w:tc>
+          <w:tcPr>
+            <w:tcW w:w="1389" w:type="dxa"/>
+            <w:tcBorders>
+              <w:top w:val="single" w:color="000000" w:sz="4" w:space="0"/>
+              <w:left w:val="single" w:color="000000" w:sz="4" w:space="0"/>
+              <w:bottom w:val="single" w:color="000000" w:sz="4" w:space="0"/>
+              <w:right w:val="single" w:color="000000" w:sz="4" w:space="0"/>
+            </w:tcBorders>
+            <w:vAlign w:val="center"/>
+          </w:tcPr>
+          <w:p>
+            <w:pPr>
+              <w:jc w:val="center"/>
+              <w:textAlignment w:val="center"/>
+              <w:rPr>
+                <w:sz w:val="26"/>
+                <w:szCs w:val="26"/>
+              </w:rPr>
+            </w:pPr>
+            <w:r>
+              <w:rPr>
+                <w:rFonts w:hint="default" w:eastAsia="SimSun"/>
+                <w:sz w:val="26"/>
+                <w:szCs w:val="26"/>
+                <w:lang w:eastAsia="zh-CN" w:bidi="ar"/>
+              </w:rPr>
+              <w:t>{KhungGio}</w:t>
+            </w:r>
+          </w:p>
+        </w:tc>
+        <w:tc>
+          <w:tcPr>
+            <w:tcW w:w="1392" w:type="dxa"/>
+            <w:tcBorders>
+              <w:top w:val="single" w:color="000000" w:sz="4" w:space="0"/>
+              <w:left w:val="single" w:color="000000" w:sz="4" w:space="0"/>
+              <w:bottom w:val="nil"/>
+              <w:right w:val="single" w:color="000000" w:sz="4" w:space="0"/>
+            </w:tcBorders>
+            <w:vAlign w:val="center"/>
+          </w:tcPr>
+          <w:p>
+            <w:pPr>
+              <w:jc w:val="center"/>
+              <w:textAlignment w:val="center"/>
+              <w:rPr>
+                <w:b/>
+                <w:bCs/>
+                <w:sz w:val="26"/>
+                <w:szCs w:val="26"/>
+              </w:rPr>
+            </w:pPr>
+            <w:r>
+              <w:rPr>
+                <w:rFonts w:hint="default" w:eastAsia="SimSun"/>
+                <w:b/>
+                <w:bCs/>
+                <w:sz w:val="26"/>
+                <w:szCs w:val="26"/>
+                <w:lang w:eastAsia="zh-CN" w:bidi="ar"/>
+              </w:rPr>
+              <w:t>{Sanh}</w:t>
+            </w:r>
+          </w:p>
+        </w:tc>
+        <w:tc>
+          <w:tcPr>
+            <w:tcW w:w="1128" w:type="dxa"/>
+            <w:tcBorders>
+              <w:top w:val="single" w:color="000000" w:sz="4" w:space="0"/>
+              <w:left w:val="single" w:color="000000" w:sz="4" w:space="0"/>
+              <w:bottom w:val="single" w:color="000000" w:sz="4" w:space="0"/>
+              <w:right w:val="single" w:color="000000" w:sz="4" w:space="0"/>
+            </w:tcBorders>
+            <w:vAlign w:val="center"/>
+          </w:tcPr>
+          <w:p>
+            <w:pPr>
+              <w:jc w:val="center"/>
+              <w:textAlignment w:val="center"/>
+              <w:rPr>
+                <w:sz w:val="26"/>
+                <w:szCs w:val="26"/>
+              </w:rPr>
+            </w:pPr>
+            <w:r>
+              <w:rPr>
+                <w:rFonts w:hint="default" w:eastAsia="SimSun"/>
+                <w:sz w:val="26"/>
+                <w:szCs w:val="26"/>
+                <w:lang w:eastAsia="zh-CN" w:bidi="ar"/>
+              </w:rPr>
+              <w:t>{DVT}</w:t>
+            </w:r>
+          </w:p>
+        </w:tc>
+        <w:tc>
+          <w:tcPr>
+            <w:tcW w:w="857" w:type="dxa"/>
+            <w:tcBorders>
+              <w:top w:val="single" w:color="000000" w:sz="4" w:space="0"/>
+              <w:left w:val="single" w:color="000000" w:sz="4" w:space="0"/>
+              <w:bottom w:val="single" w:color="000000" w:sz="4" w:space="0"/>
+              <w:right w:val="single" w:color="000000" w:sz="4" w:space="0"/>
+            </w:tcBorders>
+            <w:vAlign w:val="center"/>
+          </w:tcPr>
+          <w:p>
+            <w:pPr>
+              <w:jc w:val="center"/>
+              <w:textAlignment w:val="center"/>
+              <w:rPr>
+                <w:sz w:val="26"/>
+                <w:szCs w:val="26"/>
+              </w:rPr>
+            </w:pPr>
+            <w:r>
+              <w:rPr>
+                <w:rFonts w:hint="default" w:eastAsia="SimSun"/>
+                <w:sz w:val="26"/>
+                <w:szCs w:val="26"/>
+                <w:lang w:eastAsia="zh-CN" w:bidi="ar"/>
+              </w:rPr>
+              <w:t>{SoLuong}</w:t>
+            </w:r>
+          </w:p>
+        </w:tc>
+        <w:tc>
+          <w:tcPr>
+            <w:tcW w:w="1495" w:type="dxa"/>
+            <w:tcBorders>
+              <w:top w:val="single" w:color="000000" w:sz="4" w:space="0"/>
+              <w:left w:val="single" w:color="000000" w:sz="4" w:space="0"/>
+              <w:bottom w:val="single" w:color="000000" w:sz="4" w:space="0"/>
+              <w:right w:val="single" w:color="000000" w:sz="4" w:space="0"/>
+            </w:tcBorders>
+            <w:vAlign w:val="center"/>
+          </w:tcPr>
+          <w:p>
+            <w:pPr>
+              <w:textAlignment w:val="center"/>
+              <w:rPr>
+                <w:sz w:val="26"/>
+                <w:szCs w:val="26"/>
+              </w:rPr>
+            </w:pPr>
+            <w:r>
+              <w:rPr>
+                <w:rFonts w:hint="default"/>
+              </w:rPr>
+              <w:t>{DonGia}</w:t>
+            </w:r>
+          </w:p>
+        </w:tc>
+        <w:tc>
+          <w:tcPr>
+            <w:tcW w:w="1584" w:type="dxa"/>
+            <w:tcBorders>
+              <w:top w:val="single" w:color="000000" w:sz="4" w:space="0"/>
+              <w:left w:val="single" w:color="000000" w:sz="4" w:space="0"/>
+              <w:bottom w:val="single" w:color="000000" w:sz="4" w:space="0"/>
+              <w:right w:val="single" w:color="000000" w:sz="4" w:space="0"/>
+            </w:tcBorders>
+            <w:noWrap/>
+            <w:vAlign w:val="center"/>
+          </w:tcPr>
+          <w:p>
+            <w:pPr>
+              <w:jc w:val="right"/>
+              <w:textAlignment w:val="center"/>
+              <w:rPr>
+                <w:sz w:val="26"/>
+                <w:szCs w:val="26"/>
+              </w:rPr>
+            </w:pPr>
+            <w:r>
+              <w:rPr>
+                <w:rFonts w:hint="default" w:eastAsia="SimSun"/>
+                <w:sz w:val="26"/>
+                <w:szCs w:val="26"/>
+                <w:lang w:eastAsia="zh-CN" w:bidi="ar"/>
+              </w:rPr>
+              <w:t>{ThanhTien}{/DanhSachDV}{/DanhSachNgay}</w:t>
+            </w:r>
+          </w:p>
+        </w:tc>
+      </w:tr>
+      <w:tr>
+        <w:tblPrEx>
+          <w:tblCellMar>
+            <w:top w:w="0" w:type="dxa"/>
+            <w:left w:w="108" w:type="dxa"/>
+            <w:bottom w:w="0" w:type="dxa"/>
+            <w:right w:w="108" w:type="dxa"/>
+          </w:tblCellMar>
+        </w:tblPrEx>
+        <w:trPr>
+          <w:trHeight w:val="530" w:hRule="atLeast"/>
+        </w:trPr>
+        <w:tc>
+          <w:tcPr>
+            <w:tcW w:w="9355" w:type="dxa"/>
+            <w:gridSpan w:val="7"/>
+            <w:tcBorders>
+              <w:top w:val="single" w:color="000000" w:sz="4" w:space="0"/>
+              <w:left w:val="single" w:color="000000" w:sz="4" w:space="0"/>
+              <w:bottom w:val="single" w:color="000000" w:sz="4" w:space="0"/>
+              <w:right w:val="single" w:color="000000" w:sz="4" w:space="0"/>
+            </w:tcBorders>
+            <w:shd w:val="clear" w:color="auto" w:fill="FFFFFF"/>
+            <w:vAlign w:val="center"/>
+          </w:tcPr>
+          <w:p>
+            <w:pPr>
+              <w:jc w:val="center"/>
+              <w:textAlignment w:val="center"/>
+              <w:rPr>
+                <w:b/>
+                <w:bCs/>
+                <w:sz w:val="26"/>
+                <w:szCs w:val="26"/>
+              </w:rPr>
+            </w:pPr>
+            <w:r>
+              <w:rPr>
+                <w:rFonts w:eastAsia="SimSun"/>
+                <w:b/>
+                <w:bCs/>
+                <w:sz w:val="26"/>
+                <w:szCs w:val="26"/>
+                <w:lang w:eastAsia="zh-CN" w:bidi="ar"/>
+              </w:rPr>
+              <w:t>THÀNH TIỀN</w:t>
+            </w:r>
+          </w:p>
+        </w:tc>
+        <w:tc>
+          <w:tcPr>
+            <w:tcW w:w="1584" w:type="dxa"/>
+            <w:tcBorders>
+              <w:top w:val="single" w:color="000000" w:sz="4" w:space="0"/>
+              <w:left w:val="single" w:color="000000" w:sz="4" w:space="0"/>
+              <w:bottom w:val="single" w:color="000000" w:sz="4" w:space="0"/>
+              <w:right w:val="single" w:color="000000" w:sz="4" w:space="0"/>
+            </w:tcBorders>
+            <w:shd w:val="clear" w:color="auto" w:fill="FFFFFF"/>
+            <w:noWrap/>
+            <w:vAlign w:val="center"/>
+          </w:tcPr>
+          <w:p>
+            <w:pPr>
+              <w:jc w:val="right"/>
+              <w:textAlignment w:val="center"/>
+              <w:rPr>
+                <w:b/>
+                <w:bCs/>
+                <w:sz w:val="26"/>
+                <w:szCs w:val="26"/>
+              </w:rPr>
+            </w:pPr>
+            <w:r>
+              <w:rPr>
+                <w:rFonts w:hint="default" w:ascii="Times New Roman" w:hAnsi="Times New Roman"/>
+                <w:sz w:val="24"/>
+                <w:szCs w:val="24"/>
+              </w:rPr>
+              <w:t>{TongTienDichVu}</w:t>
+            </w:r>
+          </w:p>
+        </w:tc>
+      </w:tr>
+      <w:tr>
+        <w:tblPrEx>
+          <w:tblCellMar>
+            <w:top w:w="0" w:type="dxa"/>
+            <w:left w:w="108" w:type="dxa"/>
+            <w:bottom w:w="0" w:type="dxa"/>
+            <w:right w:w="108" w:type="dxa"/>
+          </w:tblCellMar>
+        </w:tblPrEx>
+        <w:trPr>
+          <w:trHeight w:val="578" w:hRule="atLeast"/>
+        </w:trPr>
+        <w:tc>
+          <w:tcPr>
+            <w:tcW w:w="9355" w:type="dxa"/>
+            <w:gridSpan w:val="7"/>
+            <w:tcBorders>
+              <w:top w:val="single" w:color="000000" w:sz="4" w:space="0"/>
+              <w:left w:val="single" w:color="000000" w:sz="4" w:space="0"/>
+              <w:bottom w:val="single" w:color="000000" w:sz="4" w:space="0"/>
+              <w:right w:val="single" w:color="000000" w:sz="4" w:space="0"/>
+            </w:tcBorders>
+            <w:shd w:val="clear" w:color="auto" w:fill="FFFFFF"/>
+            <w:vAlign w:val="center"/>
+          </w:tcPr>
+          <w:p>
+            <w:pPr>
+              <w:jc w:val="center"/>
+              <w:textAlignment w:val="center"/>
+              <w:rPr>
+                <w:sz w:val="26"/>
+                <w:szCs w:val="26"/>
+              </w:rPr>
+            </w:pPr>
+            <w:r>
+              <w:rPr>
+                <w:rFonts w:eastAsia="SimSun"/>
+                <w:sz w:val="26"/>
+                <w:szCs w:val="26"/>
+                <w:lang w:eastAsia="zh-CN" w:bidi="ar"/>
+              </w:rPr>
+              <w:t xml:space="preserve">PHÍ PHỤC VỤ </w:t>
+            </w:r>
+            <w:r>
+              <w:rPr>
+                <w:rFonts w:hint="default" w:ascii="Times New Roman" w:hAnsi="Times New Roman"/>
+                <w:sz w:val="24"/>
+                <w:szCs w:val="24"/>
+              </w:rPr>
+              <w:t>{MucPhiPhucVu}</w:t>
+            </w:r>
+            <w:r>
+              <w:rPr>
+                <w:rFonts w:eastAsia="SimSun"/>
+                <w:sz w:val="26"/>
+                <w:szCs w:val="26"/>
+                <w:lang w:eastAsia="zh-CN" w:bidi="ar"/>
+              </w:rPr>
+              <w:t xml:space="preserve"> TỔNG HOÁ ĐƠN</w:t>
+            </w:r>
+          </w:p>
+        </w:tc>
+        <w:tc>
+          <w:tcPr>
+            <w:tcW w:w="1584" w:type="dxa"/>
+            <w:tcBorders>
+              <w:top w:val="single" w:color="000000" w:sz="4" w:space="0"/>
+              <w:left w:val="single" w:color="000000" w:sz="4" w:space="0"/>
+              <w:bottom w:val="single" w:color="000000" w:sz="4" w:space="0"/>
+              <w:right w:val="single" w:color="000000" w:sz="4" w:space="0"/>
+            </w:tcBorders>
+            <w:shd w:val="clear" w:color="auto" w:fill="FFFFFF"/>
+            <w:noWrap/>
+            <w:vAlign w:val="center"/>
+          </w:tcPr>
+          <w:p>
+            <w:pPr>
+              <w:shd w:val="clear" w:color="auto" w:fill="FFFFFF" w:themeFill="background1"/>
+              <w:spacing w:line="312" w:lineRule="auto"/>
+              <w:ind w:left="240" w:leftChars="100"/>
+              <w:jc w:val="right"/>
+              <w:rPr>
+                <w:b/>
+                <w:bCs/>
+                <w:sz w:val="26"/>
+                <w:szCs w:val="26"/>
+              </w:rPr>
+            </w:pPr>
+            <w:r>
+              <w:rPr>
+                <w:rFonts w:hint="default" w:ascii="Times New Roman" w:hAnsi="Times New Roman"/>
+                <w:sz w:val="24"/>
+                <w:szCs w:val="24"/>
+              </w:rPr>
+              <w:t>{PhiPhucVu}</w:t>
+            </w:r>
+          </w:p>
+        </w:tc>
+      </w:tr>
+      <w:tr>
+        <w:tblPrEx>
+          <w:tblCellMar>
+            <w:top w:w="0" w:type="dxa"/>
+            <w:left w:w="108" w:type="dxa"/>
+            <w:bottom w:w="0" w:type="dxa"/>
+            <w:right w:w="108" w:type="dxa"/>
+          </w:tblCellMar>
+        </w:tblPrEx>
+        <w:trPr>
+          <w:trHeight w:val="532" w:hRule="atLeast"/>
+        </w:trPr>
+        <w:tc>
+          <w:tcPr>
+            <w:tcW w:w="9355" w:type="dxa"/>
+            <w:gridSpan w:val="7"/>
+            <w:tcBorders>
+              <w:top w:val="single" w:color="000000" w:sz="4" w:space="0"/>
+              <w:left w:val="single" w:color="000000" w:sz="4" w:space="0"/>
+              <w:bottom w:val="single" w:color="000000" w:sz="4" w:space="0"/>
+              <w:right w:val="single" w:color="000000" w:sz="4" w:space="0"/>
+            </w:tcBorders>
+            <w:shd w:val="clear" w:color="auto" w:fill="FFFFFF"/>
+            <w:vAlign w:val="center"/>
+          </w:tcPr>
+          <w:p>
+            <w:pPr>
+              <w:jc w:val="center"/>
+              <w:textAlignment w:val="center"/>
+              <w:rPr>
+                <w:b/>
+                <w:bCs/>
+                <w:sz w:val="26"/>
+                <w:szCs w:val="26"/>
+              </w:rPr>
+            </w:pPr>
+            <w:r>
+              <w:rPr>
+                <w:rFonts w:eastAsia="SimSun"/>
+                <w:b/>
+                <w:bCs/>
+                <w:sz w:val="26"/>
+                <w:szCs w:val="26"/>
+                <w:lang w:eastAsia="zh-CN" w:bidi="ar"/>
+              </w:rPr>
+              <w:t>TỔNG CỘNG (CHƯA VAT)</w:t>
+            </w:r>
+          </w:p>
+        </w:tc>
+        <w:tc>
+          <w:tcPr>
+            <w:tcW w:w="1584" w:type="dxa"/>
+            <w:tcBorders>
+              <w:top w:val="single" w:color="000000" w:sz="4" w:space="0"/>
+              <w:left w:val="single" w:color="000000" w:sz="4" w:space="0"/>
+              <w:bottom w:val="single" w:color="000000" w:sz="4" w:space="0"/>
+              <w:right w:val="single" w:color="000000" w:sz="4" w:space="0"/>
+            </w:tcBorders>
+            <w:shd w:val="clear" w:color="auto" w:fill="FFFFFF"/>
+            <w:noWrap/>
+            <w:vAlign w:val="center"/>
+          </w:tcPr>
+          <w:p>
+            <w:pPr>
+              <w:jc w:val="right"/>
+              <w:textAlignment w:val="center"/>
+              <w:rPr>
+                <w:b/>
+                <w:bCs/>
+                <w:sz w:val="26"/>
+                <w:szCs w:val="26"/>
+              </w:rPr>
+            </w:pPr>
+            <w:r>
+              <w:rPr>
+                <w:rFonts w:hint="default" w:ascii="Times New Roman" w:hAnsi="Times New Roman"/>
+                <w:sz w:val="24"/>
+                <w:szCs w:val="24"/>
+              </w:rPr>
+              <w:t>{TongCongChuaVAT}</w:t>
+            </w:r>
+          </w:p>
+        </w:tc>
+      </w:tr>
+      <w:tr>
+        <w:tblPrEx>
+          <w:tblCellMar>
+            <w:top w:w="0" w:type="dxa"/>
+            <w:left w:w="108" w:type="dxa"/>
+            <w:bottom w:w="0" w:type="dxa"/>
+            <w:right w:w="108" w:type="dxa"/>
+          </w:tblCellMar>
+        </w:tblPrEx>
+        <w:trPr>
+          <w:trHeight w:val="566" w:hRule="atLeast"/>
+        </w:trPr>
+        <w:tc>
+          <w:tcPr>
+            <w:tcW w:w="9355" w:type="dxa"/>
+            <w:gridSpan w:val="7"/>
+            <w:tcBorders>
+              <w:top w:val="single" w:color="000000" w:sz="4" w:space="0"/>
+              <w:left w:val="single" w:color="000000" w:sz="4" w:space="0"/>
+              <w:bottom w:val="single" w:color="000000" w:sz="4" w:space="0"/>
+              <w:right w:val="single" w:color="000000" w:sz="4" w:space="0"/>
+            </w:tcBorders>
+            <w:shd w:val="clear" w:color="auto" w:fill="FFFFFF"/>
+            <w:vAlign w:val="center"/>
+          </w:tcPr>
+          <w:p>
+            <w:pPr>
+              <w:jc w:val="center"/>
+              <w:textAlignment w:val="center"/>
+              <w:rPr>
+                <w:rFonts w:eastAsia="SimSun"/>
+                <w:sz w:val="26"/>
+                <w:szCs w:val="26"/>
+                <w:lang w:eastAsia="zh-CN" w:bidi="ar"/>
+              </w:rPr>
+            </w:pPr>
+            <w:r>
+              <w:rPr>
+                <w:rFonts w:eastAsia="SimSun"/>
+                <w:sz w:val="26"/>
+                <w:szCs w:val="26"/>
+                <w:lang w:eastAsia="zh-CN" w:bidi="ar"/>
+              </w:rPr>
+              <w:t xml:space="preserve">8% VAT CHI PHÍ THỨC ĂN, NƯỚC NGỌT, NƯỚC SUỐI, PHÍ PHỤC VỤ </w:t>
+            </w:r>
+          </w:p>
+          <w:p>
+            <w:pPr>
+              <w:jc w:val="center"/>
+              <w:textAlignment w:val="center"/>
+              <w:rPr>
+                <w:sz w:val="26"/>
+                <w:szCs w:val="26"/>
+              </w:rPr>
+            </w:pPr>
+            <w:r>
+              <w:rPr>
+                <w:rFonts w:eastAsia="SimSun"/>
+                <w:sz w:val="26"/>
+                <w:szCs w:val="26"/>
+                <w:lang w:eastAsia="zh-CN" w:bidi="ar"/>
+              </w:rPr>
+              <w:t>&amp; DỊCH VỤ</w:t>
+            </w:r>
+          </w:p>
+        </w:tc>
+        <w:tc>
+          <w:tcPr>
+            <w:tcW w:w="1584" w:type="dxa"/>
+            <w:tcBorders>
+              <w:top w:val="single" w:color="000000" w:sz="4" w:space="0"/>
+              <w:left w:val="single" w:color="000000" w:sz="4" w:space="0"/>
+              <w:bottom w:val="single" w:color="000000" w:sz="4" w:space="0"/>
+              <w:right w:val="single" w:color="000000" w:sz="4" w:space="0"/>
+            </w:tcBorders>
+            <w:shd w:val="clear" w:color="auto" w:fill="FFFFFF"/>
+            <w:noWrap/>
+            <w:vAlign w:val="center"/>
+          </w:tcPr>
+          <w:p>
+            <w:pPr>
+              <w:jc w:val="right"/>
+              <w:textAlignment w:val="center"/>
+              <w:rPr>
+                <w:b/>
+                <w:bCs/>
+                <w:sz w:val="26"/>
+                <w:szCs w:val="26"/>
+              </w:rPr>
+            </w:pPr>
+            <w:r>
+              <w:rPr>
+                <w:rFonts w:hint="default" w:ascii="Times New Roman" w:hAnsi="Times New Roman"/>
+                <w:sz w:val="24"/>
+                <w:szCs w:val="24"/>
+              </w:rPr>
+              <w:t>{VAT8}</w:t>
+            </w:r>
+          </w:p>
+        </w:tc>
+      </w:tr>
+      <w:tr>
+        <w:tblPrEx>
+          <w:tblCellMar>
+            <w:top w:w="0" w:type="dxa"/>
+            <w:left w:w="108" w:type="dxa"/>
+            <w:bottom w:w="0" w:type="dxa"/>
+            <w:right w:w="108" w:type="dxa"/>
+          </w:tblCellMar>
+        </w:tblPrEx>
+        <w:trPr>
+          <w:trHeight w:val="508" w:hRule="atLeast"/>
+        </w:trPr>
+        <w:tc>
+          <w:tcPr>
+            <w:tcW w:w="9355" w:type="dxa"/>
+            <w:gridSpan w:val="7"/>
+            <w:tcBorders>
+              <w:top w:val="single" w:color="000000" w:sz="4" w:space="0"/>
+              <w:left w:val="single" w:color="000000" w:sz="4" w:space="0"/>
+              <w:bottom w:val="single" w:color="000000" w:sz="4" w:space="0"/>
+              <w:right w:val="single" w:color="000000" w:sz="4" w:space="0"/>
+            </w:tcBorders>
+            <w:shd w:val="clear" w:color="auto" w:fill="FFFFFF"/>
+            <w:vAlign w:val="center"/>
+          </w:tcPr>
+          <w:p>
+            <w:pPr>
+              <w:jc w:val="center"/>
+              <w:textAlignment w:val="center"/>
+              <w:rPr>
+                <w:sz w:val="26"/>
+                <w:szCs w:val="26"/>
+              </w:rPr>
+            </w:pPr>
+            <w:r>
+              <w:rPr>
+                <w:rFonts w:eastAsia="SimSun"/>
+                <w:sz w:val="26"/>
+                <w:szCs w:val="26"/>
+                <w:lang w:eastAsia="zh-CN" w:bidi="ar"/>
+              </w:rPr>
+              <w:t>10% VAT CÁC CHI PHÍ CÒN LẠI</w:t>
+            </w:r>
+          </w:p>
+        </w:tc>
+        <w:tc>
+          <w:tcPr>
+            <w:tcW w:w="1584" w:type="dxa"/>
+            <w:tcBorders>
+              <w:top w:val="single" w:color="000000" w:sz="4" w:space="0"/>
+              <w:left w:val="single" w:color="000000" w:sz="4" w:space="0"/>
+              <w:bottom w:val="single" w:color="000000" w:sz="4" w:space="0"/>
+              <w:right w:val="single" w:color="000000" w:sz="4" w:space="0"/>
+            </w:tcBorders>
+            <w:shd w:val="clear" w:color="auto" w:fill="FFFFFF"/>
+            <w:noWrap/>
+            <w:vAlign w:val="center"/>
+          </w:tcPr>
+          <w:p>
+            <w:pPr>
+              <w:jc w:val="right"/>
+              <w:textAlignment w:val="center"/>
+              <w:rPr>
+                <w:b/>
+                <w:bCs/>
+                <w:sz w:val="26"/>
+                <w:szCs w:val="26"/>
+              </w:rPr>
+            </w:pPr>
+            <w:r>
+              <w:rPr>
+                <w:rFonts w:hint="default" w:ascii="Times New Roman" w:hAnsi="Times New Roman"/>
+                <w:sz w:val="24"/>
+                <w:szCs w:val="24"/>
+              </w:rPr>
+              <w:t>{VAT10}</w:t>
+            </w:r>
+          </w:p>
+        </w:tc>
+      </w:tr>
+      <w:tr>
+        <w:tblPrEx>
+          <w:tblCellMar>
+            <w:top w:w="0" w:type="dxa"/>
+            <w:left w:w="108" w:type="dxa"/>
+            <w:bottom w:w="0" w:type="dxa"/>
+            <w:right w:w="108" w:type="dxa"/>
+          </w:tblCellMar>
+        </w:tblPrEx>
+        <w:trPr>
+          <w:trHeight w:val="638" w:hRule="atLeast"/>
+        </w:trPr>
+        <w:tc>
+          <w:tcPr>
+            <w:tcW w:w="9355" w:type="dxa"/>
+            <w:gridSpan w:val="7"/>
+            <w:tcBorders>
+              <w:top w:val="single" w:color="000000" w:sz="4" w:space="0"/>
+              <w:left w:val="single" w:color="000000" w:sz="4" w:space="0"/>
+              <w:bottom w:val="single" w:color="000000" w:sz="4" w:space="0"/>
+              <w:right w:val="single" w:color="000000" w:sz="4" w:space="0"/>
+            </w:tcBorders>
+            <w:shd w:val="clear" w:color="auto" w:fill="FFFFFF"/>
+            <w:vAlign w:val="center"/>
+          </w:tcPr>
+          <w:p>
+            <w:pPr>
+              <w:jc w:val="center"/>
+              <w:textAlignment w:val="center"/>
+              <w:rPr>
+                <w:b/>
+                <w:bCs/>
+                <w:sz w:val="26"/>
+                <w:szCs w:val="26"/>
+              </w:rPr>
+            </w:pPr>
+            <w:r>
+              <w:rPr>
+                <w:rFonts w:eastAsia="SimSun"/>
+                <w:b/>
+                <w:bCs/>
+                <w:sz w:val="26"/>
+                <w:szCs w:val="26"/>
+                <w:lang w:eastAsia="zh-CN" w:bidi="ar"/>
+              </w:rPr>
+              <w:t>TỔNG GIÁ TRỊ QUYẾT TOÁN</w:t>
+            </w:r>
+          </w:p>
+        </w:tc>
+        <w:tc>
+          <w:tcPr>
+            <w:tcW w:w="1584" w:type="dxa"/>
+            <w:tcBorders>
+              <w:top w:val="single" w:color="000000" w:sz="4" w:space="0"/>
+              <w:left w:val="single" w:color="000000" w:sz="4" w:space="0"/>
+              <w:bottom w:val="single" w:color="000000" w:sz="4" w:space="0"/>
+              <w:right w:val="single" w:color="000000" w:sz="4" w:space="0"/>
+            </w:tcBorders>
+            <w:shd w:val="clear" w:color="auto" w:fill="FFFFFF"/>
+            <w:noWrap/>
+            <w:vAlign w:val="center"/>
+          </w:tcPr>
+          <w:p>
+            <w:pPr>
+              <w:jc w:val="right"/>
+              <w:textAlignment w:val="center"/>
+              <w:rPr>
+                <w:b/>
+                <w:bCs/>
+                <w:sz w:val="26"/>
+                <w:szCs w:val="26"/>
+              </w:rPr>
+            </w:pPr>
+            <w:r>
+              <w:rPr>
+                <w:rFonts w:hint="default" w:ascii="Times New Roman" w:hAnsi="Times New Roman"/>
+                <w:sz w:val="24"/>
+                <w:szCs w:val="24"/>
+              </w:rPr>
+              <w:t>{TongGiaTriQuyetToan}</w:t>
+            </w:r>
+          </w:p>
+        </w:tc>
+      </w:tr>
+    </w:tbl>
+    <w:p>
+      <w:pPr>
+        <w:tabs>
+          <w:tab w:val="left" w:pos="180"/>
+          <w:tab w:val="left" w:pos="630"/>
+        </w:tabs>
+        <w:spacing w:before="120" w:after="120" w:line="360" w:lineRule="auto"/>
+        <w:jc w:val="both"/>
+        <w:rPr>
+          <w:bCs/>
+          <w:sz w:val="26"/>
+          <w:szCs w:val="26"/>
+        </w:rPr>
+      </w:pPr>
+    </w:p>
+    <w:p>
+      <w:pPr>
+        <w:pStyle w:val="21"/>
+        <w:numPr>
+          <w:ilvl w:val="0"/>
+          <w:numId w:val="2"/>
+        </w:numPr>
+        <w:shd w:val="clear" w:color="auto" w:fill="FFFFFF" w:themeFill="background1"/>
+        <w:spacing w:line="312" w:lineRule="auto"/>
+        <w:contextualSpacing/>
+        <w:jc w:val="left"/>
+        <w:rPr>
+          <w:rFonts w:ascii="Times New Roman" w:hAnsi="Times New Roman"/>
+          <w:i/>
+          <w:iCs/>
+          <w:sz w:val="26"/>
+          <w:szCs w:val="26"/>
+        </w:rPr>
+      </w:pPr>
+      <w:bookmarkStart w:id="4" w:name="_MON_1830157658"/>
+      <w:bookmarkEnd w:id="4"/>
+      <w:r>
+        <w:rPr>
+          <w:rFonts w:ascii="Times New Roman" w:hAnsi="Times New Roman"/>
+          <w:sz w:val="26"/>
+          <w:szCs w:val="26"/>
+        </w:rPr>
+        <w:t xml:space="preserve">Tổng giá trị </w:t>
+      </w:r>
+      <w:r>
+        <w:rPr>
+          <w:rFonts w:hint="default"/>
+          <w:sz w:val="26"/>
+          <w:szCs w:val="26"/>
+          <w:lang w:val="en-US"/>
+        </w:rPr>
+        <w:t>Quyết Toán</w:t>
+      </w:r>
+      <w:r>
+        <w:rPr>
+          <w:rFonts w:ascii="Times New Roman" w:hAnsi="Times New Roman"/>
+          <w:sz w:val="26"/>
+          <w:szCs w:val="26"/>
+        </w:rPr>
+        <w:t>:</w:t>
+      </w:r>
+      <w:r>
+        <w:rPr>
+          <w:rFonts w:hint="default" w:ascii="Times New Roman" w:hAnsi="Times New Roman"/>
+          <w:sz w:val="26"/>
+          <w:szCs w:val="26"/>
+        </w:rPr>
+        <w:t>{TongGiaTriQuyetToan}</w:t>
+      </w:r>
+      <w:r>
+        <w:rPr>
+          <w:rFonts w:ascii="Times New Roman" w:hAnsi="Times New Roman"/>
+          <w:b/>
+          <w:sz w:val="26"/>
+          <w:szCs w:val="26"/>
+        </w:rPr>
+        <w:t xml:space="preserve">VNĐ </w:t>
+      </w:r>
+      <w:r>
+        <w:rPr>
+          <w:rFonts w:ascii="Times New Roman" w:hAnsi="Times New Roman"/>
+          <w:i/>
+          <w:iCs/>
+          <w:sz w:val="26"/>
+          <w:szCs w:val="26"/>
+        </w:rPr>
+        <w:t>(Bằng</w:t>
+      </w:r>
+      <w:r>
+        <w:rPr>
+          <w:rFonts w:hint="default" w:ascii="Times New Roman" w:hAnsi="Times New Roman"/>
+          <w:i/>
+          <w:iCs/>
+          <w:sz w:val="26"/>
+          <w:szCs w:val="26"/>
+          <w:lang w:val="en-US"/>
+        </w:rPr>
+        <w:t xml:space="preserve"> </w:t>
+      </w:r>
+      <w:r>
+        <w:rPr>
+          <w:rFonts w:ascii="Times New Roman" w:hAnsi="Times New Roman"/>
+          <w:i/>
+          <w:iCs/>
+          <w:sz w:val="26"/>
+          <w:szCs w:val="26"/>
+        </w:rPr>
+        <w:t>chữ:</w:t>
+      </w:r>
+      <w:r>
+        <w:rPr>
+          <w:rFonts w:hint="default" w:ascii="Times New Roman" w:hAnsi="Times New Roman"/>
+          <w:i/>
+          <w:iCs/>
+          <w:sz w:val="26"/>
+          <w:szCs w:val="26"/>
+          <w:lang w:val="en-US"/>
+        </w:rPr>
+        <w:t xml:space="preserve"> </w:t>
+      </w:r>
+      <w:r>
+        <w:rPr>
+          <w:rFonts w:hint="default" w:ascii="Times New Roman" w:hAnsi="Times New Roman"/>
+          <w:i/>
+          <w:iCs/>
+          <w:sz w:val="26"/>
+          <w:szCs w:val="26"/>
+        </w:rPr>
+        <w:t>{TongGiaTriQuyetToanBangChu}</w:t>
+      </w:r>
+      <w:r>
+        <w:rPr>
+          <w:rFonts w:hint="default" w:ascii="Times New Roman" w:hAnsi="Times New Roman"/>
+          <w:i/>
+          <w:iCs/>
+          <w:sz w:val="26"/>
+          <w:szCs w:val="26"/>
+          <w:lang w:val="en-US"/>
+        </w:rPr>
+        <w:t xml:space="preserve"> </w:t>
+      </w:r>
+      <w:r>
+        <w:rPr>
+          <w:rFonts w:ascii="Times New Roman" w:hAnsi="Times New Roman"/>
+          <w:i/>
+          <w:iCs/>
+          <w:sz w:val="26"/>
+          <w:szCs w:val="26"/>
+        </w:rPr>
+        <w:t>đồng./.)</w:t>
+      </w:r>
+    </w:p>
+    <w:p>
+      <w:pPr>
+        <w:tabs>
+          <w:tab w:val="left" w:pos="630"/>
+        </w:tabs>
+        <w:spacing w:before="120" w:after="120" w:line="360" w:lineRule="auto"/>
+        <w:jc w:val="both"/>
+        <w:rPr>
+          <w:sz w:val="26"/>
+          <w:szCs w:val="26"/>
+        </w:rPr>
+      </w:pPr>
+    </w:p>
+    <w:p>
+      <w:pPr>
+        <w:tabs>
+          <w:tab w:val="left" w:pos="630"/>
+        </w:tabs>
+        <w:spacing w:before="120" w:after="120" w:line="360" w:lineRule="auto"/>
+        <w:jc w:val="both"/>
+        <w:rPr>
+          <w:sz w:val="26"/>
+          <w:szCs w:val="26"/>
+        </w:rPr>
+      </w:pPr>
+      <w:r>
+        <w:rPr>
+          <w:sz w:val="26"/>
+          <w:szCs w:val="26"/>
+        </w:rPr>
+        <w:t>Hai Bên thống nhất xác nhận:</w:t>
+      </w:r>
+    </w:p>
+    <w:p>
+      <w:pPr>
+        <w:pStyle w:val="21"/>
+        <w:numPr>
+          <w:ilvl w:val="0"/>
+          <w:numId w:val="3"/>
+        </w:numPr>
+        <w:tabs>
+          <w:tab w:val="left" w:pos="630"/>
+        </w:tabs>
+        <w:spacing w:before="120" w:after="120" w:line="360" w:lineRule="auto"/>
+        <w:jc w:val="both"/>
+        <w:rPr>
+          <w:sz w:val="26"/>
+          <w:szCs w:val="26"/>
+        </w:rPr>
+      </w:pPr>
+      <w:r>
+        <w:rPr>
+          <w:sz w:val="26"/>
+          <w:szCs w:val="26"/>
+        </w:rPr>
+        <w:t>Bên A đã hoàn thành việc cung cấp dịch vụ theo Hợp đồng và các nội dung phát sinh được hai Bên xác nhận (nếu có).</w:t>
+      </w:r>
+    </w:p>
+    <w:p>
+      <w:pPr>
+        <w:pStyle w:val="21"/>
+        <w:numPr>
+          <w:ilvl w:val="0"/>
+          <w:numId w:val="3"/>
+        </w:numPr>
+        <w:tabs>
+          <w:tab w:val="left" w:pos="630"/>
+        </w:tabs>
+        <w:spacing w:before="120" w:after="120" w:line="360" w:lineRule="auto"/>
+        <w:jc w:val="both"/>
+        <w:rPr>
+          <w:sz w:val="26"/>
+          <w:szCs w:val="26"/>
+        </w:rPr>
+      </w:pPr>
+      <w:r>
+        <w:rPr>
+          <w:sz w:val="26"/>
+          <w:szCs w:val="26"/>
+        </w:rPr>
+        <w:t>Các khoản phát sinh (nếu có) đã được hai Bên kiểm tra và thống nhất.</w:t>
+      </w:r>
+    </w:p>
+    <w:p>
+      <w:pPr>
+        <w:pStyle w:val="21"/>
+        <w:numPr>
+          <w:ilvl w:val="0"/>
+          <w:numId w:val="3"/>
+        </w:numPr>
+        <w:tabs>
+          <w:tab w:val="left" w:pos="630"/>
+        </w:tabs>
+        <w:spacing w:before="120" w:after="120" w:line="360" w:lineRule="auto"/>
+        <w:jc w:val="both"/>
+        <w:rPr>
+          <w:sz w:val="26"/>
+          <w:szCs w:val="26"/>
+        </w:rPr>
+      </w:pPr>
+      <w:r>
+        <w:rPr>
+          <w:sz w:val="26"/>
+          <w:szCs w:val="26"/>
+        </w:rPr>
+        <w:t>Tổng giá trị quyết toán là:</w:t>
+      </w:r>
+      <w:r>
+        <w:rPr>
+          <w:rFonts w:hint="default" w:ascii="Times New Roman" w:hAnsi="Times New Roman"/>
+          <w:sz w:val="26"/>
+          <w:szCs w:val="26"/>
+        </w:rPr>
+        <w:t>{TongGiaTriQuyetToan}</w:t>
+      </w:r>
+      <w:r>
+        <w:rPr>
+          <w:sz w:val="26"/>
+          <w:szCs w:val="26"/>
+        </w:rPr>
+        <w:t>VNĐ</w:t>
+      </w:r>
+    </w:p>
+    <w:p>
+      <w:pPr>
+        <w:pStyle w:val="21"/>
+        <w:numPr>
+          <w:ilvl w:val="0"/>
+          <w:numId w:val="3"/>
+        </w:numPr>
+        <w:tabs>
+          <w:tab w:val="left" w:pos="630"/>
+        </w:tabs>
+        <w:spacing w:before="120" w:after="120" w:line="360" w:lineRule="auto"/>
+        <w:jc w:val="both"/>
+        <w:rPr>
+          <w:sz w:val="26"/>
+          <w:szCs w:val="26"/>
+        </w:rPr>
+      </w:pPr>
+      <w:r>
+        <w:rPr>
+          <w:sz w:val="26"/>
+          <w:szCs w:val="26"/>
+        </w:rPr>
+        <w:t xml:space="preserve">Số tiền Bên B đã đặt cọc giữ chỗ và đảm bảo thực hiện hợp đồng là: </w:t>
+      </w:r>
+      <w:r>
+        <w:rPr>
+          <w:rFonts w:hint="default"/>
+          <w:sz w:val="26"/>
+          <w:szCs w:val="26"/>
+          <w:lang w:val="en-US"/>
+        </w:rPr>
+        <w:t>{SoTienDaDatCoc}</w:t>
+      </w:r>
+      <w:r>
+        <w:rPr>
+          <w:sz w:val="26"/>
+          <w:szCs w:val="26"/>
+        </w:rPr>
+        <w:t xml:space="preserve"> VNĐ (Ngày thanh toán: </w:t>
+      </w:r>
+      <w:r>
+        <w:rPr>
+          <w:rFonts w:hint="default"/>
+          <w:sz w:val="26"/>
+          <w:szCs w:val="26"/>
+          <w:lang w:val="en-US"/>
+        </w:rPr>
+        <w:t>{NgayThanhToanDatCoc}</w:t>
+      </w:r>
+      <w:r>
+        <w:rPr>
+          <w:sz w:val="26"/>
+          <w:szCs w:val="26"/>
+        </w:rPr>
+        <w:t>)</w:t>
+      </w:r>
+    </w:p>
+    <w:p>
+      <w:pPr>
+        <w:pStyle w:val="21"/>
+        <w:numPr>
+          <w:ilvl w:val="0"/>
+          <w:numId w:val="3"/>
+        </w:numPr>
+        <w:tabs>
+          <w:tab w:val="left" w:pos="630"/>
+        </w:tabs>
+        <w:spacing w:before="120" w:after="120" w:line="360" w:lineRule="auto"/>
+        <w:jc w:val="both"/>
+        <w:rPr>
+          <w:sz w:val="26"/>
+          <w:szCs w:val="26"/>
+        </w:rPr>
+      </w:pPr>
+      <w:r>
+        <w:rPr>
+          <w:sz w:val="26"/>
+          <w:szCs w:val="26"/>
+        </w:rPr>
+        <w:t xml:space="preserve">Số tiền Bên B còn phải thanh toán cho Bên A là: </w:t>
+      </w:r>
+      <w:r>
+        <w:rPr>
+          <w:rFonts w:hint="default"/>
+          <w:sz w:val="26"/>
+          <w:szCs w:val="26"/>
+          <w:lang w:val="en-US"/>
+        </w:rPr>
+        <w:t>{SoTienConLai}</w:t>
+      </w:r>
+      <w:r>
+        <w:rPr>
+          <w:sz w:val="26"/>
+          <w:szCs w:val="26"/>
+        </w:rPr>
+        <w:t xml:space="preserve"> (Bằng chữ:</w:t>
+      </w:r>
+      <w:r>
+        <w:rPr>
+          <w:rFonts w:hint="default"/>
+          <w:sz w:val="26"/>
+          <w:szCs w:val="26"/>
+        </w:rPr>
+        <w:t>{SoTienConLaiBangChu}</w:t>
+      </w:r>
+      <w:bookmarkStart w:id="5" w:name="_GoBack"/>
+      <w:bookmarkEnd w:id="5"/>
+      <w:r>
+        <w:rPr>
+          <w:sz w:val="26"/>
+          <w:szCs w:val="26"/>
+        </w:rPr>
+        <w:t>)</w:t>
+      </w:r>
+    </w:p>
+    <w:p>
+      <w:pPr>
+        <w:pStyle w:val="21"/>
+        <w:numPr>
+          <w:ilvl w:val="0"/>
+          <w:numId w:val="1"/>
+        </w:numPr>
+        <w:tabs>
+          <w:tab w:val="left" w:pos="630"/>
+        </w:tabs>
+        <w:spacing w:before="120" w:after="120" w:line="360" w:lineRule="auto"/>
+        <w:jc w:val="both"/>
+        <w:rPr>
+          <w:b/>
+          <w:sz w:val="26"/>
+          <w:szCs w:val="26"/>
+        </w:rPr>
+      </w:pPr>
+      <w:r>
+        <w:rPr>
+          <w:b/>
+          <w:sz w:val="26"/>
+          <w:szCs w:val="26"/>
+        </w:rPr>
+        <w:t>CAM KẾT THỰC HIỆN</w:t>
+      </w:r>
+    </w:p>
+    <w:p>
+      <w:pPr>
+        <w:pStyle w:val="21"/>
+        <w:numPr>
+          <w:ilvl w:val="0"/>
+          <w:numId w:val="4"/>
+        </w:numPr>
+        <w:tabs>
+          <w:tab w:val="left" w:pos="630"/>
+        </w:tabs>
+        <w:spacing w:before="120" w:after="120" w:line="360" w:lineRule="auto"/>
+        <w:jc w:val="both"/>
+        <w:rPr>
+          <w:b/>
+          <w:sz w:val="26"/>
+          <w:szCs w:val="26"/>
+        </w:rPr>
+      </w:pPr>
+      <w:r>
+        <w:rPr>
+          <w:bCs/>
+          <w:sz w:val="26"/>
+          <w:szCs w:val="26"/>
+        </w:rPr>
+        <w:t>Bên A thực hiện xuất Hóa đơn GTGT theo Tổng giá trị quyết toán được hai Bên xác nhận tại Biên bản này.</w:t>
+      </w:r>
+    </w:p>
+    <w:p>
+      <w:pPr>
+        <w:pStyle w:val="21"/>
+        <w:numPr>
+          <w:ilvl w:val="0"/>
+          <w:numId w:val="4"/>
+        </w:numPr>
+        <w:tabs>
+          <w:tab w:val="left" w:pos="630"/>
+        </w:tabs>
+        <w:spacing w:before="120" w:after="120" w:line="360" w:lineRule="auto"/>
+        <w:jc w:val="both"/>
+        <w:rPr>
+          <w:b/>
+          <w:sz w:val="26"/>
+          <w:szCs w:val="26"/>
+        </w:rPr>
+      </w:pPr>
+      <w:r>
+        <w:rPr>
+          <w:bCs/>
+          <w:sz w:val="26"/>
+          <w:szCs w:val="26"/>
+        </w:rPr>
+        <w:t>Bên B cam kết thanh toán số tiền còn phải thanh toán cho Bên A trong thời hạn quy định tại Hợp đồng.</w:t>
+      </w:r>
+    </w:p>
+    <w:p>
+      <w:pPr>
+        <w:pStyle w:val="21"/>
+        <w:numPr>
+          <w:ilvl w:val="0"/>
+          <w:numId w:val="4"/>
+        </w:numPr>
+        <w:tabs>
+          <w:tab w:val="left" w:pos="630"/>
+        </w:tabs>
+        <w:spacing w:before="120" w:after="120" w:line="360" w:lineRule="auto"/>
+        <w:jc w:val="both"/>
+        <w:rPr>
+          <w:b/>
+          <w:sz w:val="26"/>
+          <w:szCs w:val="26"/>
+        </w:rPr>
+      </w:pPr>
+      <w:r>
+        <w:rPr>
+          <w:bCs/>
+          <w:sz w:val="26"/>
+          <w:szCs w:val="26"/>
+        </w:rPr>
+        <w:t>Biên bản này là căn cứ để đối chiếu công nợ, xuất hóa đơn và thanh toán theo quy định của Hợp đồng.</w:t>
+      </w:r>
+    </w:p>
+    <w:p>
+      <w:pPr>
+        <w:tabs>
+          <w:tab w:val="left" w:pos="630"/>
+        </w:tabs>
+        <w:spacing w:before="120" w:after="120" w:line="360" w:lineRule="auto"/>
+        <w:ind w:left="360"/>
+        <w:jc w:val="both"/>
+        <w:rPr>
+          <w:bCs/>
+          <w:sz w:val="26"/>
+          <w:szCs w:val="26"/>
+        </w:rPr>
+      </w:pPr>
+      <w:r>
+        <w:rPr>
+          <w:bCs/>
+          <w:sz w:val="26"/>
+          <w:szCs w:val="26"/>
+        </w:rPr>
+        <w:t>Biên bản được lập thành 04 (bốn) bản có giá trị pháp lý như nhau, mỗi bên giữ 02 (hai) bản để thực hiện.</w:t>
+      </w:r>
+    </w:p>
+    <w:p>
+      <w:pPr>
+        <w:spacing w:before="120" w:after="120" w:line="360" w:lineRule="auto"/>
+        <w:ind w:left="630"/>
+        <w:jc w:val="both"/>
+        <w:rPr>
+          <w:sz w:val="26"/>
+          <w:szCs w:val="26"/>
+        </w:rPr>
+      </w:pPr>
+    </w:p>
+    <w:p>
+      <w:pPr>
+        <w:spacing w:before="120" w:after="120" w:line="360" w:lineRule="auto"/>
+        <w:rPr>
+          <w:b/>
+          <w:sz w:val="26"/>
+          <w:szCs w:val="26"/>
+          <w:lang w:val="fr-FR"/>
+        </w:rPr>
+      </w:pPr>
+      <w:r>
+        <w:rPr>
+          <w:b/>
+          <w:sz w:val="26"/>
+          <w:szCs w:val="26"/>
+          <w:lang w:val="fr-FR"/>
+        </w:rPr>
+        <w:t xml:space="preserve">          ĐẠI DIỆN BÊN A</w:t>
+      </w:r>
+      <w:r>
+        <w:rPr>
+          <w:b/>
+          <w:sz w:val="26"/>
+          <w:szCs w:val="26"/>
+          <w:lang w:val="fr-FR"/>
+        </w:rPr>
+        <w:tab/>
+      </w:r>
+      <w:r>
+        <w:rPr>
+          <w:b/>
+          <w:sz w:val="26"/>
+          <w:szCs w:val="26"/>
+          <w:lang w:val="fr-FR"/>
+        </w:rPr>
+        <w:tab/>
+      </w:r>
+      <w:r>
+        <w:rPr>
+          <w:b/>
+          <w:sz w:val="26"/>
+          <w:szCs w:val="26"/>
+          <w:lang w:val="fr-FR"/>
+        </w:rPr>
+        <w:tab/>
+      </w:r>
+      <w:r>
+        <w:rPr>
+          <w:b/>
+          <w:sz w:val="26"/>
+          <w:szCs w:val="26"/>
+          <w:lang w:val="fr-FR"/>
+        </w:rPr>
+        <w:tab/>
+      </w:r>
+      <w:r>
+        <w:rPr>
+          <w:b/>
+          <w:sz w:val="26"/>
+          <w:szCs w:val="26"/>
+          <w:lang w:val="fr-FR"/>
+        </w:rPr>
+        <w:t xml:space="preserve">             ĐẠI DIỆN BÊN B</w:t>
+      </w:r>
+    </w:p>
+    <w:p>
+      <w:pPr>
+        <w:tabs>
+          <w:tab w:val="left" w:pos="6015"/>
+        </w:tabs>
+        <w:spacing w:before="120" w:after="120" w:line="360" w:lineRule="auto"/>
+        <w:rPr>
+          <w:sz w:val="26"/>
+          <w:szCs w:val="26"/>
+          <w:lang w:val="fr-FR"/>
+        </w:rPr>
+      </w:pPr>
+      <w:r>
+        <w:rPr>
+          <w:sz w:val="26"/>
+          <w:szCs w:val="26"/>
+          <w:lang w:val="fr-FR"/>
+        </w:rPr>
+        <w:t xml:space="preserve">       </w:t>
+      </w:r>
+    </w:p>
+    <w:p>
+      <w:pPr>
+        <w:tabs>
+          <w:tab w:val="left" w:pos="6015"/>
+        </w:tabs>
+        <w:spacing w:before="120" w:after="120" w:line="360" w:lineRule="auto"/>
+        <w:rPr>
+          <w:sz w:val="26"/>
+          <w:szCs w:val="26"/>
+          <w:lang w:val="fr-FR"/>
+        </w:rPr>
+      </w:pPr>
+    </w:p>
+    <w:p>
+      <w:pPr>
+        <w:spacing w:before="120" w:after="120" w:line="360" w:lineRule="auto"/>
+        <w:rPr>
+          <w:b/>
+          <w:sz w:val="26"/>
+          <w:szCs w:val="26"/>
+          <w:lang w:val="fr-FR"/>
+        </w:rPr>
+      </w:pPr>
+      <w:r>
+        <w:rPr>
+          <w:b/>
+          <w:sz w:val="26"/>
+          <w:szCs w:val="26"/>
+          <w:lang w:val="fr-FR"/>
+        </w:rPr>
+        <w:t xml:space="preserve">                   </w:t>
+      </w:r>
+    </w:p>
+    <w:p>
+      <w:pPr>
+        <w:spacing w:before="120" w:after="120" w:line="360" w:lineRule="auto"/>
+        <w:rPr>
+          <w:b/>
+          <w:sz w:val="26"/>
+          <w:szCs w:val="26"/>
+          <w:u w:val="single"/>
+          <w:lang w:val="fr-FR"/>
+        </w:rPr>
+      </w:pPr>
+      <w:r>
+        <w:rPr>
+          <w:b/>
+          <w:sz w:val="26"/>
+          <w:szCs w:val="26"/>
+          <w:lang w:val="fr-FR"/>
+        </w:rPr>
+        <w:t xml:space="preserve">   Ký: </w:t>
+      </w:r>
+      <w:r>
+        <w:rPr>
+          <w:b/>
+          <w:sz w:val="26"/>
+          <w:szCs w:val="26"/>
+          <w:u w:val="single"/>
+          <w:lang w:val="fr-FR"/>
+        </w:rPr>
+        <w:tab/>
+      </w:r>
+      <w:r>
+        <w:rPr>
+          <w:b/>
+          <w:sz w:val="26"/>
+          <w:szCs w:val="26"/>
+          <w:u w:val="single"/>
+          <w:lang w:val="fr-FR"/>
+        </w:rPr>
+        <w:tab/>
+      </w:r>
+      <w:r>
+        <w:rPr>
+          <w:b/>
+          <w:sz w:val="26"/>
+          <w:szCs w:val="26"/>
+          <w:u w:val="single"/>
+          <w:lang w:val="fr-FR"/>
+        </w:rPr>
+        <w:tab/>
+      </w:r>
+      <w:r>
+        <w:rPr>
+          <w:b/>
+          <w:sz w:val="26"/>
+          <w:szCs w:val="26"/>
+          <w:u w:val="single"/>
+          <w:lang w:val="fr-FR"/>
+        </w:rPr>
+        <w:tab/>
+      </w:r>
+      <w:r>
+        <w:rPr>
+          <w:b/>
+          <w:sz w:val="26"/>
+          <w:szCs w:val="26"/>
+          <w:lang w:val="fr-FR"/>
+        </w:rPr>
+        <w:t xml:space="preserve">                                          Ký</w:t>
+      </w:r>
+      <w:r>
+        <w:rPr>
+          <w:b/>
+          <w:sz w:val="26"/>
+          <w:szCs w:val="26"/>
+          <w:u w:val="single"/>
+          <w:lang w:val="fr-FR"/>
+        </w:rPr>
+        <w:tab/>
+      </w:r>
+      <w:r>
+        <w:rPr>
+          <w:b/>
+          <w:sz w:val="26"/>
+          <w:szCs w:val="26"/>
+          <w:u w:val="single"/>
+          <w:lang w:val="fr-FR"/>
+        </w:rPr>
+        <w:tab/>
+      </w:r>
+      <w:r>
+        <w:rPr>
+          <w:b/>
+          <w:sz w:val="26"/>
+          <w:szCs w:val="26"/>
+          <w:u w:val="single"/>
+          <w:lang w:val="fr-FR"/>
+        </w:rPr>
+        <w:tab/>
+      </w:r>
+      <w:r>
+        <w:rPr>
+          <w:b/>
+          <w:sz w:val="26"/>
+          <w:szCs w:val="26"/>
+          <w:u w:val="single"/>
+          <w:lang w:val="fr-FR"/>
+        </w:rPr>
+        <w:tab/>
+      </w:r>
+      <w:r>
+        <w:rPr>
+          <w:b/>
+          <w:sz w:val="26"/>
+          <w:szCs w:val="26"/>
+          <w:u w:val="single"/>
+          <w:lang w:val="fr-FR"/>
+        </w:rPr>
+        <w:t xml:space="preserve">    </w:t>
+      </w:r>
+    </w:p>
+    <w:p>
+      <w:pPr>
+        <w:spacing w:before="120" w:after="120" w:line="360" w:lineRule="auto"/>
+        <w:rPr>
+          <w:b/>
+          <w:sz w:val="26"/>
+          <w:szCs w:val="26"/>
+          <w:lang w:val="fr-FR"/>
+        </w:rPr>
+      </w:pPr>
+      <w:r>
+        <w:rPr>
+          <w:b/>
+          <w:sz w:val="26"/>
+          <w:szCs w:val="26"/>
+          <w:lang w:val="fr-FR"/>
+        </w:rPr>
+        <w:t xml:space="preserve">   Ông : LÊ VĂN PHƯỚC</w:t>
+      </w:r>
+      <w:r>
+        <w:rPr>
+          <w:b/>
+          <w:sz w:val="26"/>
+          <w:szCs w:val="26"/>
+          <w:lang w:val="fr-FR"/>
+        </w:rPr>
+        <w:tab/>
+      </w:r>
+      <w:r>
+        <w:rPr>
+          <w:b/>
+          <w:sz w:val="26"/>
+          <w:szCs w:val="26"/>
+          <w:lang w:val="fr-FR"/>
+        </w:rPr>
+        <w:t xml:space="preserve">                                Ông : </w:t>
+      </w:r>
+      <w:r>
+        <w:rPr>
+          <w:b/>
+          <w:bCs/>
+          <w:sz w:val="26"/>
+          <w:szCs w:val="26"/>
+        </w:rPr>
+        <w:t xml:space="preserve"> </w:t>
+      </w:r>
+      <w:r>
+        <w:rPr>
+          <w:b/>
+          <w:bCs/>
+          <w:spacing w:val="3"/>
+          <w:sz w:val="26"/>
+          <w:szCs w:val="26"/>
+          <w:shd w:val="clear" w:color="auto" w:fill="FFFFFF"/>
+        </w:rPr>
+        <w:t>….</w:t>
+      </w:r>
+    </w:p>
+    <w:sectPr>
+      <w:headerReference r:id="rId3" w:type="default"/>
+      <w:footerReference r:id="rId4" w:type="default"/>
+      <w:pgSz w:w="12240" w:h="15840"/>
+      <w:pgMar w:top="750" w:right="960" w:bottom="1440" w:left="1440" w:header="720" w:footer="720" w:gutter="0"/>
+      <w:cols w:space="720" w:num="1"/>
+      <w:docGrid w:linePitch="360" w:charSpace="0"/>
+    </w:sectPr>
+  </w:body>
+</w:document>
 </file>
 
 <file path=word/footer1.xml><?xml version="1.0" encoding="utf-8"?>

</xml_diff>